<commit_message>
Before change to OptCommun
</commit_message>
<xml_diff>
--- a/paper/[OptMaterX] Design and Simulation of Sb2Se3-Based.docx
+++ b/paper/[OptMaterX] Design and Simulation of Sb2Se3-Based.docx
@@ -965,7 +965,19 @@
     </w:p>
     <w:p>
       <w:r>
-        <w:t xml:space="preserve">Phase change material (PCM) can have a different meaning depending on the topics. When discussing about energy storage, the term would refer to material that can store and release its thermal energy by changing its state of matter (latent heat). The phase transition occurs between solid and liquid state </w:t>
+        <w:t xml:space="preserve">Phase change material (PCM) can have different meaning depending on the topics. When discussing about energy storage, the term would </w:t>
+      </w:r>
+      <w:r>
+        <w:t>refer</w:t>
+      </w:r>
+      <w:r>
+        <w:t xml:space="preserve"> to material that can store and release its thermal energy </w:t>
+      </w:r>
+      <w:r>
+        <w:t>when</w:t>
+      </w:r>
+      <w:r>
+        <w:t xml:space="preserve"> changing its state of matter (latent heat). The phase transition occurs between solid and liquid state </w:t>
       </w:r>
       <w:r>
         <w:fldChar w:fldCharType="begin"/>
@@ -5217,9 +5229,9 @@
         </w:rPr>
         <w:lastRenderedPageBreak/>
         <w:drawing>
-          <wp:inline distT="0" distB="0" distL="0" distR="0" wp14:anchorId="1D10BE6A" wp14:editId="528B7708">
-            <wp:extent cx="4631090" cy="2605598"/>
-            <wp:effectExtent l="0" t="0" r="0" b="4445"/>
+          <wp:inline distT="0" distB="0" distL="0" distR="0" wp14:anchorId="1D10BE6A" wp14:editId="1E2FB1F1">
+            <wp:extent cx="4478951" cy="2520000"/>
+            <wp:effectExtent l="0" t="0" r="0" b="0"/>
             <wp:docPr id="424798423" name="Picture 1"/>
             <wp:cNvGraphicFramePr>
               <a:graphicFrameLocks xmlns:a="http://schemas.openxmlformats.org/drawingml/2006/main" noChangeAspect="1"/>
@@ -5240,7 +5252,7 @@
                   <pic:spPr>
                     <a:xfrm>
                       <a:off x="0" y="0"/>
-                      <a:ext cx="4634768" cy="2607667"/>
+                      <a:ext cx="4478951" cy="2520000"/>
                     </a:xfrm>
                     <a:prstGeom prst="rect">
                       <a:avLst/>
@@ -5899,8 +5911,8 @@
           <w:noProof/>
         </w:rPr>
         <w:drawing>
-          <wp:inline distT="0" distB="0" distL="0" distR="0" wp14:anchorId="609A4824" wp14:editId="275F48EC">
-            <wp:extent cx="2690037" cy="2488633"/>
+          <wp:inline distT="0" distB="0" distL="0" distR="0" wp14:anchorId="609A4824" wp14:editId="5F1047F3">
+            <wp:extent cx="1945673" cy="1800000"/>
             <wp:effectExtent l="0" t="0" r="0" b="0"/>
             <wp:docPr id="1484466258" name="Picture 2"/>
             <wp:cNvGraphicFramePr>
@@ -5931,7 +5943,7 @@
                   <pic:spPr bwMode="auto">
                     <a:xfrm>
                       <a:off x="0" y="0"/>
-                      <a:ext cx="2697627" cy="2495655"/>
+                      <a:ext cx="1945673" cy="1800000"/>
                     </a:xfrm>
                     <a:prstGeom prst="rect">
                       <a:avLst/>
@@ -5954,7 +5966,13 @@
         <w:t>Fig. 2.</w:t>
       </w:r>
       <w:r>
-        <w:t xml:space="preserve"> Light paths in a single-layer thin film device. R</w:t>
+        <w:t xml:space="preserve"> Light paths in a</w:t>
+      </w:r>
+      <w:r>
+        <w:t xml:space="preserve"> device made of</w:t>
+      </w:r>
+      <w:r>
+        <w:t xml:space="preserve"> single-layer film. R</w:t>
       </w:r>
       <w:r>
         <w:rPr>
@@ -5999,9 +6017,9 @@
         <w:t xml:space="preserve"> radian. Both incident and reflection angles is 0°, the angles in this figure are exaggerated.</w:t>
       </w:r>
     </w:p>
-    <w:p>
-      <w:r>
-        <w:lastRenderedPageBreak/>
+    <w:p/>
+    <w:p>
+      <w:r>
         <w:tab/>
       </w:r>
       <w:r>
@@ -6041,22 +6059,7 @@
         <w:t>Which mean the substrate refractive index and its optical thickness matter.</w:t>
       </w:r>
       <w:r>
-        <w:t xml:space="preserve"> </w:t>
-      </w:r>
-      <w:r>
-        <w:t xml:space="preserve">Another way to find a thickness required </w:t>
-      </w:r>
-      <w:r>
-        <w:t>in</w:t>
-      </w:r>
-      <w:r>
-        <w:t xml:space="preserve"> antireflection </w:t>
-      </w:r>
-      <w:r>
-        <w:t xml:space="preserve">condition </w:t>
-      </w:r>
-      <w:r>
-        <w:t xml:space="preserve">is to consider the reflectivity. At the first interface </w:t>
+        <w:t xml:space="preserve"> Another way to find a thickness required in antireflection condition is to consider the reflectivity. At the first interface </w:t>
       </w:r>
       <w:r>
         <w:rPr>
@@ -6087,6 +6090,7 @@
           <w:rPr>
             <w:rFonts w:ascii="Cambria Math" w:hAnsi="Cambria Math"/>
           </w:rPr>
+          <w:lastRenderedPageBreak/>
           <m:t>r=</m:t>
         </m:r>
         <m:f>
@@ -7381,10 +7385,7 @@
         <w:t>r</w:t>
       </w:r>
       <w:r>
-        <w:t xml:space="preserve"> = 0 </w:t>
-      </w:r>
-      <w:r>
-        <w:t xml:space="preserve">or </w:t>
+        <w:t xml:space="preserve"> = 0 or </w:t>
       </w:r>
       <w:r>
         <w:rPr>
@@ -7557,16 +7558,7 @@
         <w:t xml:space="preserve"> is even number, we can simplify Eq.4</w:t>
       </w:r>
       <w:r>
-        <w:t xml:space="preserve"> using</w:t>
-      </w:r>
-      <w:r>
-        <w:t xml:space="preserve"> Euler</w:t>
-      </w:r>
-      <w:r>
-        <w:t>’s</w:t>
-      </w:r>
-      <w:r>
-        <w:t xml:space="preserve"> identity</w:t>
+        <w:t xml:space="preserve"> using Euler’s identity</w:t>
       </w:r>
       <w:r>
         <w:t xml:space="preserve"> to:</w:t>
@@ -7576,6 +7568,7 @@
       <w:pPr>
         <w:jc w:val="right"/>
         <w:rPr>
+          <w:i/>
           <w:lang w:val="en-US"/>
         </w:rPr>
       </w:pPr>
@@ -7585,6 +7578,7 @@
             <m:ctrlPr>
               <w:rPr>
                 <w:rFonts w:ascii="Cambria Math" w:hAnsi="Cambria Math"/>
+                <w:i/>
                 <w:vertAlign w:val="subscript"/>
                 <w:lang w:val="en-US"/>
               </w:rPr>
@@ -7612,9 +7606,6 @@
           </m:sub>
         </m:sSub>
         <m:r>
-          <m:rPr>
-            <m:sty m:val="p"/>
-          </m:rPr>
           <w:rPr>
             <w:rFonts w:ascii="Cambria Math" w:hAnsi="Cambria Math"/>
             <w:vertAlign w:val="subscript"/>
@@ -7627,6 +7618,7 @@
             <m:ctrlPr>
               <w:rPr>
                 <w:rFonts w:ascii="Cambria Math" w:hAnsi="Cambria Math"/>
+                <w:i/>
                 <w:vertAlign w:val="subscript"/>
                 <w:lang w:val="en-US"/>
               </w:rPr>
@@ -7658,6 +7650,7 @@
             <m:ctrlPr>
               <w:rPr>
                 <w:rFonts w:ascii="Cambria Math" w:hAnsi="Cambria Math"/>
+                <w:i/>
                 <w:vertAlign w:val="subscript"/>
                 <w:lang w:val="en-US"/>
               </w:rPr>
@@ -7669,6 +7662,7 @@
                 <m:ctrlPr>
                   <w:rPr>
                     <w:rFonts w:ascii="Cambria Math" w:hAnsi="Cambria Math"/>
+                    <w:i/>
                     <w:vertAlign w:val="subscript"/>
                     <w:lang w:val="en-US"/>
                   </w:rPr>
@@ -7680,6 +7674,7 @@
                     <m:ctrlPr>
                       <w:rPr>
                         <w:rFonts w:ascii="Cambria Math" w:hAnsi="Cambria Math"/>
+                        <w:i/>
                         <w:vertAlign w:val="subscript"/>
                         <w:lang w:val="en-US"/>
                       </w:rPr>
@@ -7707,9 +7702,6 @@
                   </m:sub>
                 </m:sSub>
                 <m:r>
-                  <m:rPr>
-                    <m:sty m:val="p"/>
-                  </m:rPr>
                   <w:rPr>
                     <w:rFonts w:ascii="Cambria Math" w:hAnsi="Cambria Math"/>
                     <w:vertAlign w:val="subscript"/>
@@ -7722,6 +7714,7 @@
                     <m:ctrlPr>
                       <w:rPr>
                         <w:rFonts w:ascii="Cambria Math" w:hAnsi="Cambria Math"/>
+                        <w:i/>
                         <w:vertAlign w:val="subscript"/>
                         <w:lang w:val="en-US"/>
                       </w:rPr>
@@ -7751,9 +7744,6 @@
               </m:e>
             </m:d>
             <m:r>
-              <m:rPr>
-                <m:sty m:val="p"/>
-              </m:rPr>
               <w:rPr>
                 <w:rFonts w:ascii="Cambria Math" w:hAnsi="Cambria Math"/>
                 <w:vertAlign w:val="subscript"/>
@@ -7766,6 +7756,7 @@
                 <m:ctrlPr>
                   <w:rPr>
                     <w:rFonts w:ascii="Cambria Math" w:hAnsi="Cambria Math"/>
+                    <w:i/>
                     <w:vertAlign w:val="subscript"/>
                     <w:lang w:val="en-US"/>
                   </w:rPr>
@@ -7777,6 +7768,7 @@
                     <m:ctrlPr>
                       <w:rPr>
                         <w:rFonts w:ascii="Cambria Math" w:hAnsi="Cambria Math"/>
+                        <w:i/>
                         <w:vertAlign w:val="subscript"/>
                         <w:lang w:val="en-US"/>
                       </w:rPr>
@@ -7804,9 +7796,6 @@
                   </m:sub>
                 </m:sSub>
                 <m:r>
-                  <m:rPr>
-                    <m:sty m:val="p"/>
-                  </m:rPr>
                   <w:rPr>
                     <w:rFonts w:ascii="Cambria Math" w:hAnsi="Cambria Math"/>
                     <w:vertAlign w:val="subscript"/>
@@ -7819,6 +7808,7 @@
                     <m:ctrlPr>
                       <w:rPr>
                         <w:rFonts w:ascii="Cambria Math" w:hAnsi="Cambria Math"/>
+                        <w:i/>
                         <w:vertAlign w:val="subscript"/>
                         <w:lang w:val="en-US"/>
                       </w:rPr>
@@ -7854,6 +7844,7 @@
                 <m:ctrlPr>
                   <w:rPr>
                     <w:rFonts w:ascii="Cambria Math" w:hAnsi="Cambria Math"/>
+                    <w:i/>
                     <w:vertAlign w:val="subscript"/>
                     <w:lang w:val="en-US"/>
                   </w:rPr>
@@ -7865,6 +7856,7 @@
                     <m:ctrlPr>
                       <w:rPr>
                         <w:rFonts w:ascii="Cambria Math" w:hAnsi="Cambria Math"/>
+                        <w:i/>
                         <w:vertAlign w:val="subscript"/>
                         <w:lang w:val="en-US"/>
                       </w:rPr>
@@ -7892,9 +7884,6 @@
                   </m:sub>
                 </m:sSub>
                 <m:r>
-                  <m:rPr>
-                    <m:sty m:val="p"/>
-                  </m:rPr>
                   <w:rPr>
                     <w:rFonts w:ascii="Cambria Math" w:hAnsi="Cambria Math"/>
                     <w:vertAlign w:val="subscript"/>
@@ -7907,6 +7896,7 @@
                     <m:ctrlPr>
                       <w:rPr>
                         <w:rFonts w:ascii="Cambria Math" w:hAnsi="Cambria Math"/>
+                        <w:i/>
                         <w:vertAlign w:val="subscript"/>
                         <w:lang w:val="en-US"/>
                       </w:rPr>
@@ -7936,9 +7926,6 @@
               </m:e>
             </m:d>
             <m:r>
-              <m:rPr>
-                <m:sty m:val="p"/>
-              </m:rPr>
               <w:rPr>
                 <w:rFonts w:ascii="Cambria Math" w:hAnsi="Cambria Math"/>
                 <w:vertAlign w:val="subscript"/>
@@ -7951,6 +7938,7 @@
                 <m:ctrlPr>
                   <w:rPr>
                     <w:rFonts w:ascii="Cambria Math" w:hAnsi="Cambria Math"/>
+                    <w:i/>
                     <w:vertAlign w:val="subscript"/>
                     <w:lang w:val="en-US"/>
                   </w:rPr>
@@ -7962,6 +7950,7 @@
                     <m:ctrlPr>
                       <w:rPr>
                         <w:rFonts w:ascii="Cambria Math" w:hAnsi="Cambria Math"/>
+                        <w:i/>
                         <w:vertAlign w:val="subscript"/>
                         <w:lang w:val="en-US"/>
                       </w:rPr>
@@ -7989,9 +7978,6 @@
                   </m:sub>
                 </m:sSub>
                 <m:r>
-                  <m:rPr>
-                    <m:sty m:val="p"/>
-                  </m:rPr>
                   <w:rPr>
                     <w:rFonts w:ascii="Cambria Math" w:hAnsi="Cambria Math"/>
                     <w:vertAlign w:val="subscript"/>
@@ -8004,6 +7990,7 @@
                     <m:ctrlPr>
                       <w:rPr>
                         <w:rFonts w:ascii="Cambria Math" w:hAnsi="Cambria Math"/>
+                        <w:i/>
                         <w:vertAlign w:val="subscript"/>
                         <w:lang w:val="en-US"/>
                       </w:rPr>
@@ -8135,12 +8122,14 @@
       </m:oMath>
       <w:r>
         <w:rPr>
+          <w:i/>
           <w:lang w:val="en-US"/>
         </w:rPr>
         <w:t>.</w:t>
       </w:r>
       <w:r>
         <w:rPr>
+          <w:i/>
           <w:vertAlign w:val="subscript"/>
           <w:lang w:val="en-US"/>
         </w:rPr>
@@ -8148,6 +8137,7 @@
       </w:r>
       <w:r>
         <w:rPr>
+          <w:i/>
           <w:vertAlign w:val="subscript"/>
           <w:lang w:val="en-US"/>
         </w:rPr>
@@ -8155,6 +8145,7 @@
       </w:r>
       <w:r>
         <w:rPr>
+          <w:i/>
           <w:vertAlign w:val="subscript"/>
           <w:lang w:val="en-US"/>
         </w:rPr>
@@ -8162,6 +8153,7 @@
       </w:r>
       <w:r>
         <w:rPr>
+          <w:i/>
           <w:vertAlign w:val="subscript"/>
           <w:lang w:val="en-US"/>
         </w:rPr>
@@ -8169,6 +8161,7 @@
       </w:r>
       <w:r>
         <w:rPr>
+          <w:i/>
           <w:vertAlign w:val="subscript"/>
           <w:lang w:val="en-US"/>
         </w:rPr>
@@ -8176,21 +8169,10 @@
       </w:r>
       <w:r>
         <w:rPr>
+          <w:i/>
           <w:lang w:val="en-US"/>
         </w:rPr>
-        <w:t>(</w:t>
-      </w:r>
-      <w:r>
-        <w:rPr>
-          <w:lang w:val="en-US"/>
-        </w:rPr>
-        <w:t>8</w:t>
-      </w:r>
-      <w:r>
-        <w:rPr>
-          <w:lang w:val="en-US"/>
-        </w:rPr>
-        <w:t>)</w:t>
+        <w:t>(8)</w:t>
       </w:r>
     </w:p>
     <w:p>
@@ -8556,7 +8538,19 @@
         <w:rPr>
           <w:highlight w:val="cyan"/>
         </w:rPr>
-        <w:t xml:space="preserve">add more reason) </w:t>
+        <w:t>add more reason</w:t>
+      </w:r>
+      <w:r>
+        <w:rPr>
+          <w:highlight w:val="cyan"/>
+        </w:rPr>
+        <w:t>s</w:t>
+      </w:r>
+      <w:r>
+        <w:rPr>
+          <w:highlight w:val="cyan"/>
+        </w:rPr>
+        <w:t xml:space="preserve">) </w:t>
       </w:r>
       <w:r>
         <w:rPr>
@@ -10954,7 +10948,6 @@
         <w:pStyle w:val="Heading2"/>
       </w:pPr>
       <w:r>
-        <w:lastRenderedPageBreak/>
         <w:t>2.</w:t>
       </w:r>
       <w:r>
@@ -11052,6 +11045,20 @@
         <w:tab/>
       </w:r>
       <w:r>
+        <w:t>MgF2:</w:t>
+      </w:r>
+      <w:r>
+        <w:tab/>
+      </w:r>
+      <w:r>
+        <w:t>1.3777</w:t>
+      </w:r>
+    </w:p>
+    <w:p>
+      <w:r>
+        <w:tab/>
+      </w:r>
+      <w:r>
         <w:t>SiO</w:t>
       </w:r>
       <w:r>
@@ -11072,6 +11079,9 @@
       <w:r>
         <w:t>1.467</w:t>
       </w:r>
+      <w:r>
+        <w:t>1</w:t>
+      </w:r>
     </w:p>
     <w:p>
       <w:r>
@@ -11090,7 +11100,31 @@
         <w:tab/>
       </w:r>
       <w:r>
-        <w:t>1.666</w:t>
+        <w:t>1.6</w:t>
+      </w:r>
+      <w:r>
+        <w:t>165+0i</w:t>
+      </w:r>
+      <w:r>
+        <w:tab/>
+      </w:r>
+      <w:r>
+        <w:fldChar w:fldCharType="begin"/>
+      </w:r>
+      <w:r>
+        <w:instrText xml:space="preserve"> ADDIN EN.CITE &lt;EndNote&gt;&lt;Cite&gt;&lt;Author&gt;Zhukovsky&lt;/Author&gt;&lt;Year&gt;2015&lt;/Year&gt;&lt;RecNum&gt;90&lt;/RecNum&gt;&lt;DisplayText&gt;[37]&lt;/DisplayText&gt;&lt;record&gt;&lt;rec-number&gt;90&lt;/rec-number&gt;&lt;foreign-keys&gt;&lt;key app="EN" db-id="v920pft06rp9dbex2ap500x99x5rrtswxzss" timestamp="1775120793"&gt;90&lt;/key&gt;&lt;/foreign-keys&gt;&lt;ref-type name="Journal Article"&gt;17&lt;/ref-type&gt;&lt;contributors&gt;&lt;authors&gt;&lt;author&gt;Zhukovsky, Sergei V.&lt;/author&gt;&lt;author&gt;Andryieuski, Andrei&lt;/author&gt;&lt;author&gt;Takayama, Osamu&lt;/author&gt;&lt;author&gt;Shkondin, Evgeniy&lt;/author&gt;&lt;author&gt;Malureanu, Radu&lt;/author&gt;&lt;author&gt;Jensen, Flemming&lt;/author&gt;&lt;author&gt;Lavrinenko, Andrei V.&lt;/author&gt;&lt;/authors&gt;&lt;/contributors&gt;&lt;titles&gt;&lt;title&gt;Experimental Demonstration of Effective Medium Approximation Breakdown in Deeply Subwavelength All-Dielectric Multilayers&lt;/title&gt;&lt;secondary-title&gt;Physical Review Letters&lt;/secondary-title&gt;&lt;/titles&gt;&lt;periodical&gt;&lt;full-title&gt;Physical Review Letters&lt;/full-title&gt;&lt;/periodical&gt;&lt;pages&gt;177402&lt;/pages&gt;&lt;volume&gt;115&lt;/volume&gt;&lt;number&gt;17&lt;/number&gt;&lt;dates&gt;&lt;year&gt;2015&lt;/year&gt;&lt;pub-dates&gt;&lt;date&gt;10/23/&lt;/date&gt;&lt;/pub-dates&gt;&lt;/dates&gt;&lt;publisher&gt;American Physical Society&lt;/publisher&gt;&lt;urls&gt;&lt;related-urls&gt;&lt;url&gt;https://link.aps.org/doi/10.1103/PhysRevLett.115.177402&lt;/url&gt;&lt;/related-urls&gt;&lt;/urls&gt;&lt;electronic-resource-num&gt;10.1103/PhysRevLett.115.177402&lt;/electronic-resource-num&gt;&lt;/record&gt;&lt;/Cite&gt;&lt;/EndNote&gt;</w:instrText>
+      </w:r>
+      <w:r>
+        <w:fldChar w:fldCharType="separate"/>
+      </w:r>
+      <w:r>
+        <w:rPr>
+          <w:noProof/>
+        </w:rPr>
+        <w:t>[37]</w:t>
+      </w:r>
+      <w:r>
+        <w:fldChar w:fldCharType="end"/>
       </w:r>
     </w:p>
     <w:p>
@@ -11127,12 +11161,42 @@
         <w:tab/>
       </w:r>
       <w:r>
-        <w:t>2.3078</w:t>
-      </w:r>
-    </w:p>
-    <w:p>
-      <w:r>
-        <w:tab/>
+        <w:t>2.30</w:t>
+      </w:r>
+      <w:r>
+        <w:t>97</w:t>
+      </w:r>
+      <w:r>
+        <w:tab/>
+      </w:r>
+      <w:r>
+        <w:tab/>
+      </w:r>
+      <w:r>
+        <w:fldChar w:fldCharType="begin"/>
+      </w:r>
+      <w:r>
+        <w:instrText xml:space="preserve"> ADDIN EN.CITE &lt;EndNote&gt;&lt;Cite&gt;&lt;Author&gt;Zhukovsky&lt;/Author&gt;&lt;Year&gt;2015&lt;/Year&gt;&lt;RecNum&gt;90&lt;/RecNum&gt;&lt;DisplayText&gt;[37]&lt;/DisplayText&gt;&lt;record&gt;&lt;rec-number&gt;90&lt;/rec-number&gt;&lt;foreign-keys&gt;&lt;key app="EN" db-id="v920pft06rp9dbex2ap500x99x5rrtswxzss" timestamp="1775120793"&gt;90&lt;/key&gt;&lt;/foreign-keys&gt;&lt;ref-type name="Journal Article"&gt;17&lt;/ref-type&gt;&lt;contributors&gt;&lt;authors&gt;&lt;author&gt;Zhukovsky, Sergei V.&lt;/author&gt;&lt;author&gt;Andryieuski, Andrei&lt;/author&gt;&lt;author&gt;Takayama, Osamu&lt;/author&gt;&lt;author&gt;Shkondin, Evgeniy&lt;/author&gt;&lt;author&gt;Malureanu, Radu&lt;/author&gt;&lt;author&gt;Jensen, Flemming&lt;/author&gt;&lt;author&gt;Lavrinenko, Andrei V.&lt;/author&gt;&lt;/authors&gt;&lt;/contributors&gt;&lt;titles&gt;&lt;title&gt;Experimental Demonstration of Effective Medium Approximation Breakdown in Deeply Subwavelength All-Dielectric Multilayers&lt;/title&gt;&lt;secondary-title&gt;Physical Review Letters&lt;/secondary-title&gt;&lt;/titles&gt;&lt;periodical&gt;&lt;full-title&gt;Physical Review Letters&lt;/full-title&gt;&lt;/periodical&gt;&lt;pages&gt;177402&lt;/pages&gt;&lt;volume&gt;115&lt;/volume&gt;&lt;number&gt;17&lt;/number&gt;&lt;dates&gt;&lt;year&gt;2015&lt;/year&gt;&lt;pub-dates&gt;&lt;date&gt;10/23/&lt;/date&gt;&lt;/pub-dates&gt;&lt;/dates&gt;&lt;publisher&gt;American Physical Society&lt;/publisher&gt;&lt;urls&gt;&lt;related-urls&gt;&lt;url&gt;https://link.aps.org/doi/10.1103/PhysRevLett.115.177402&lt;/url&gt;&lt;/related-urls&gt;&lt;/urls&gt;&lt;electronic-resource-num&gt;10.1103/PhysRevLett.115.177402&lt;/electronic-resource-num&gt;&lt;/record&gt;&lt;/Cite&gt;&lt;/EndNote&gt;</w:instrText>
+      </w:r>
+      <w:r>
+        <w:fldChar w:fldCharType="separate"/>
+      </w:r>
+      <w:r>
+        <w:rPr>
+          <w:noProof/>
+        </w:rPr>
+        <w:t>[37]</w:t>
+      </w:r>
+      <w:r>
+        <w:fldChar w:fldCharType="end"/>
+      </w:r>
+    </w:p>
+    <w:p>
+      <w:r>
+        <w:tab/>
+      </w:r>
+      <w:r>
+        <w:t>*</w:t>
       </w:r>
       <w:r>
         <w:t>ZrO2</w:t>
@@ -11161,7 +11225,10 @@
         <w:tab/>
       </w:r>
       <w:r>
-        <w:t>3.370</w:t>
+        <w:t>3.3</w:t>
+      </w:r>
+      <w:r>
+        <w:t>697</w:t>
       </w:r>
       <w:r>
         <w:t>+0i</w:t>
@@ -11170,6 +11237,231 @@
         <w:t xml:space="preserve"> (4.3081+0.009744i)</w:t>
       </w:r>
     </w:p>
+    <w:p/>
+    <w:p>
+      <w:r>
+        <w:t>532:</w:t>
+      </w:r>
+    </w:p>
+    <w:p>
+      <w:r>
+        <w:tab/>
+      </w:r>
+      <w:r>
+        <w:t>MgF2:</w:t>
+      </w:r>
+      <w:r>
+        <w:tab/>
+      </w:r>
+      <w:r>
+        <w:t>1.3842</w:t>
+      </w:r>
+    </w:p>
+    <w:p>
+      <w:r>
+        <w:tab/>
+      </w:r>
+      <w:r>
+        <w:t>SiO</w:t>
+      </w:r>
+      <w:r>
+        <w:rPr>
+          <w:vertAlign w:val="subscript"/>
+        </w:rPr>
+        <w:t>2</w:t>
+      </w:r>
+      <w:r>
+        <w:t>:</w:t>
+      </w:r>
+      <w:r>
+        <w:t xml:space="preserve"> </w:t>
+      </w:r>
+      <w:r>
+        <w:tab/>
+      </w:r>
+      <w:r>
+        <w:t>1.4</w:t>
+      </w:r>
+      <w:r>
+        <w:t>754</w:t>
+      </w:r>
+    </w:p>
+    <w:p>
+      <w:r>
+        <w:tab/>
+      </w:r>
+      <w:r>
+        <w:t>Al2O3</w:t>
+      </w:r>
+      <w:r>
+        <w:t>:</w:t>
+      </w:r>
+      <w:r>
+        <w:t xml:space="preserve"> </w:t>
+      </w:r>
+      <w:r>
+        <w:tab/>
+      </w:r>
+      <w:r>
+        <w:t>1.6</w:t>
+      </w:r>
+      <w:r>
+        <w:t>311+0i</w:t>
+      </w:r>
+      <w:r>
+        <w:tab/>
+      </w:r>
+      <w:r>
+        <w:fldChar w:fldCharType="begin"/>
+      </w:r>
+      <w:r>
+        <w:instrText xml:space="preserve"> ADDIN EN.CITE &lt;EndNote&gt;&lt;Cite&gt;&lt;Author&gt;Zhukovsky&lt;/Author&gt;&lt;Year&gt;2015&lt;/Year&gt;&lt;RecNum&gt;90&lt;/RecNum&gt;&lt;DisplayText&gt;[37]&lt;/DisplayText&gt;&lt;record&gt;&lt;rec-number&gt;90&lt;/rec-number&gt;&lt;foreign-keys&gt;&lt;key app="EN" db-id="v920pft06rp9dbex2ap500x99x5rrtswxzss" timestamp="1775120793"&gt;90&lt;/key&gt;&lt;/foreign-keys&gt;&lt;ref-type name="Journal Article"&gt;17&lt;/ref-type&gt;&lt;contributors&gt;&lt;authors&gt;&lt;author&gt;Zhukovsky, Sergei V.&lt;/author&gt;&lt;author&gt;Andryieuski, Andrei&lt;/author&gt;&lt;author&gt;Takayama, Osamu&lt;/author&gt;&lt;author&gt;Shkondin, Evgeniy&lt;/author&gt;&lt;author&gt;Malureanu, Radu&lt;/author&gt;&lt;author&gt;Jensen, Flemming&lt;/author&gt;&lt;author&gt;Lavrinenko, Andrei V.&lt;/author&gt;&lt;/authors&gt;&lt;/contributors&gt;&lt;titles&gt;&lt;title&gt;Experimental Demonstration of Effective Medium Approximation Breakdown in Deeply Subwavelength All-Dielectric Multilayers&lt;/title&gt;&lt;secondary-title&gt;Physical Review Letters&lt;/secondary-title&gt;&lt;/titles&gt;&lt;periodical&gt;&lt;full-title&gt;Physical Review Letters&lt;/full-title&gt;&lt;/periodical&gt;&lt;pages&gt;177402&lt;/pages&gt;&lt;volume&gt;115&lt;/volume&gt;&lt;number&gt;17&lt;/number&gt;&lt;dates&gt;&lt;year&gt;2015&lt;/year&gt;&lt;pub-dates&gt;&lt;date&gt;10/23/&lt;/date&gt;&lt;/pub-dates&gt;&lt;/dates&gt;&lt;publisher&gt;American Physical Society&lt;/publisher&gt;&lt;urls&gt;&lt;related-urls&gt;&lt;url&gt;https://link.aps.org/doi/10.1103/PhysRevLett.115.177402&lt;/url&gt;&lt;/related-urls&gt;&lt;/urls&gt;&lt;electronic-resource-num&gt;10.1103/PhysRevLett.115.177402&lt;/electronic-resource-num&gt;&lt;/record&gt;&lt;/Cite&gt;&lt;/EndNote&gt;</w:instrText>
+      </w:r>
+      <w:r>
+        <w:fldChar w:fldCharType="separate"/>
+      </w:r>
+      <w:r>
+        <w:rPr>
+          <w:noProof/>
+        </w:rPr>
+        <w:t>[37]</w:t>
+      </w:r>
+      <w:r>
+        <w:fldChar w:fldCharType="end"/>
+      </w:r>
+    </w:p>
+    <w:p>
+      <w:r>
+        <w:tab/>
+      </w:r>
+      <w:r>
+        <w:t>Si3N4</w:t>
+      </w:r>
+      <w:r>
+        <w:t>:</w:t>
+      </w:r>
+      <w:r>
+        <w:t xml:space="preserve"> </w:t>
+      </w:r>
+      <w:r>
+        <w:tab/>
+      </w:r>
+      <w:r>
+        <w:t>2.0341</w:t>
+      </w:r>
+      <w:r>
+        <w:t>+0.00015088i</w:t>
+      </w:r>
+    </w:p>
+    <w:p>
+      <w:r>
+        <w:tab/>
+      </w:r>
+      <w:r>
+        <w:t>TiO2</w:t>
+      </w:r>
+      <w:r>
+        <w:t>:</w:t>
+      </w:r>
+      <w:r>
+        <w:tab/>
+      </w:r>
+      <w:r>
+        <w:t>2.</w:t>
+      </w:r>
+      <w:r>
+        <w:t>4503</w:t>
+      </w:r>
+      <w:r>
+        <w:tab/>
+      </w:r>
+      <w:r>
+        <w:tab/>
+      </w:r>
+      <w:r>
+        <w:fldChar w:fldCharType="begin"/>
+      </w:r>
+      <w:r>
+        <w:instrText xml:space="preserve"> ADDIN EN.CITE &lt;EndNote&gt;&lt;Cite&gt;&lt;Author&gt;Zhukovsky&lt;/Author&gt;&lt;Year&gt;2015&lt;/Year&gt;&lt;RecNum&gt;90&lt;/RecNum&gt;&lt;DisplayText&gt;[37]&lt;/DisplayText&gt;&lt;record&gt;&lt;rec-number&gt;90&lt;/rec-number&gt;&lt;foreign-keys&gt;&lt;key app="EN" db-id="v920pft06rp9dbex2ap500x99x5rrtswxzss" timestamp="1775120793"&gt;90&lt;/key&gt;&lt;/foreign-keys&gt;&lt;ref-type name="Journal Article"&gt;17&lt;/ref-type&gt;&lt;contributors&gt;&lt;authors&gt;&lt;author&gt;Zhukovsky, Sergei V.&lt;/author&gt;&lt;author&gt;Andryieuski, Andrei&lt;/author&gt;&lt;author&gt;Takayama, Osamu&lt;/author&gt;&lt;author&gt;Shkondin, Evgeniy&lt;/author&gt;&lt;author&gt;Malureanu, Radu&lt;/author&gt;&lt;author&gt;Jensen, Flemming&lt;/author&gt;&lt;author&gt;Lavrinenko, Andrei V.&lt;/author&gt;&lt;/authors&gt;&lt;/contributors&gt;&lt;titles&gt;&lt;title&gt;Experimental Demonstration of Effective Medium Approximation Breakdown in Deeply Subwavelength All-Dielectric Multilayers&lt;/title&gt;&lt;secondary-title&gt;Physical Review Letters&lt;/secondary-title&gt;&lt;/titles&gt;&lt;periodical&gt;&lt;full-title&gt;Physical Review Letters&lt;/full-title&gt;&lt;/periodical&gt;&lt;pages&gt;177402&lt;/pages&gt;&lt;volume&gt;115&lt;/volume&gt;&lt;number&gt;17&lt;/number&gt;&lt;dates&gt;&lt;year&gt;2015&lt;/year&gt;&lt;pub-dates&gt;&lt;date&gt;10/23/&lt;/date&gt;&lt;/pub-dates&gt;&lt;/dates&gt;&lt;publisher&gt;American Physical Society&lt;/publisher&gt;&lt;urls&gt;&lt;related-urls&gt;&lt;url&gt;https://link.aps.org/doi/10.1103/PhysRevLett.115.177402&lt;/url&gt;&lt;/related-urls&gt;&lt;/urls&gt;&lt;electronic-resource-num&gt;10.1103/PhysRevLett.115.177402&lt;/electronic-resource-num&gt;&lt;/record&gt;&lt;/Cite&gt;&lt;/EndNote&gt;</w:instrText>
+      </w:r>
+      <w:r>
+        <w:fldChar w:fldCharType="separate"/>
+      </w:r>
+      <w:r>
+        <w:rPr>
+          <w:noProof/>
+        </w:rPr>
+        <w:t>[37]</w:t>
+      </w:r>
+      <w:r>
+        <w:fldChar w:fldCharType="end"/>
+      </w:r>
+    </w:p>
+    <w:p>
+      <w:r>
+        <w:tab/>
+      </w:r>
+      <w:r>
+        <w:t>*</w:t>
+      </w:r>
+      <w:r>
+        <w:t>ZrO2</w:t>
+      </w:r>
+      <w:r>
+        <w:t>:</w:t>
+      </w:r>
+      <w:r>
+        <w:tab/>
+      </w:r>
+      <w:r>
+        <w:t>2.4680</w:t>
+      </w:r>
+    </w:p>
+    <w:p>
+      <w:r>
+        <w:tab/>
+      </w:r>
+      <w:r>
+        <w:t>Sb2Se3</w:t>
+      </w:r>
+      <w:r>
+        <w:t>:</w:t>
+      </w:r>
+      <w:r>
+        <w:tab/>
+      </w:r>
+      <w:r>
+        <w:t>3.</w:t>
+      </w:r>
+      <w:r>
+        <w:t>9615</w:t>
+      </w:r>
+      <w:r>
+        <w:t>+</w:t>
+      </w:r>
+      <w:r>
+        <w:t>1.093042</w:t>
+      </w:r>
+      <w:r>
+        <w:t>i</w:t>
+      </w:r>
+      <w:r>
+        <w:t xml:space="preserve"> (4.</w:t>
+      </w:r>
+      <w:r>
+        <w:t>7876</w:t>
+      </w:r>
+      <w:r>
+        <w:t>+</w:t>
+      </w:r>
+      <w:r>
+        <w:t>2.240748</w:t>
+      </w:r>
+      <w:r>
+        <w:t>i)</w:t>
+      </w:r>
+    </w:p>
+    <w:p/>
     <w:p>
       <w:pPr>
         <w:rPr>
@@ -11199,7 +11491,7 @@
         <w:rPr>
           <w:highlight w:val="cyan"/>
         </w:rPr>
-        <w:instrText xml:space="preserve"> ADDIN EN.CITE &lt;EndNote&gt;&lt;Cite&gt;&lt;Author&gt;Raut&lt;/Author&gt;&lt;Year&gt;2011&lt;/Year&gt;&lt;RecNum&gt;85&lt;/RecNum&gt;&lt;DisplayText&gt;[37]&lt;/DisplayText&gt;&lt;record&gt;&lt;rec-number&gt;85&lt;/rec-number&gt;&lt;foreign-keys&gt;&lt;key app="EN" db-id="v920pft06rp9dbex2ap500x99x5rrtswxzss" timestamp="1773917246"&gt;85&lt;/key&gt;&lt;/foreign-keys&gt;&lt;ref-type name="Journal Article"&gt;17&lt;/ref-type&gt;&lt;contributors&gt;&lt;authors&gt;&lt;author&gt;Raut, Hemant Kumar&lt;/author&gt;&lt;author&gt;Ganesh, V. Anand&lt;/author&gt;&lt;author&gt;Nair, A. Sreekumaran&lt;/author&gt;&lt;author&gt;Ramakrishna, Seeram&lt;/author&gt;&lt;/authors&gt;&lt;/contributors&gt;&lt;titles&gt;&lt;title&gt;Anti-reflective coatings: A critical, in-depth review&lt;/title&gt;&lt;secondary-title&gt;Energy &amp;amp; Environmental Science&lt;/secondary-title&gt;&lt;/titles&gt;&lt;periodical&gt;&lt;full-title&gt;Energy &amp;amp; Environmental Science&lt;/full-title&gt;&lt;/periodical&gt;&lt;pages&gt;3779-3804&lt;/pages&gt;&lt;volume&gt;4&lt;/volume&gt;&lt;number&gt;10&lt;/number&gt;&lt;dates&gt;&lt;year&gt;2011&lt;/year&gt;&lt;/dates&gt;&lt;publisher&gt;The Royal Society of Chemistry&lt;/publisher&gt;&lt;isbn&gt;1754-5692&lt;/isbn&gt;&lt;work-type&gt;10.1039/C1EE01297E&lt;/work-type&gt;&lt;urls&gt;&lt;related-urls&gt;&lt;url&gt;http://dx.doi.org/10.1039/C1EE01297E&lt;/url&gt;&lt;/related-urls&gt;&lt;/urls&gt;&lt;electronic-resource-num&gt;10.1039/C1EE01297E&lt;/electronic-resource-num&gt;&lt;/record&gt;&lt;/Cite&gt;&lt;/EndNote&gt;</w:instrText>
+        <w:instrText xml:space="preserve"> ADDIN EN.CITE &lt;EndNote&gt;&lt;Cite&gt;&lt;Author&gt;Raut&lt;/Author&gt;&lt;Year&gt;2011&lt;/Year&gt;&lt;RecNum&gt;85&lt;/RecNum&gt;&lt;DisplayText&gt;[38]&lt;/DisplayText&gt;&lt;record&gt;&lt;rec-number&gt;85&lt;/rec-number&gt;&lt;foreign-keys&gt;&lt;key app="EN" db-id="v920pft06rp9dbex2ap500x99x5rrtswxzss" timestamp="1773917246"&gt;85&lt;/key&gt;&lt;/foreign-keys&gt;&lt;ref-type name="Journal Article"&gt;17&lt;/ref-type&gt;&lt;contributors&gt;&lt;authors&gt;&lt;author&gt;Raut, Hemant Kumar&lt;/author&gt;&lt;author&gt;Ganesh, V. Anand&lt;/author&gt;&lt;author&gt;Nair, A. Sreekumaran&lt;/author&gt;&lt;author&gt;Ramakrishna, Seeram&lt;/author&gt;&lt;/authors&gt;&lt;/contributors&gt;&lt;titles&gt;&lt;title&gt;Anti-reflective coatings: A critical, in-depth review&lt;/title&gt;&lt;secondary-title&gt;Energy &amp;amp; Environmental Science&lt;/secondary-title&gt;&lt;/titles&gt;&lt;periodical&gt;&lt;full-title&gt;Energy &amp;amp; Environmental Science&lt;/full-title&gt;&lt;/periodical&gt;&lt;pages&gt;3779-3804&lt;/pages&gt;&lt;volume&gt;4&lt;/volume&gt;&lt;number&gt;10&lt;/number&gt;&lt;dates&gt;&lt;year&gt;2011&lt;/year&gt;&lt;/dates&gt;&lt;publisher&gt;The Royal Society of Chemistry&lt;/publisher&gt;&lt;isbn&gt;1754-5692&lt;/isbn&gt;&lt;work-type&gt;10.1039/C1EE01297E&lt;/work-type&gt;&lt;urls&gt;&lt;related-urls&gt;&lt;url&gt;http://dx.doi.org/10.1039/C1EE01297E&lt;/url&gt;&lt;/related-urls&gt;&lt;/urls&gt;&lt;electronic-resource-num&gt;10.1039/C1EE01297E&lt;/electronic-resource-num&gt;&lt;/record&gt;&lt;/Cite&gt;&lt;/EndNote&gt;</w:instrText>
       </w:r>
       <w:r>
         <w:rPr>
@@ -11212,7 +11504,7 @@
           <w:noProof/>
           <w:highlight w:val="cyan"/>
         </w:rPr>
-        <w:t>[37]</w:t>
+        <w:t>[38]</w:t>
       </w:r>
       <w:r>
         <w:rPr>
@@ -11335,7 +11627,7 @@
         <w:fldChar w:fldCharType="begin"/>
       </w:r>
       <w:r>
-        <w:instrText xml:space="preserve"> ADDIN EN.CITE &lt;EndNote&gt;&lt;Cite&gt;&lt;Author&gt;Beliaev&lt;/Author&gt;&lt;Year&gt;2022&lt;/Year&gt;&lt;RecNum&gt;70&lt;/RecNum&gt;&lt;DisplayText&gt;[38]&lt;/DisplayText&gt;&lt;record&gt;&lt;rec-number&gt;70&lt;/rec-number&gt;&lt;foreign-keys&gt;&lt;key app="EN" db-id="v920pft06rp9dbex2ap500x99x5rrtswxzss" timestamp="1768215795" guid="3f7419e0-798c-4593-84cf-4bf61aaacb06"&gt;70&lt;/key&gt;&lt;/foreign-keys&gt;&lt;ref-type name="Journal Article"&gt;17&lt;/ref-type&gt;&lt;contributors&gt;&lt;authors&gt;&lt;author&gt;Beliaev, Leonid Yu&lt;/author&gt;&lt;author&gt;Shkondin, Evgeniy&lt;/author&gt;&lt;author&gt;Lavrinenko, Andrei V.&lt;/author&gt;&lt;author&gt;Takayama, Osamu&lt;/author&gt;&lt;/authors&gt;&lt;/contributors&gt;&lt;titles&gt;&lt;title&gt;Optical, structural and composition properties of silicon nitride films deposited by reactive radio-frequency sputtering, low pressure and plasma-enhanced chemical vapor deposition&lt;/title&gt;&lt;secondary-title&gt;Thin Solid Films&lt;/secondary-title&gt;&lt;/titles&gt;&lt;periodical&gt;&lt;full-title&gt;Thin Solid Films&lt;/full-title&gt;&lt;/periodical&gt;&lt;pages&gt;139568&lt;/pages&gt;&lt;volume&gt;763&lt;/volume&gt;&lt;keywords&gt;&lt;keyword&gt;Silicon nitride&lt;/keyword&gt;&lt;keyword&gt;Ellipsometry&lt;/keyword&gt;&lt;keyword&gt;Chemical vapor deposition&lt;/keyword&gt;&lt;keyword&gt;Sputtering&lt;/keyword&gt;&lt;keyword&gt;Optical characterization&lt;/keyword&gt;&lt;keyword&gt;Thin film&lt;/keyword&gt;&lt;/keywords&gt;&lt;dates&gt;&lt;year&gt;2022&lt;/year&gt;&lt;pub-dates&gt;&lt;date&gt;2022/12/01/&lt;/date&gt;&lt;/pub-dates&gt;&lt;/dates&gt;&lt;isbn&gt;0040-6090&lt;/isbn&gt;&lt;urls&gt;&lt;related-urls&gt;&lt;url&gt;https://www.sciencedirect.com/science/article/pii/S0040609022004710&lt;/url&gt;&lt;/related-urls&gt;&lt;/urls&gt;&lt;electronic-resource-num&gt;https://doi.org/10.1016/j.tsf.2022.139568&lt;/electronic-resource-num&gt;&lt;/record&gt;&lt;/Cite&gt;&lt;/EndNote&gt;</w:instrText>
+        <w:instrText xml:space="preserve"> ADDIN EN.CITE &lt;EndNote&gt;&lt;Cite&gt;&lt;Author&gt;Beliaev&lt;/Author&gt;&lt;Year&gt;2022&lt;/Year&gt;&lt;RecNum&gt;70&lt;/RecNum&gt;&lt;DisplayText&gt;[39]&lt;/DisplayText&gt;&lt;record&gt;&lt;rec-number&gt;70&lt;/rec-number&gt;&lt;foreign-keys&gt;&lt;key app="EN" db-id="v920pft06rp9dbex2ap500x99x5rrtswxzss" timestamp="1768215795" guid="3f7419e0-798c-4593-84cf-4bf61aaacb06"&gt;70&lt;/key&gt;&lt;/foreign-keys&gt;&lt;ref-type name="Journal Article"&gt;17&lt;/ref-type&gt;&lt;contributors&gt;&lt;authors&gt;&lt;author&gt;Beliaev, Leonid Yu&lt;/author&gt;&lt;author&gt;Shkondin, Evgeniy&lt;/author&gt;&lt;author&gt;Lavrinenko, Andrei V.&lt;/author&gt;&lt;author&gt;Takayama, Osamu&lt;/author&gt;&lt;/authors&gt;&lt;/contributors&gt;&lt;titles&gt;&lt;title&gt;Optical, structural and composition properties of silicon nitride films deposited by reactive radio-frequency sputtering, low pressure and plasma-enhanced chemical vapor deposition&lt;/title&gt;&lt;secondary-title&gt;Thin Solid Films&lt;/secondary-title&gt;&lt;/titles&gt;&lt;periodical&gt;&lt;full-title&gt;Thin Solid Films&lt;/full-title&gt;&lt;/periodical&gt;&lt;pages&gt;139568&lt;/pages&gt;&lt;volume&gt;763&lt;/volume&gt;&lt;keywords&gt;&lt;keyword&gt;Silicon nitride&lt;/keyword&gt;&lt;keyword&gt;Ellipsometry&lt;/keyword&gt;&lt;keyword&gt;Chemical vapor deposition&lt;/keyword&gt;&lt;keyword&gt;Sputtering&lt;/keyword&gt;&lt;keyword&gt;Optical characterization&lt;/keyword&gt;&lt;keyword&gt;Thin film&lt;/keyword&gt;&lt;/keywords&gt;&lt;dates&gt;&lt;year&gt;2022&lt;/year&gt;&lt;pub-dates&gt;&lt;date&gt;2022/12/01/&lt;/date&gt;&lt;/pub-dates&gt;&lt;/dates&gt;&lt;isbn&gt;0040-6090&lt;/isbn&gt;&lt;urls&gt;&lt;related-urls&gt;&lt;url&gt;https://www.sciencedirect.com/science/article/pii/S0040609022004710&lt;/url&gt;&lt;/related-urls&gt;&lt;/urls&gt;&lt;electronic-resource-num&gt;https://doi.org/10.1016/j.tsf.2022.139568&lt;/electronic-resource-num&gt;&lt;/record&gt;&lt;/Cite&gt;&lt;/EndNote&gt;</w:instrText>
       </w:r>
       <w:r>
         <w:fldChar w:fldCharType="separate"/>
@@ -11344,7 +11636,7 @@
         <w:rPr>
           <w:noProof/>
         </w:rPr>
-        <w:t>[38]</w:t>
+        <w:t>[39]</w:t>
       </w:r>
       <w:r>
         <w:fldChar w:fldCharType="end"/>
@@ -11407,7 +11699,7 @@
         <w:fldChar w:fldCharType="begin"/>
       </w:r>
       <w:r>
-        <w:instrText xml:space="preserve"> ADDIN EN.CITE &lt;EndNote&gt;&lt;Cite&gt;&lt;Author&gt;Franta&lt;/Author&gt;&lt;Year&gt;2017&lt;/Year&gt;&lt;RecNum&gt;87&lt;/RecNum&gt;&lt;DisplayText&gt;[39]&lt;/DisplayText&gt;&lt;record&gt;&lt;rec-number&gt;87&lt;/rec-number&gt;&lt;foreign-keys&gt;&lt;key app="EN" db-id="v920pft06rp9dbex2ap500x99x5rrtswxzss" timestamp="1774444072"&gt;87&lt;/key&gt;&lt;/foreign-keys&gt;&lt;ref-type name="Journal Article"&gt;17&lt;/ref-type&gt;&lt;contributors&gt;&lt;authors&gt;&lt;author&gt;Franta, Daniel&lt;/author&gt;&lt;author&gt;Nečas, David&lt;/author&gt;&lt;author&gt;Giglia, Angelo&lt;/author&gt;&lt;author&gt;Franta, Pavel&lt;/author&gt;&lt;author&gt;Ohlídal, Ivan&lt;/author&gt;&lt;/authors&gt;&lt;/contributors&gt;&lt;titles&gt;&lt;title&gt;Universal dispersion model for characterization of optical thin films over wide spectral range: Application to magnesium fluoride&lt;/title&gt;&lt;secondary-title&gt;Applied Surface Science&lt;/secondary-title&gt;&lt;/titles&gt;&lt;periodical&gt;&lt;full-title&gt;Applied Surface Science&lt;/full-title&gt;&lt;/periodical&gt;&lt;pages&gt;424-429&lt;/pages&gt;&lt;volume&gt;421&lt;/volume&gt;&lt;keywords&gt;&lt;keyword&gt;Optical constants&lt;/keyword&gt;&lt;keyword&gt;Ellipsometry&lt;/keyword&gt;&lt;keyword&gt;Spectrophotometry&lt;/keyword&gt;&lt;keyword&gt;Sum rule&lt;/keyword&gt;&lt;/keywords&gt;&lt;dates&gt;&lt;year&gt;2017&lt;/year&gt;&lt;pub-dates&gt;&lt;date&gt;2017/11/01/&lt;/date&gt;&lt;/pub-dates&gt;&lt;/dates&gt;&lt;isbn&gt;0169-4332&lt;/isbn&gt;&lt;urls&gt;&lt;related-urls&gt;&lt;url&gt;https://www.sciencedirect.com/science/article/pii/S016943321632030X&lt;/url&gt;&lt;/related-urls&gt;&lt;/urls&gt;&lt;electronic-resource-num&gt;https://doi.org/10.1016/j.apsusc.2016.09.149&lt;/electronic-resource-num&gt;&lt;/record&gt;&lt;/Cite&gt;&lt;/EndNote&gt;</w:instrText>
+        <w:instrText xml:space="preserve"> ADDIN EN.CITE &lt;EndNote&gt;&lt;Cite&gt;&lt;Author&gt;Franta&lt;/Author&gt;&lt;Year&gt;2017&lt;/Year&gt;&lt;RecNum&gt;87&lt;/RecNum&gt;&lt;DisplayText&gt;[40]&lt;/DisplayText&gt;&lt;record&gt;&lt;rec-number&gt;87&lt;/rec-number&gt;&lt;foreign-keys&gt;&lt;key app="EN" db-id="v920pft06rp9dbex2ap500x99x5rrtswxzss" timestamp="1774444072"&gt;87&lt;/key&gt;&lt;/foreign-keys&gt;&lt;ref-type name="Journal Article"&gt;17&lt;/ref-type&gt;&lt;contributors&gt;&lt;authors&gt;&lt;author&gt;Franta, Daniel&lt;/author&gt;&lt;author&gt;Nečas, David&lt;/author&gt;&lt;author&gt;Giglia, Angelo&lt;/author&gt;&lt;author&gt;Franta, Pavel&lt;/author&gt;&lt;author&gt;Ohlídal, Ivan&lt;/author&gt;&lt;/authors&gt;&lt;/contributors&gt;&lt;titles&gt;&lt;title&gt;Universal dispersion model for characterization of optical thin films over wide spectral range: Application to magnesium fluoride&lt;/title&gt;&lt;secondary-title&gt;Applied Surface Science&lt;/secondary-title&gt;&lt;/titles&gt;&lt;periodical&gt;&lt;full-title&gt;Applied Surface Science&lt;/full-title&gt;&lt;/periodical&gt;&lt;pages&gt;424-429&lt;/pages&gt;&lt;volume&gt;421&lt;/volume&gt;&lt;keywords&gt;&lt;keyword&gt;Optical constants&lt;/keyword&gt;&lt;keyword&gt;Ellipsometry&lt;/keyword&gt;&lt;keyword&gt;Spectrophotometry&lt;/keyword&gt;&lt;keyword&gt;Sum rule&lt;/keyword&gt;&lt;/keywords&gt;&lt;dates&gt;&lt;year&gt;2017&lt;/year&gt;&lt;pub-dates&gt;&lt;date&gt;2017/11/01/&lt;/date&gt;&lt;/pub-dates&gt;&lt;/dates&gt;&lt;isbn&gt;0169-4332&lt;/isbn&gt;&lt;urls&gt;&lt;related-urls&gt;&lt;url&gt;https://www.sciencedirect.com/science/article/pii/S016943321632030X&lt;/url&gt;&lt;/related-urls&gt;&lt;/urls&gt;&lt;electronic-resource-num&gt;https://doi.org/10.1016/j.apsusc.2016.09.149&lt;/electronic-resource-num&gt;&lt;/record&gt;&lt;/Cite&gt;&lt;/EndNote&gt;</w:instrText>
       </w:r>
       <w:r>
         <w:fldChar w:fldCharType="separate"/>
@@ -11416,7 +11708,7 @@
         <w:rPr>
           <w:noProof/>
         </w:rPr>
-        <w:t>[39]</w:t>
+        <w:t>[40]</w:t>
       </w:r>
       <w:r>
         <w:fldChar w:fldCharType="end"/>
@@ -11434,10 +11726,13 @@
         <w:t xml:space="preserve">, </w:t>
       </w:r>
       <w:r>
-        <w:t>its absorptivity is negligible thought these wavelengths.</w:t>
-      </w:r>
-      <w:r>
-        <w:t xml:space="preserve"> </w:t>
+        <w:t xml:space="preserve">its absorptivity is negligible </w:t>
+      </w:r>
+      <w:r>
+        <w:t>through</w:t>
+      </w:r>
+      <w:r>
+        <w:t xml:space="preserve"> these wavelengths. </w:t>
       </w:r>
       <w:r>
         <w:t>In some simulation work</w:t>
@@ -11510,10 +11805,7 @@
         <w:t xml:space="preserve"> widely applicable</w:t>
       </w:r>
       <w:r>
-        <w:t xml:space="preserve"> </w:t>
-      </w:r>
-      <w:r>
-        <w:t>analysis method</w:t>
+        <w:t xml:space="preserve"> analysis method</w:t>
       </w:r>
       <w:r>
         <w:t xml:space="preserve">, </w:t>
@@ -11525,7 +11817,7 @@
         <w:fldChar w:fldCharType="begin"/>
       </w:r>
       <w:r>
-        <w:instrText xml:space="preserve"> ADDIN EN.CITE &lt;EndNote&gt;&lt;Cite&gt;&lt;Author&gt;Sarangan&lt;/Author&gt;&lt;Year&gt;2020&lt;/Year&gt;&lt;RecNum&gt;38&lt;/RecNum&gt;&lt;DisplayText&gt;[40]&lt;/DisplayText&gt;&lt;record&gt;&lt;rec-number&gt;38&lt;/rec-number&gt;&lt;foreign-keys&gt;&lt;key app="EN" db-id="v920pft06rp9dbex2ap500x99x5rrtswxzss" timestamp="1768049998" guid="dde7f428-59aa-475f-b9b0-297f1786a224"&gt;38&lt;/key&gt;&lt;/foreign-keys&gt;&lt;ref-type name="Journal Article"&gt;17&lt;/ref-type&gt;&lt;contributors&gt;&lt;authors&gt;&lt;author&gt;Sarangan, Andrew&lt;/author&gt;&lt;/authors&gt;&lt;/contributors&gt;&lt;titles&gt;&lt;title&gt;Design of resonant cavity thin film structures with complex active layers&lt;/title&gt;&lt;secondary-title&gt;Journal of the Optical Society of America B&lt;/secondary-title&gt;&lt;alt-title&gt;J. Opt. Soc. Am. B&lt;/alt-title&gt;&lt;/titles&gt;&lt;periodical&gt;&lt;full-title&gt;Journal of the Optical Society of America B&lt;/full-title&gt;&lt;abbr-1&gt;J. Opt. Soc. Am. B&lt;/abbr-1&gt;&lt;/periodical&gt;&lt;alt-periodical&gt;&lt;full-title&gt;Journal of the Optical Society of America B&lt;/full-title&gt;&lt;abbr-1&gt;J. Opt. Soc. Am. B&lt;/abbr-1&gt;&lt;/alt-periodical&gt;&lt;pages&gt;3461-3468&lt;/pages&gt;&lt;volume&gt;37&lt;/volume&gt;&lt;number&gt;11&lt;/number&gt;&lt;keywords&gt;&lt;keyword&gt;Bragg reflectors&lt;/keyword&gt;&lt;keyword&gt;Field enhancement&lt;/keyword&gt;&lt;keyword&gt;Optical absorption&lt;/keyword&gt;&lt;keyword&gt;Phase shift&lt;/keyword&gt;&lt;keyword&gt;Refractive index&lt;/keyword&gt;&lt;keyword&gt;Thin films&lt;/keyword&gt;&lt;/keywords&gt;&lt;dates&gt;&lt;year&gt;2020&lt;/year&gt;&lt;pub-dates&gt;&lt;date&gt;2020/11/01&lt;/date&gt;&lt;/pub-dates&gt;&lt;/dates&gt;&lt;publisher&gt;Optica Publishing Group&lt;/publisher&gt;&lt;urls&gt;&lt;related-urls&gt;&lt;url&gt;https://opg.optica.org/josab/abstract.cfm?URI=josab-37-11-3461&lt;/url&gt;&lt;/related-urls&gt;&lt;/urls&gt;&lt;electronic-resource-num&gt;10.1364/JOSAB.404894&lt;/electronic-resource-num&gt;&lt;/record&gt;&lt;/Cite&gt;&lt;/EndNote&gt;</w:instrText>
+        <w:instrText xml:space="preserve"> ADDIN EN.CITE &lt;EndNote&gt;&lt;Cite&gt;&lt;Author&gt;Sarangan&lt;/Author&gt;&lt;Year&gt;2020&lt;/Year&gt;&lt;RecNum&gt;38&lt;/RecNum&gt;&lt;DisplayText&gt;[41]&lt;/DisplayText&gt;&lt;record&gt;&lt;rec-number&gt;38&lt;/rec-number&gt;&lt;foreign-keys&gt;&lt;key app="EN" db-id="v920pft06rp9dbex2ap500x99x5rrtswxzss" timestamp="1768049998" guid="dde7f428-59aa-475f-b9b0-297f1786a224"&gt;38&lt;/key&gt;&lt;/foreign-keys&gt;&lt;ref-type name="Journal Article"&gt;17&lt;/ref-type&gt;&lt;contributors&gt;&lt;authors&gt;&lt;author&gt;Sarangan, Andrew&lt;/author&gt;&lt;/authors&gt;&lt;/contributors&gt;&lt;titles&gt;&lt;title&gt;Design of resonant cavity thin film structures with complex active layers&lt;/title&gt;&lt;secondary-title&gt;Journal of the Optical Society of America B&lt;/secondary-title&gt;&lt;alt-title&gt;J. Opt. Soc. Am. B&lt;/alt-title&gt;&lt;/titles&gt;&lt;periodical&gt;&lt;full-title&gt;Journal of the Optical Society of America B&lt;/full-title&gt;&lt;abbr-1&gt;J. Opt. Soc. Am. B&lt;/abbr-1&gt;&lt;/periodical&gt;&lt;alt-periodical&gt;&lt;full-title&gt;Journal of the Optical Society of America B&lt;/full-title&gt;&lt;abbr-1&gt;J. Opt. Soc. Am. B&lt;/abbr-1&gt;&lt;/alt-periodical&gt;&lt;pages&gt;3461-3468&lt;/pages&gt;&lt;volume&gt;37&lt;/volume&gt;&lt;number&gt;11&lt;/number&gt;&lt;keywords&gt;&lt;keyword&gt;Bragg reflectors&lt;/keyword&gt;&lt;keyword&gt;Field enhancement&lt;/keyword&gt;&lt;keyword&gt;Optical absorption&lt;/keyword&gt;&lt;keyword&gt;Phase shift&lt;/keyword&gt;&lt;keyword&gt;Refractive index&lt;/keyword&gt;&lt;keyword&gt;Thin films&lt;/keyword&gt;&lt;/keywords&gt;&lt;dates&gt;&lt;year&gt;2020&lt;/year&gt;&lt;pub-dates&gt;&lt;date&gt;2020/11/01&lt;/date&gt;&lt;/pub-dates&gt;&lt;/dates&gt;&lt;publisher&gt;Optica Publishing Group&lt;/publisher&gt;&lt;urls&gt;&lt;related-urls&gt;&lt;url&gt;https://opg.optica.org/josab/abstract.cfm?URI=josab-37-11-3461&lt;/url&gt;&lt;/related-urls&gt;&lt;/urls&gt;&lt;electronic-resource-num&gt;10.1364/JOSAB.404894&lt;/electronic-resource-num&gt;&lt;/record&gt;&lt;/Cite&gt;&lt;/EndNote&gt;</w:instrText>
       </w:r>
       <w:r>
         <w:fldChar w:fldCharType="separate"/>
@@ -11534,7 +11826,7 @@
         <w:rPr>
           <w:noProof/>
         </w:rPr>
-        <w:t>[40]</w:t>
+        <w:t>[41]</w:t>
       </w:r>
       <w:r>
         <w:fldChar w:fldCharType="end"/>
@@ -11543,13 +11835,7 @@
         <w:t xml:space="preserve">. But in this work, we </w:t>
       </w:r>
       <w:r>
-        <w:t xml:space="preserve">utilize </w:t>
-      </w:r>
-      <w:r>
-        <w:t>s</w:t>
-      </w:r>
-      <w:r>
-        <w:t>ilica (SiO</w:t>
+        <w:t>utilize silica (SiO</w:t>
       </w:r>
       <w:r>
         <w:rPr>
@@ -11585,22 +11871,7 @@
         <w:t>ex</w:t>
       </w:r>
       <w:r>
-        <w:t xml:space="preserve"> of ~1.47 at both </w:t>
-      </w:r>
-      <w:r>
-        <w:t>1064</w:t>
-      </w:r>
-      <w:r>
-        <w:t xml:space="preserve"> and </w:t>
-      </w:r>
-      <w:r>
-        <w:t>532</w:t>
-      </w:r>
-      <w:r>
-        <w:t xml:space="preserve"> nm.</w:t>
-      </w:r>
-      <w:r>
-        <w:t xml:space="preserve"> </w:t>
+        <w:t xml:space="preserve"> of ~1.47 at both 1064 and 532 nm. </w:t>
       </w:r>
       <w:r>
         <w:t xml:space="preserve">All the above mentioned </w:t>
@@ -11612,7 +11883,7 @@
         <w:fldChar w:fldCharType="begin"/>
       </w:r>
       <w:r>
-        <w:instrText xml:space="preserve"> ADDIN EN.CITE &lt;EndNote&gt;&lt;Cite&gt;&lt;Author&gt;Polyanskiy&lt;/Author&gt;&lt;Year&gt;2024&lt;/Year&gt;&lt;RecNum&gt;69&lt;/RecNum&gt;&lt;DisplayText&gt;[41]&lt;/DisplayText&gt;&lt;record&gt;&lt;rec-number&gt;69&lt;/rec-number&gt;&lt;foreign-keys&gt;&lt;key app="EN" db-id="v920pft06rp9dbex2ap500x99x5rrtswxzss" timestamp="1768215530" guid="51ad5c1f-6b8e-4d49-9eac-5ca2d206a442"&gt;69&lt;/key&gt;&lt;/foreign-keys&gt;&lt;ref-type name="Journal Article"&gt;17&lt;/ref-type&gt;&lt;contributors&gt;&lt;authors&gt;&lt;author&gt;Polyanskiy, Mikhail N.&lt;/author&gt;&lt;/authors&gt;&lt;/contributors&gt;&lt;titles&gt;&lt;title&gt;Refractiveindex.info database of optical constants&lt;/title&gt;&lt;secondary-title&gt;Scientific Data&lt;/secondary-title&gt;&lt;/titles&gt;&lt;periodical&gt;&lt;full-title&gt;Scientific Data&lt;/full-title&gt;&lt;/periodical&gt;&lt;pages&gt;94&lt;/pages&gt;&lt;volume&gt;11&lt;/volume&gt;&lt;number&gt;1&lt;/number&gt;&lt;dates&gt;&lt;year&gt;2024&lt;/year&gt;&lt;pub-dates&gt;&lt;date&gt;2024/01/18&lt;/date&gt;&lt;/pub-dates&gt;&lt;/dates&gt;&lt;isbn&gt;2052-4463&lt;/isbn&gt;&lt;urls&gt;&lt;related-urls&gt;&lt;url&gt;https://doi.org/10.1038/s41597-023-02898-2&lt;/url&gt;&lt;/related-urls&gt;&lt;/urls&gt;&lt;electronic-resource-num&gt;10.1038/s41597-023-02898-2&lt;/electronic-resource-num&gt;&lt;/record&gt;&lt;/Cite&gt;&lt;/EndNote&gt;</w:instrText>
+        <w:instrText xml:space="preserve"> ADDIN EN.CITE &lt;EndNote&gt;&lt;Cite&gt;&lt;Author&gt;Polyanskiy&lt;/Author&gt;&lt;Year&gt;2024&lt;/Year&gt;&lt;RecNum&gt;69&lt;/RecNum&gt;&lt;DisplayText&gt;[42]&lt;/DisplayText&gt;&lt;record&gt;&lt;rec-number&gt;69&lt;/rec-number&gt;&lt;foreign-keys&gt;&lt;key app="EN" db-id="v920pft06rp9dbex2ap500x99x5rrtswxzss" timestamp="1768215530" guid="51ad5c1f-6b8e-4d49-9eac-5ca2d206a442"&gt;69&lt;/key&gt;&lt;/foreign-keys&gt;&lt;ref-type name="Journal Article"&gt;17&lt;/ref-type&gt;&lt;contributors&gt;&lt;authors&gt;&lt;author&gt;Polyanskiy, Mikhail N.&lt;/author&gt;&lt;/authors&gt;&lt;/contributors&gt;&lt;titles&gt;&lt;title&gt;Refractiveindex.info database of optical constants&lt;/title&gt;&lt;secondary-title&gt;Scientific Data&lt;/secondary-title&gt;&lt;/titles&gt;&lt;periodical&gt;&lt;full-title&gt;Scientific Data&lt;/full-title&gt;&lt;/periodical&gt;&lt;pages&gt;94&lt;/pages&gt;&lt;volume&gt;11&lt;/volume&gt;&lt;number&gt;1&lt;/number&gt;&lt;dates&gt;&lt;year&gt;2024&lt;/year&gt;&lt;pub-dates&gt;&lt;date&gt;2024/01/18&lt;/date&gt;&lt;/pub-dates&gt;&lt;/dates&gt;&lt;isbn&gt;2052-4463&lt;/isbn&gt;&lt;urls&gt;&lt;related-urls&gt;&lt;url&gt;https://doi.org/10.1038/s41597-023-02898-2&lt;/url&gt;&lt;/related-urls&gt;&lt;/urls&gt;&lt;electronic-resource-num&gt;10.1038/s41597-023-02898-2&lt;/electronic-resource-num&gt;&lt;/record&gt;&lt;/Cite&gt;&lt;/EndNote&gt;</w:instrText>
       </w:r>
       <w:r>
         <w:fldChar w:fldCharType="separate"/>
@@ -11621,7 +11892,7 @@
         <w:rPr>
           <w:noProof/>
         </w:rPr>
-        <w:t>[41]</w:t>
+        <w:t>[42]</w:t>
       </w:r>
       <w:r>
         <w:fldChar w:fldCharType="end"/>
@@ -11630,43 +11901,57 @@
         <w:t xml:space="preserve">. </w:t>
       </w:r>
       <w:r>
+        <w:rPr>
+          <w:highlight w:val="yellow"/>
+        </w:rPr>
         <w:t>Since</w:t>
       </w:r>
       <w:r>
+        <w:rPr>
+          <w:highlight w:val="yellow"/>
+        </w:rPr>
         <w:t xml:space="preserve"> antimony triselenide (Sb</w:t>
       </w:r>
       <w:r>
         <w:rPr>
+          <w:highlight w:val="yellow"/>
           <w:vertAlign w:val="subscript"/>
         </w:rPr>
         <w:t>2</w:t>
       </w:r>
       <w:r>
+        <w:rPr>
+          <w:highlight w:val="yellow"/>
+        </w:rPr>
         <w:t>Se</w:t>
       </w:r>
       <w:r>
         <w:rPr>
+          <w:highlight w:val="yellow"/>
           <w:vertAlign w:val="subscript"/>
         </w:rPr>
         <w:t>3</w:t>
       </w:r>
       <w:r>
+        <w:rPr>
+          <w:highlight w:val="yellow"/>
+        </w:rPr>
         <w:t xml:space="preserve">) </w:t>
       </w:r>
       <w:r>
+        <w:rPr>
+          <w:highlight w:val="yellow"/>
+        </w:rPr>
         <w:t>is</w:t>
       </w:r>
       <w:r>
-        <w:t xml:space="preserve"> a new material in optics, </w:t>
-      </w:r>
-      <w:r>
         <w:rPr>
           <w:highlight w:val="yellow"/>
         </w:rPr>
-        <w:t>there exist no dataset there</w:t>
-      </w:r>
-      <w:r>
-        <w:t xml:space="preserve">. We use dataset from </w:t>
+        <w:t xml:space="preserve"> a new material in optics, there exist no dataset there.</w:t>
+      </w:r>
+      <w:r>
+        <w:t xml:space="preserve"> We use dataset from </w:t>
       </w:r>
       <w:r>
         <w:fldChar w:fldCharType="begin"/>
@@ -11939,7 +12224,7 @@
       <w:r>
         <w:fldChar w:fldCharType="begin">
           <w:fldData xml:space="preserve">PEVuZE5vdGU+PENpdGU+PEF1dGhvcj5MYXdzb248L0F1dGhvcj48WWVhcj4yMDIzPC9ZZWFyPjxS
-ZWNOdW0+NjA8L1JlY051bT48RGlzcGxheVRleHQ+WzE3LCA0Ml08L0Rpc3BsYXlUZXh0PjxyZWNv
+ZWNOdW0+NjA8L1JlY051bT48RGlzcGxheVRleHQ+WzE3LCA0M108L0Rpc3BsYXlUZXh0PjxyZWNv
 cmQ+PHJlYy1udW1iZXI+NjA8L3JlYy1udW1iZXI+PGZvcmVpZ24ta2V5cz48a2V5IGFwcD0iRU4i
 IGRiLWlkPSJ2OTIwcGZ0MDZycDlkYmV4MmFwNTAweDk5eDVycnRzd3h6c3MiIHRpbWVzdGFtcD0i
 MTc2ODA1MjkxMSIgZ3VpZD0iYzg5NTA2MDYtNGZkZC00MTFjLTk4ODItNDkyMzQxYWEwNWYzIj42
@@ -11988,7 +12273,7 @@
       <w:r>
         <w:fldChar w:fldCharType="begin">
           <w:fldData xml:space="preserve">PEVuZE5vdGU+PENpdGU+PEF1dGhvcj5MYXdzb248L0F1dGhvcj48WWVhcj4yMDIzPC9ZZWFyPjxS
-ZWNOdW0+NjA8L1JlY051bT48RGlzcGxheVRleHQ+WzE3LCA0Ml08L0Rpc3BsYXlUZXh0PjxyZWNv
+ZWNOdW0+NjA8L1JlY051bT48RGlzcGxheVRleHQ+WzE3LCA0M108L0Rpc3BsYXlUZXh0PjxyZWNv
 cmQ+PHJlYy1udW1iZXI+NjA8L3JlYy1udW1iZXI+PGZvcmVpZ24ta2V5cz48a2V5IGFwcD0iRU4i
 IGRiLWlkPSJ2OTIwcGZ0MDZycDlkYmV4MmFwNTAweDk5eDVycnRzd3h6c3MiIHRpbWVzdGFtcD0i
 MTc2ODA1MjkxMSIgZ3VpZD0iYzg5NTA2MDYtNGZkZC00MTFjLTk4ODItNDkyMzQxYWEwNWYzIj42
@@ -12044,7 +12329,7 @@
         <w:rPr>
           <w:noProof/>
         </w:rPr>
-        <w:t>[17, 42]</w:t>
+        <w:t>[17, 43]</w:t>
       </w:r>
       <w:r>
         <w:fldChar w:fldCharType="end"/>
@@ -12282,6 +12567,7 @@
         <w:jc w:val="left"/>
       </w:pPr>
       <w:r>
+        <w:lastRenderedPageBreak/>
         <w:tab/>
       </w:r>
       <w:r>
@@ -12706,7 +12992,7 @@
         </w:rPr>
         <w:fldChar w:fldCharType="begin">
           <w:fldData xml:space="preserve">PEVuZE5vdGU+PENpdGU+PEF1dGhvcj5EZWxhbmV5PC9BdXRob3I+PFllYXI+MjAyMDwvWWVhcj48
-UmVjTnVtPjY0PC9SZWNOdW0+PERpc3BsYXlUZXh0PlsxOCwgNDNdPC9EaXNwbGF5VGV4dD48cmVj
+UmVjTnVtPjY0PC9SZWNOdW0+PERpc3BsYXlUZXh0PlsxOCwgNDRdPC9EaXNwbGF5VGV4dD48cmVj
 b3JkPjxyZWMtbnVtYmVyPjY0PC9yZWMtbnVtYmVyPjxmb3JlaWduLWtleXM+PGtleSBhcHA9IkVO
 IiBkYi1pZD0idjkyMHBmdDA2cnA5ZGJleDJhcDUwMHg5OXg1cnJ0c3d4enNzIiB0aW1lc3RhbXA9
 IjE3NjgwNTQwOTAiIGd1aWQ9ImIxNWI1NTUwLTQwZDctNGFkMi04MTgyLWNmNmY0ODZhNGY1MCI+
@@ -12768,7 +13054,7 @@
         </w:rPr>
         <w:fldChar w:fldCharType="begin">
           <w:fldData xml:space="preserve">PEVuZE5vdGU+PENpdGU+PEF1dGhvcj5EZWxhbmV5PC9BdXRob3I+PFllYXI+MjAyMDwvWWVhcj48
-UmVjTnVtPjY0PC9SZWNOdW0+PERpc3BsYXlUZXh0PlsxOCwgNDNdPC9EaXNwbGF5VGV4dD48cmVj
+UmVjTnVtPjY0PC9SZWNOdW0+PERpc3BsYXlUZXh0PlsxOCwgNDRdPC9EaXNwbGF5VGV4dD48cmVj
 b3JkPjxyZWMtbnVtYmVyPjY0PC9yZWMtbnVtYmVyPjxmb3JlaWduLWtleXM+PGtleSBhcHA9IkVO
 IiBkYi1pZD0idjkyMHBmdDA2cnA5ZGJleDJhcDUwMHg5OXg1cnJ0c3d4enNzIiB0aW1lc3RhbXA9
 IjE3NjgwNTQwOTAiIGd1aWQ9ImIxNWI1NTUwLTQwZDctNGFkMi04MTgyLWNmNmY0ODZhNGY1MCI+
@@ -12839,6 +13125,11 @@
         <w:rPr>
           <w:lang w:val="en-US"/>
         </w:rPr>
+      </w:r>
+      <w:r>
+        <w:rPr>
+          <w:lang w:val="en-US"/>
+        </w:rPr>
         <w:fldChar w:fldCharType="separate"/>
       </w:r>
       <w:r>
@@ -12846,7 +13137,7 @@
           <w:noProof/>
           <w:lang w:val="en-US"/>
         </w:rPr>
-        <w:t>[18, 43]</w:t>
+        <w:t>[18, 44]</w:t>
       </w:r>
       <w:r>
         <w:rPr>
@@ -13057,7 +13348,6 @@
     </w:p>
     <w:p>
       <w:r>
-        <w:lastRenderedPageBreak/>
         <w:t>or</w:t>
       </w:r>
     </w:p>
@@ -13354,7 +13644,7 @@
       <w:r>
         <w:fldChar w:fldCharType="begin">
           <w:fldData xml:space="preserve">PEVuZE5vdGU+PENpdGU+PEF1dGhvcj5MYXdzb248L0F1dGhvcj48WWVhcj4yMDIzPC9ZZWFyPjxS
-ZWNOdW0+NjA8L1JlY051bT48RGlzcGxheVRleHQ+WzE3LCA0NF08L0Rpc3BsYXlUZXh0PjxyZWNv
+ZWNOdW0+NjA8L1JlY051bT48RGlzcGxheVRleHQ+WzE3LCA0NV08L0Rpc3BsYXlUZXh0PjxyZWNv
 cmQ+PHJlYy1udW1iZXI+NjA8L3JlYy1udW1iZXI+PGZvcmVpZ24ta2V5cz48a2V5IGFwcD0iRU4i
 IGRiLWlkPSJ2OTIwcGZ0MDZycDlkYmV4MmFwNTAweDk5eDVycnRzd3h6c3MiIHRpbWVzdGFtcD0i
 MTc2ODA1MjkxMSIgZ3VpZD0iYzg5NTA2MDYtNGZkZC00MTFjLTk4ODItNDkyMzQxYWEwNWYzIj42
@@ -13400,7 +13690,7 @@
       <w:r>
         <w:fldChar w:fldCharType="begin">
           <w:fldData xml:space="preserve">PEVuZE5vdGU+PENpdGU+PEF1dGhvcj5MYXdzb248L0F1dGhvcj48WWVhcj4yMDIzPC9ZZWFyPjxS
-ZWNOdW0+NjA8L1JlY051bT48RGlzcGxheVRleHQ+WzE3LCA0NF08L0Rpc3BsYXlUZXh0PjxyZWNv
+ZWNOdW0+NjA8L1JlY051bT48RGlzcGxheVRleHQ+WzE3LCA0NV08L0Rpc3BsYXlUZXh0PjxyZWNv
 cmQ+PHJlYy1udW1iZXI+NjA8L3JlYy1udW1iZXI+PGZvcmVpZ24ta2V5cz48a2V5IGFwcD0iRU4i
 IGRiLWlkPSJ2OTIwcGZ0MDZycDlkYmV4MmFwNTAweDk5eDVycnRzd3h6c3MiIHRpbWVzdGFtcD0i
 MTc2ODA1MjkxMSIgZ3VpZD0iYzg5NTA2MDYtNGZkZC00MTFjLTk4ODItNDkyMzQxYWEwNWYzIj42
@@ -13453,7 +13743,7 @@
         <w:rPr>
           <w:noProof/>
         </w:rPr>
-        <w:t>[17, 44]</w:t>
+        <w:t>[17, 45]</w:t>
       </w:r>
       <w:r>
         <w:fldChar w:fldCharType="end"/>
@@ -13476,7 +13766,7 @@
       <w:r>
         <w:fldChar w:fldCharType="begin">
           <w:fldData xml:space="preserve">PEVuZE5vdGU+PENpdGU+PEF1dGhvcj5MYXdzb248L0F1dGhvcj48WWVhcj4yMDIzPC9ZZWFyPjxS
-ZWNOdW0+NjA8L1JlY051bT48RGlzcGxheVRleHQ+WzE3LCAxOCwgNDMtNDVdPC9EaXNwbGF5VGV4
+ZWNOdW0+NjA8L1JlY051bT48RGlzcGxheVRleHQ+WzE3LCAxOCwgNDQtNDZdPC9EaXNwbGF5VGV4
 dD48cmVjb3JkPjxyZWMtbnVtYmVyPjYwPC9yZWMtbnVtYmVyPjxmb3JlaWduLWtleXM+PGtleSBh
 cHA9IkVOIiBkYi1pZD0idjkyMHBmdDA2cnA5ZGJleDJhcDUwMHg5OXg1cnJ0c3d4enNzIiB0aW1l
 c3RhbXA9IjE3NjgwNTI5MTEiIGd1aWQ9ImM4OTUwNjA2LTRmZGQtNDExYy05ODgyLTQ5MjM0MWFh
@@ -13588,7 +13878,7 @@
       <w:r>
         <w:fldChar w:fldCharType="begin">
           <w:fldData xml:space="preserve">PEVuZE5vdGU+PENpdGU+PEF1dGhvcj5MYXdzb248L0F1dGhvcj48WWVhcj4yMDIzPC9ZZWFyPjxS
-ZWNOdW0+NjA8L1JlY051bT48RGlzcGxheVRleHQ+WzE3LCAxOCwgNDMtNDVdPC9EaXNwbGF5VGV4
+ZWNOdW0+NjA8L1JlY051bT48RGlzcGxheVRleHQ+WzE3LCAxOCwgNDQtNDZdPC9EaXNwbGF5VGV4
 dD48cmVjb3JkPjxyZWMtbnVtYmVyPjYwPC9yZWMtbnVtYmVyPjxmb3JlaWduLWtleXM+PGtleSBh
 cHA9IkVOIiBkYi1pZD0idjkyMHBmdDA2cnA5ZGJleDJhcDUwMHg5OXg1cnJ0c3d4enNzIiB0aW1l
 c3RhbXA9IjE3NjgwNTI5MTEiIGd1aWQ9ImM4OTUwNjA2LTRmZGQtNDExYy05ODgyLTQ5MjM0MWFh
@@ -13707,7 +13997,7 @@
         <w:rPr>
           <w:noProof/>
         </w:rPr>
-        <w:t>[17, 18, 43-45]</w:t>
+        <w:t>[17, 18, 44-46]</w:t>
       </w:r>
       <w:r>
         <w:fldChar w:fldCharType="end"/>
@@ -13802,25 +14092,7 @@
             <w:vertAlign w:val="subscript"/>
             <w:lang w:val="en-US"/>
           </w:rPr>
-          <m:t>D</m:t>
-        </m:r>
-        <m:r>
-          <w:rPr>
-            <w:rFonts w:ascii="Cambria Math" w:hAnsi="Cambria Math"/>
-            <w:highlight w:val="yellow"/>
-            <w:vertAlign w:val="subscript"/>
-            <w:lang w:val="en-US"/>
-          </w:rPr>
-          <m:t>(N)</m:t>
-        </m:r>
-        <m:r>
-          <w:rPr>
-            <w:rFonts w:ascii="Cambria Math" w:hAnsi="Cambria Math"/>
-            <w:highlight w:val="yellow"/>
-            <w:vertAlign w:val="subscript"/>
-            <w:lang w:val="en-US"/>
-          </w:rPr>
-          <m:t>=</m:t>
+          <m:t>D(N)=</m:t>
         </m:r>
         <m:f>
           <m:fPr>
@@ -13842,25 +14114,7 @@
                 <w:vertAlign w:val="subscript"/>
                 <w:lang w:val="en-US"/>
               </w:rPr>
-              <m:t>ΔT(</m:t>
-            </m:r>
-            <m:r>
-              <w:rPr>
-                <w:rFonts w:ascii="Cambria Math" w:hAnsi="Cambria Math"/>
-                <w:highlight w:val="yellow"/>
-                <w:vertAlign w:val="subscript"/>
-                <w:lang w:val="en-US"/>
-              </w:rPr>
-              <m:t>N</m:t>
-            </m:r>
-            <m:r>
-              <w:rPr>
-                <w:rFonts w:ascii="Cambria Math" w:hAnsi="Cambria Math"/>
-                <w:highlight w:val="yellow"/>
-                <w:vertAlign w:val="subscript"/>
-                <w:lang w:val="en-US"/>
-              </w:rPr>
-              <m:t>)-Δ</m:t>
+              <m:t>ΔT(N)-Δ</m:t>
             </m:r>
             <m:sSub>
               <m:sSubPr>
@@ -13987,21 +14241,7 @@
           <w:lang w:val="en-US"/>
         </w:rPr>
         <w:tab/>
-        <w:t>(</w:t>
-      </w:r>
-      <w:r>
-        <w:rPr>
-          <w:highlight w:val="yellow"/>
-          <w:lang w:val="en-US"/>
-        </w:rPr>
-        <w:t>XX</w:t>
-      </w:r>
-      <w:r>
-        <w:rPr>
-          <w:highlight w:val="yellow"/>
-          <w:lang w:val="en-US"/>
-        </w:rPr>
-        <w:t>)</w:t>
+        <w:t>(XX)</w:t>
       </w:r>
     </w:p>
     <w:p>
@@ -14348,7 +14588,7 @@
         <w:fldChar w:fldCharType="begin"/>
       </w:r>
       <w:r>
-        <w:instrText xml:space="preserve"> ADDIN EN.CITE &lt;EndNote&gt;&lt;Cite&gt;&lt;Author&gt;Paschotta&lt;/Author&gt;&lt;Year&gt;2008&lt;/Year&gt;&lt;RecNum&gt;88&lt;/RecNum&gt;&lt;DisplayText&gt;[46]&lt;/DisplayText&gt;&lt;record&gt;&lt;rec-number&gt;88&lt;/rec-number&gt;&lt;foreign-keys&gt;&lt;key app="EN" db-id="v920pft06rp9dbex2ap500x99x5rrtswxzss" timestamp="1774446585"&gt;88&lt;/key&gt;&lt;/foreign-keys&gt;&lt;ref-type name="Book"&gt;6&lt;/ref-type&gt;&lt;contributors&gt;&lt;authors&gt;&lt;author&gt;Paschotta, R.&lt;/author&gt;&lt;/authors&gt;&lt;/contributors&gt;&lt;titles&gt;&lt;title&gt;Encyclopedia of Laser Physics and Technology&lt;/title&gt;&lt;/titles&gt;&lt;dates&gt;&lt;year&gt;2008&lt;/year&gt;&lt;/dates&gt;&lt;publisher&gt;Wiley&lt;/publisher&gt;&lt;isbn&gt;9783527408283&lt;/isbn&gt;&lt;urls&gt;&lt;related-urls&gt;&lt;url&gt;https://books.google.co.th/books?id=hdkJ5ASTFjcC&lt;/url&gt;&lt;/related-urls&gt;&lt;/urls&gt;&lt;/record&gt;&lt;/Cite&gt;&lt;/EndNote&gt;</w:instrText>
+        <w:instrText xml:space="preserve"> ADDIN EN.CITE &lt;EndNote&gt;&lt;Cite&gt;&lt;Author&gt;Paschotta&lt;/Author&gt;&lt;Year&gt;2008&lt;/Year&gt;&lt;RecNum&gt;88&lt;/RecNum&gt;&lt;DisplayText&gt;[47]&lt;/DisplayText&gt;&lt;record&gt;&lt;rec-number&gt;88&lt;/rec-number&gt;&lt;foreign-keys&gt;&lt;key app="EN" db-id="v920pft06rp9dbex2ap500x99x5rrtswxzss" timestamp="1774446585"&gt;88&lt;/key&gt;&lt;/foreign-keys&gt;&lt;ref-type name="Book"&gt;6&lt;/ref-type&gt;&lt;contributors&gt;&lt;authors&gt;&lt;author&gt;Paschotta, R.&lt;/author&gt;&lt;/authors&gt;&lt;/contributors&gt;&lt;titles&gt;&lt;title&gt;Encyclopedia of Laser Physics and Technology&lt;/title&gt;&lt;/titles&gt;&lt;dates&gt;&lt;year&gt;2008&lt;/year&gt;&lt;/dates&gt;&lt;publisher&gt;Wiley&lt;/publisher&gt;&lt;isbn&gt;9783527408283&lt;/isbn&gt;&lt;urls&gt;&lt;related-urls&gt;&lt;url&gt;https://books.google.co.th/books?id=hdkJ5ASTFjcC&lt;/url&gt;&lt;/related-urls&gt;&lt;/urls&gt;&lt;/record&gt;&lt;/Cite&gt;&lt;/EndNote&gt;</w:instrText>
       </w:r>
       <w:r>
         <w:fldChar w:fldCharType="separate"/>
@@ -14357,7 +14597,7 @@
         <w:rPr>
           <w:noProof/>
         </w:rPr>
-        <w:t>[46]</w:t>
+        <w:t>[47]</w:t>
       </w:r>
       <w:r>
         <w:fldChar w:fldCharType="end"/>
@@ -14656,47 +14896,7 @@
         </w:rPr>
         <w:t>. Results</w:t>
       </w:r>
-    </w:p>
-    <w:p>
-      <w:r>
-        <w:t>1064</w:t>
-      </w:r>
-    </w:p>
-    <w:p>
-      <w:r>
-        <w:tab/>
-        <w:t>QWOT</w:t>
-      </w:r>
-    </w:p>
-    <w:p>
-      <w:r>
-        <w:tab/>
-        <w:t>Broadband</w:t>
-      </w:r>
-      <w:r>
-        <w:t xml:space="preserve"> behaviour in 3 and 4-layer design</w:t>
-      </w:r>
-    </w:p>
-    <w:p>
-      <w:r>
-        <w:t>532</w:t>
-      </w:r>
-    </w:p>
-    <w:p>
-      <w:r>
-        <w:tab/>
-        <w:t>failure of QWOT, symmetrical resonant cavity</w:t>
-      </w:r>
-    </w:p>
-    <w:p>
-      <w:r>
-        <w:tab/>
-        <w:t>need asymmetrical resonance cavity</w:t>
-      </w:r>
-    </w:p>
-    <w:p>
-      <w:pPr>
-        <w:pStyle w:val="Heading1"/>
+      <w:r>
         <w:rPr>
           <w:rStyle w:val="Emphasis"/>
           <w:rFonts w:ascii="Arial" w:hAnsi="Arial"/>
@@ -14704,7 +14904,8 @@
           <w:iCs w:val="0"/>
           <w:sz w:val="20"/>
         </w:rPr>
-      </w:pPr>
+        <w:t xml:space="preserve"> </w:t>
+      </w:r>
       <w:r>
         <w:rPr>
           <w:rStyle w:val="Emphasis"/>
@@ -14714,8 +14915,57 @@
           <w:sz w:val="20"/>
           <w:highlight w:val="yellow"/>
         </w:rPr>
-        <w:t>5</w:t>
-      </w:r>
+        <w:t>and Discussions</w:t>
+      </w:r>
+    </w:p>
+    <w:p>
+      <w:r>
+        <w:t>1064</w:t>
+      </w:r>
+    </w:p>
+    <w:p>
+      <w:r>
+        <w:tab/>
+        <w:t>QWOT</w:t>
+      </w:r>
+    </w:p>
+    <w:p>
+      <w:r>
+        <w:tab/>
+        <w:t>Broadband</w:t>
+      </w:r>
+      <w:r>
+        <w:t xml:space="preserve"> behaviour in 3 and 4-layer design</w:t>
+      </w:r>
+    </w:p>
+    <w:p>
+      <w:r>
+        <w:t>532</w:t>
+      </w:r>
+    </w:p>
+    <w:p>
+      <w:r>
+        <w:tab/>
+        <w:t>failure of QWOT, symmetrical resonant cavity</w:t>
+      </w:r>
+    </w:p>
+    <w:p>
+      <w:r>
+        <w:tab/>
+        <w:t>need asymmetrical resonance cavity</w:t>
+      </w:r>
+    </w:p>
+    <w:p>
+      <w:pPr>
+        <w:pStyle w:val="Heading1"/>
+        <w:rPr>
+          <w:rStyle w:val="Emphasis"/>
+          <w:rFonts w:ascii="Arial" w:hAnsi="Arial"/>
+          <w:i w:val="0"/>
+          <w:iCs w:val="0"/>
+          <w:sz w:val="20"/>
+        </w:rPr>
+      </w:pPr>
       <w:r>
         <w:rPr>
           <w:rStyle w:val="Emphasis"/>
@@ -14725,7 +14975,7 @@
           <w:sz w:val="20"/>
           <w:highlight w:val="yellow"/>
         </w:rPr>
-        <w:t>.</w:t>
+        <w:t>5</w:t>
       </w:r>
       <w:r>
         <w:rPr>
@@ -14736,7 +14986,7 @@
           <w:sz w:val="20"/>
           <w:highlight w:val="yellow"/>
         </w:rPr>
-        <w:t xml:space="preserve"> </w:t>
+        <w:t>.</w:t>
       </w:r>
       <w:r>
         <w:rPr>
@@ -14747,7 +14997,7 @@
           <w:sz w:val="20"/>
           <w:highlight w:val="yellow"/>
         </w:rPr>
-        <w:t>Discuss</w:t>
+        <w:t xml:space="preserve"> </w:t>
       </w:r>
       <w:r>
         <w:rPr>
@@ -14758,167 +15008,169 @@
           <w:sz w:val="20"/>
           <w:highlight w:val="yellow"/>
         </w:rPr>
-        <w:t>ions</w:t>
-      </w:r>
-    </w:p>
-    <w:p>
-      <w:r>
-        <w:tab/>
-        <w:t>For a 1064-nm optical limiters, a simple QWOT-design already satisfy anti-reflection conditions, it’s also the smallest design. For a broader operating range in the IR spectrum, the XXX design has</w:t>
-      </w:r>
-      <w:r>
-        <w:t>…</w:t>
-      </w:r>
-    </w:p>
-    <w:p>
-      <w:r>
-        <w:tab/>
-      </w:r>
-      <w:r>
-        <w:t>For a self-activating optical limiter</w:t>
-      </w:r>
-      <w:r>
-        <w:t xml:space="preserve"> at 532 nm</w:t>
-      </w:r>
-      <w:r>
-        <w:t xml:space="preserve">, </w:t>
-      </w:r>
-      <w:r>
-        <w:t>resonance can be restored with asymmetrical designs. Asymmetrical cavity designs required thinner Sb</w:t>
-      </w:r>
-      <w:r>
-        <w:rPr>
-          <w:vertAlign w:val="subscript"/>
-        </w:rPr>
-        <w:t>2</w:t>
-      </w:r>
-      <w:r>
-        <w:t>Se</w:t>
-      </w:r>
-      <w:r>
-        <w:rPr>
-          <w:vertAlign w:val="subscript"/>
-        </w:rPr>
-        <w:t>3</w:t>
-      </w:r>
-      <w:r>
-        <w:t xml:space="preserve">. Which should prevent partial phase-transition described in </w:t>
-      </w:r>
-      <w:r>
-        <w:fldChar w:fldCharType="begin"/>
-      </w:r>
-      <w:r>
-        <w:instrText xml:space="preserve"> ADDIN EN.CITE &lt;EndNote&gt;&lt;Cite&gt;&lt;Author&gt;Lawson&lt;/Author&gt;&lt;Year&gt;2023&lt;/Year&gt;&lt;RecNum&gt;60&lt;/RecNum&gt;&lt;DisplayText&gt;[17]&lt;/DisplayText&gt;&lt;record&gt;&lt;rec-number&gt;60&lt;/rec-number&gt;&lt;foreign-keys&gt;&lt;key app="EN" db-id="v920pft06rp9dbex2ap500x99x5rrtswxzss" timestamp="1768052911" guid="c8950606-4fdd-411c-9882-492341aa05f3"&gt;60&lt;/key&gt;&lt;/foreign-keys&gt;&lt;ref-type name="Journal Article"&gt;17&lt;/ref-type&gt;&lt;contributors&gt;&lt;authors&gt;&lt;author&gt;Lawson, Daniel&lt;/author&gt;&lt;author&gt;Blundell, Sophie&lt;/author&gt;&lt;author&gt;Ebert, Martin&lt;/author&gt;&lt;author&gt;Muskens, Otto L.&lt;/author&gt;&lt;author&gt;Zeimpekis, Ioannis&lt;/author&gt;&lt;/authors&gt;&lt;/contributors&gt;&lt;titles&gt;&lt;title&gt;Optical switching beyond a million cycles of low-loss phase change material Sb2Se3&lt;/title&gt;&lt;secondary-title&gt;Optical Materials Express&lt;/secondary-title&gt;&lt;/titles&gt;&lt;periodical&gt;&lt;full-title&gt;Optical Materials Express&lt;/full-title&gt;&lt;abbr-1&gt;Opt. Mater. Express&lt;/abbr-1&gt;&lt;/periodical&gt;&lt;volume&gt;14&lt;/volume&gt;&lt;number&gt;1&lt;/number&gt;&lt;section&gt;22&lt;/section&gt;&lt;dates&gt;&lt;year&gt;2023&lt;/year&gt;&lt;/dates&gt;&lt;isbn&gt;2159-3930&lt;/isbn&gt;&lt;urls&gt;&lt;/urls&gt;&lt;electronic-resource-num&gt;10.1364/ome.509434&lt;/electronic-resource-num&gt;&lt;/record&gt;&lt;/Cite&gt;&lt;/EndNote&gt;</w:instrText>
-      </w:r>
-      <w:r>
-        <w:fldChar w:fldCharType="separate"/>
-      </w:r>
-      <w:r>
-        <w:rPr>
-          <w:noProof/>
-        </w:rPr>
-        <w:t>[17]</w:t>
-      </w:r>
-      <w:r>
-        <w:fldChar w:fldCharType="end"/>
-      </w:r>
-      <w:r>
-        <w:t>. T</w:t>
-      </w:r>
-      <w:r>
-        <w:t xml:space="preserve">he question </w:t>
-      </w:r>
-      <w:r>
-        <w:t>then become</w:t>
-      </w:r>
-      <w:r>
-        <w:t xml:space="preserve"> </w:t>
-      </w:r>
-      <w:r>
-        <w:t>‘</w:t>
-      </w:r>
-      <w:r>
-        <w:t xml:space="preserve">at what threshold of </w:t>
-      </w:r>
-      <w:r>
-        <w:t>laser</w:t>
-      </w:r>
-      <w:r>
-        <w:t xml:space="preserve"> intensity will the optical limiter </w:t>
-      </w:r>
-      <w:r>
-        <w:t xml:space="preserve">be </w:t>
-      </w:r>
-      <w:r>
-        <w:t>turned off?</w:t>
-      </w:r>
-      <w:r>
-        <w:t>’.</w:t>
-      </w:r>
-      <w:r>
-        <w:t xml:space="preserve"> If the threshold is low, then the device need</w:t>
-      </w:r>
-      <w:r>
-        <w:t>s</w:t>
-      </w:r>
-      <w:r>
-        <w:t xml:space="preserve"> to have more absorptivity in </w:t>
-      </w:r>
-      <w:r>
-        <w:t>the</w:t>
-      </w:r>
-      <w:r>
-        <w:t xml:space="preserve"> ON mode</w:t>
-      </w:r>
-      <w:r>
-        <w:t xml:space="preserve">. But if the threshold is high, then the absorptivity in the ON mode </w:t>
-      </w:r>
-      <w:r>
-        <w:t xml:space="preserve">does </w:t>
-      </w:r>
-      <w:r>
-        <w:t>not need to be as high.</w:t>
-      </w:r>
-      <w:r>
-        <w:t xml:space="preserve"> Its absorptivity in the OFF mode is also </w:t>
-      </w:r>
-      <w:r>
-        <w:t>important;</w:t>
-      </w:r>
-      <w:r>
-        <w:t xml:space="preserve"> it ideally should be as high as possible</w:t>
-      </w:r>
-      <w:r>
-        <w:t xml:space="preserve"> since it need to be re-amorphized at an even higher temperature to return </w:t>
-      </w:r>
-      <w:r>
-        <w:t xml:space="preserve">the device </w:t>
-      </w:r>
-      <w:r>
-        <w:t>from OFF to ON mode. Would a volatile-type PCM be more suitable for self-activating optical limiter?</w:t>
-      </w:r>
-    </w:p>
-    <w:p>
-      <w:r>
-        <w:tab/>
-        <w:t xml:space="preserve">Another metric that we didn’t show here are </w:t>
-      </w:r>
-      <w:r>
-        <w:t>the tolerance of optical performances at varying incident angles. A high-tolerance devices would allow for broader applications.</w:t>
-      </w:r>
-    </w:p>
-    <w:p>
-      <w:pPr>
-        <w:pStyle w:val="Heading1"/>
+        <w:t>Discuss</w:t>
+      </w:r>
+      <w:r>
         <w:rPr>
           <w:rStyle w:val="Emphasis"/>
           <w:rFonts w:ascii="Arial" w:hAnsi="Arial"/>
           <w:i w:val="0"/>
           <w:iCs w:val="0"/>
           <w:sz w:val="20"/>
-        </w:rPr>
-      </w:pPr>
-      <w:r>
+          <w:highlight w:val="yellow"/>
+        </w:rPr>
+        <w:t>ions</w:t>
+      </w:r>
+    </w:p>
+    <w:p>
+      <w:r>
+        <w:tab/>
+        <w:t>For a 1064-nm optical limiters, a simple QWOT-design already satisfy anti-reflection conditions, it’s also the smallest design. For a broader operating range in the IR spectrum, the XXX design has</w:t>
+      </w:r>
+      <w:r>
+        <w:t>…</w:t>
+      </w:r>
+    </w:p>
+    <w:p>
+      <w:r>
+        <w:tab/>
+      </w:r>
+      <w:r>
+        <w:t>For a self-activating optical limiter</w:t>
+      </w:r>
+      <w:r>
+        <w:t xml:space="preserve"> at 532 nm</w:t>
+      </w:r>
+      <w:r>
+        <w:t xml:space="preserve">, </w:t>
+      </w:r>
+      <w:r>
+        <w:t>resonance can be restored with asymmetrical designs. Asymmetrical cavity designs required thinner Sb</w:t>
+      </w:r>
+      <w:r>
+        <w:rPr>
+          <w:vertAlign w:val="subscript"/>
+        </w:rPr>
+        <w:t>2</w:t>
+      </w:r>
+      <w:r>
+        <w:t>Se</w:t>
+      </w:r>
+      <w:r>
+        <w:rPr>
+          <w:vertAlign w:val="subscript"/>
+        </w:rPr>
+        <w:t>3</w:t>
+      </w:r>
+      <w:r>
+        <w:t xml:space="preserve">. Which should prevent partial phase-transition described in </w:t>
+      </w:r>
+      <w:r>
+        <w:fldChar w:fldCharType="begin"/>
+      </w:r>
+      <w:r>
+        <w:instrText xml:space="preserve"> ADDIN EN.CITE &lt;EndNote&gt;&lt;Cite&gt;&lt;Author&gt;Lawson&lt;/Author&gt;&lt;Year&gt;2023&lt;/Year&gt;&lt;RecNum&gt;60&lt;/RecNum&gt;&lt;DisplayText&gt;[17]&lt;/DisplayText&gt;&lt;record&gt;&lt;rec-number&gt;60&lt;/rec-number&gt;&lt;foreign-keys&gt;&lt;key app="EN" db-id="v920pft06rp9dbex2ap500x99x5rrtswxzss" timestamp="1768052911" guid="c8950606-4fdd-411c-9882-492341aa05f3"&gt;60&lt;/key&gt;&lt;/foreign-keys&gt;&lt;ref-type name="Journal Article"&gt;17&lt;/ref-type&gt;&lt;contributors&gt;&lt;authors&gt;&lt;author&gt;Lawson, Daniel&lt;/author&gt;&lt;author&gt;Blundell, Sophie&lt;/author&gt;&lt;author&gt;Ebert, Martin&lt;/author&gt;&lt;author&gt;Muskens, Otto L.&lt;/author&gt;&lt;author&gt;Zeimpekis, Ioannis&lt;/author&gt;&lt;/authors&gt;&lt;/contributors&gt;&lt;titles&gt;&lt;title&gt;Optical switching beyond a million cycles of low-loss phase change material Sb2Se3&lt;/title&gt;&lt;secondary-title&gt;Optical Materials Express&lt;/secondary-title&gt;&lt;/titles&gt;&lt;periodical&gt;&lt;full-title&gt;Optical Materials Express&lt;/full-title&gt;&lt;abbr-1&gt;Opt. Mater. Express&lt;/abbr-1&gt;&lt;/periodical&gt;&lt;volume&gt;14&lt;/volume&gt;&lt;number&gt;1&lt;/number&gt;&lt;section&gt;22&lt;/section&gt;&lt;dates&gt;&lt;year&gt;2023&lt;/year&gt;&lt;/dates&gt;&lt;isbn&gt;2159-3930&lt;/isbn&gt;&lt;urls&gt;&lt;/urls&gt;&lt;electronic-resource-num&gt;10.1364/ome.509434&lt;/electronic-resource-num&gt;&lt;/record&gt;&lt;/Cite&gt;&lt;/EndNote&gt;</w:instrText>
+      </w:r>
+      <w:r>
+        <w:fldChar w:fldCharType="separate"/>
+      </w:r>
+      <w:r>
+        <w:rPr>
+          <w:noProof/>
+        </w:rPr>
+        <w:t>[17]</w:t>
+      </w:r>
+      <w:r>
+        <w:fldChar w:fldCharType="end"/>
+      </w:r>
+      <w:r>
+        <w:t>. T</w:t>
+      </w:r>
+      <w:r>
+        <w:t xml:space="preserve">he question </w:t>
+      </w:r>
+      <w:r>
+        <w:t>then become</w:t>
+      </w:r>
+      <w:r>
+        <w:t xml:space="preserve"> </w:t>
+      </w:r>
+      <w:r>
+        <w:t>‘</w:t>
+      </w:r>
+      <w:r>
+        <w:t xml:space="preserve">at what threshold of </w:t>
+      </w:r>
+      <w:r>
+        <w:t>laser</w:t>
+      </w:r>
+      <w:r>
+        <w:t xml:space="preserve"> intensity will the optical limiter </w:t>
+      </w:r>
+      <w:r>
+        <w:t xml:space="preserve">be </w:t>
+      </w:r>
+      <w:r>
+        <w:t>turned off?</w:t>
+      </w:r>
+      <w:r>
+        <w:t>’.</w:t>
+      </w:r>
+      <w:r>
+        <w:t xml:space="preserve"> If the threshold is low, then the device need</w:t>
+      </w:r>
+      <w:r>
+        <w:t>s</w:t>
+      </w:r>
+      <w:r>
+        <w:t xml:space="preserve"> to have more absorptivity in </w:t>
+      </w:r>
+      <w:r>
+        <w:t>the</w:t>
+      </w:r>
+      <w:r>
+        <w:t xml:space="preserve"> ON mode</w:t>
+      </w:r>
+      <w:r>
+        <w:t xml:space="preserve">. But if the threshold is high, then the absorptivity in the ON mode </w:t>
+      </w:r>
+      <w:r>
+        <w:t xml:space="preserve">does </w:t>
+      </w:r>
+      <w:r>
+        <w:t>not need to be as high.</w:t>
+      </w:r>
+      <w:r>
+        <w:t xml:space="preserve"> Its absorptivity in the OFF mode is also </w:t>
+      </w:r>
+      <w:r>
+        <w:t>important;</w:t>
+      </w:r>
+      <w:r>
+        <w:t xml:space="preserve"> it ideally should be as high as possible</w:t>
+      </w:r>
+      <w:r>
+        <w:t xml:space="preserve"> since it need to be re-amorphized at an even higher temperature to return </w:t>
+      </w:r>
+      <w:r>
+        <w:t xml:space="preserve">the device </w:t>
+      </w:r>
+      <w:r>
+        <w:t>from OFF to ON mode. Would a volatile-type PCM be more suitable for self-activating optical limiter?</w:t>
+      </w:r>
+    </w:p>
+    <w:p>
+      <w:r>
+        <w:tab/>
+        <w:t xml:space="preserve">Another metric that we didn’t show here are </w:t>
+      </w:r>
+      <w:r>
+        <w:t>the tolerance of optical performances at varying incident angles. A high-tolerance devices would allow for broader applications.</w:t>
+      </w:r>
+    </w:p>
+    <w:p>
+      <w:pPr>
+        <w:pStyle w:val="Heading1"/>
         <w:rPr>
           <w:rStyle w:val="Emphasis"/>
           <w:rFonts w:ascii="Arial" w:hAnsi="Arial"/>
@@ -14926,6 +15178,16 @@
           <w:iCs w:val="0"/>
           <w:sz w:val="20"/>
         </w:rPr>
+      </w:pPr>
+      <w:r>
+        <w:rPr>
+          <w:rStyle w:val="Emphasis"/>
+          <w:rFonts w:ascii="Arial" w:hAnsi="Arial"/>
+          <w:i w:val="0"/>
+          <w:iCs w:val="0"/>
+          <w:sz w:val="20"/>
+        </w:rPr>
+        <w:lastRenderedPageBreak/>
         <w:t>6</w:t>
       </w:r>
       <w:r>
@@ -15071,7 +15333,6 @@
         <w:ind w:left="720" w:hanging="720"/>
       </w:pPr>
       <w:r>
-        <w:lastRenderedPageBreak/>
         <w:t>[3]</w:t>
       </w:r>
       <w:r>
@@ -15776,6 +16037,7 @@
         <w:ind w:left="720" w:hanging="720"/>
       </w:pPr>
       <w:r>
+        <w:lastRenderedPageBreak/>
         <w:t>[26]</w:t>
       </w:r>
       <w:r>
@@ -15922,7 +16184,6 @@
         <w:ind w:left="720" w:hanging="720"/>
       </w:pPr>
       <w:r>
-        <w:lastRenderedPageBreak/>
         <w:t>[31]</w:t>
       </w:r>
       <w:r>
@@ -16078,16 +16339,25 @@
       </w:r>
       <w:r>
         <w:tab/>
-        <w:t xml:space="preserve">H. K. Raut, V. A. Ganesh, A. S. Nair, and S. Ramakrishna, "Anti-reflective coatings: A critical, in-depth review," </w:t>
+        <w:t>S. V. Zhukovsky</w:t>
       </w:r>
       <w:r>
         <w:rPr>
           <w:i/>
         </w:rPr>
-        <w:t xml:space="preserve">Energy &amp; Environmental Science, </w:t>
-      </w:r>
-      <w:r>
-        <w:t>10.1039/C1EE01297E vol. 4, no. 10, pp. 3779–3804, 2011, doi: 10.1039/C1EE01297E.</w:t>
+        <w:t xml:space="preserve"> et al.</w:t>
+      </w:r>
+      <w:r>
+        <w:t xml:space="preserve">, "Experimental Demonstration of Effective Medium Approximation Breakdown in Deeply Subwavelength All-Dielectric Multilayers," </w:t>
+      </w:r>
+      <w:r>
+        <w:rPr>
+          <w:i/>
+        </w:rPr>
+        <w:t xml:space="preserve">Physical Review Letters, </w:t>
+      </w:r>
+      <w:r>
+        <w:t>vol. 115, no. 17, p. 177402, 10/23/ 2015, doi: 10.1103/PhysRevLett.115.177402.</w:t>
       </w:r>
     </w:p>
     <w:p>
@@ -16097,6 +16367,28 @@
       </w:pPr>
       <w:r>
         <w:t>[38]</w:t>
+      </w:r>
+      <w:r>
+        <w:tab/>
+        <w:t xml:space="preserve">H. K. Raut, V. A. Ganesh, A. S. Nair, and S. Ramakrishna, "Anti-reflective coatings: A critical, in-depth review," </w:t>
+      </w:r>
+      <w:r>
+        <w:rPr>
+          <w:i/>
+        </w:rPr>
+        <w:t xml:space="preserve">Energy &amp; Environmental Science, </w:t>
+      </w:r>
+      <w:r>
+        <w:t>10.1039/C1EE01297E vol. 4, no. 10, pp. 3779–3804, 2011, doi: 10.1039/C1EE01297E.</w:t>
+      </w:r>
+    </w:p>
+    <w:p>
+      <w:pPr>
+        <w:pStyle w:val="EndNoteBibliography"/>
+        <w:ind w:left="720" w:hanging="720"/>
+      </w:pPr>
+      <w:r>
+        <w:t>[39]</w:t>
       </w:r>
       <w:r>
         <w:tab/>
@@ -16129,7 +16421,7 @@
         <w:ind w:left="720" w:hanging="720"/>
       </w:pPr>
       <w:r>
-        <w:t>[39]</w:t>
+        <w:t>[40]</w:t>
       </w:r>
       <w:r>
         <w:tab/>
@@ -16162,7 +16454,7 @@
         <w:ind w:left="720" w:hanging="720"/>
       </w:pPr>
       <w:r>
-        <w:t>[40]</w:t>
+        <w:t>[41]</w:t>
       </w:r>
       <w:r>
         <w:tab/>
@@ -16184,7 +16476,7 @@
         <w:ind w:left="720" w:hanging="720"/>
       </w:pPr>
       <w:r>
-        <w:t>[41]</w:t>
+        <w:t>[42]</w:t>
       </w:r>
       <w:r>
         <w:tab/>
@@ -16206,7 +16498,7 @@
         <w:ind w:left="720" w:hanging="720"/>
       </w:pPr>
       <w:r>
-        <w:t>[42]</w:t>
+        <w:t>[43]</w:t>
       </w:r>
       <w:r>
         <w:tab/>
@@ -16248,7 +16540,7 @@
         <w:ind w:left="720" w:hanging="720"/>
       </w:pPr>
       <w:r>
-        <w:t>[43]</w:t>
+        <w:t>[44]</w:t>
       </w:r>
       <w:r>
         <w:tab/>
@@ -16279,7 +16571,7 @@
         <w:ind w:left="720" w:hanging="720"/>
       </w:pPr>
       <w:r>
-        <w:t>[44]</w:t>
+        <w:t>[45]</w:t>
       </w:r>
       <w:r>
         <w:tab/>
@@ -16310,7 +16602,7 @@
         <w:ind w:left="720" w:hanging="720"/>
       </w:pPr>
       <w:r>
-        <w:t>[45]</w:t>
+        <w:t>[46]</w:t>
       </w:r>
       <w:r>
         <w:tab/>
@@ -16332,7 +16624,7 @@
         <w:ind w:left="720" w:hanging="720"/>
       </w:pPr>
       <w:r>
-        <w:t>[46]</w:t>
+        <w:t>[47]</w:t>
       </w:r>
       <w:r>
         <w:tab/>
@@ -16764,7 +17056,7 @@
   <w:style w:type="paragraph" w:default="1" w:styleId="Normal">
     <w:name w:val="Normal"/>
     <w:qFormat/>
-    <w:rsid w:val="00FF4067"/>
+    <w:rsid w:val="00083B9D"/>
     <w:pPr>
       <w:spacing w:after="0" w:line="240" w:lineRule="auto"/>
       <w:jc w:val="both"/>
@@ -16971,6 +17263,7 @@
   <w:style w:type="character" w:default="1" w:styleId="DefaultParagraphFont">
     <w:name w:val="Default Paragraph Font"/>
     <w:uiPriority w:val="1"/>
+    <w:semiHidden/>
     <w:unhideWhenUsed/>
   </w:style>
   <w:style w:type="table" w:default="1" w:styleId="TableNormal">

</xml_diff>

<commit_message>
1, 2, 3 layers (1064, 1550nm)
Change SiO2 substrate dataset
</commit_message>
<xml_diff>
--- a/paper/[OptMaterX] Design and Simulation of Sb2Se3-Based.docx
+++ b/paper/[OptMaterX] Design and Simulation of Sb2Se3-Based.docx
@@ -463,7 +463,6 @@
       <w:pPr>
         <w:rPr>
           <w:rStyle w:val="Emphasis"/>
-          <w:rFonts w:hint="cs"/>
           <w:i w:val="0"/>
           <w:iCs w:val="0"/>
           <w:cs/>
@@ -505,7 +504,7 @@
         <w:pStyle w:val="Heading1"/>
         <w:rPr>
           <w:rStyle w:val="Emphasis"/>
-          <w:rFonts w:cs="Cordia New" w:hint="cs"/>
+          <w:rFonts w:cs="Cordia New"/>
           <w:b w:val="0"/>
           <w:bCs w:val="0"/>
           <w:cs/>
@@ -807,7 +806,25 @@
           <w:sz w:val="20"/>
           <w:szCs w:val="20"/>
         </w:rPr>
-        <w:t xml:space="preserve"> showcases two distinct design challenges. The design utilizes Sb</w:t>
+        <w:t xml:space="preserve"> </w:t>
+      </w:r>
+      <w:proofErr w:type="gramStart"/>
+      <w:r>
+        <w:rPr>
+          <w:rStyle w:val="Emphasis"/>
+          <w:sz w:val="20"/>
+          <w:szCs w:val="20"/>
+        </w:rPr>
+        <w:t>showcases</w:t>
+      </w:r>
+      <w:proofErr w:type="gramEnd"/>
+      <w:r>
+        <w:rPr>
+          <w:rStyle w:val="Emphasis"/>
+          <w:sz w:val="20"/>
+          <w:szCs w:val="20"/>
+        </w:rPr>
+        <w:t xml:space="preserve"> two distinct design challenges. The design utilizes Sb</w:t>
       </w:r>
       <w:r>
         <w:rPr>
@@ -843,6 +860,7 @@
         </w:rPr>
         <w:t xml:space="preserve"> layer(s) with thickness ranging from </w:t>
       </w:r>
+      <w:proofErr w:type="gramStart"/>
       <w:r>
         <w:rPr>
           <w:rStyle w:val="Emphasis"/>
@@ -852,6 +870,7 @@
         </w:rPr>
         <w:t>XXX to XXX</w:t>
       </w:r>
+      <w:proofErr w:type="gramEnd"/>
       <w:r>
         <w:rPr>
           <w:rStyle w:val="Emphasis"/>
@@ -1064,6 +1083,7 @@
           <w:rStyle w:val="Emphasis"/>
           <w:iCs w:val="0"/>
           <w:sz w:val="28"/>
+          <w:lang w:val="en-US"/>
         </w:rPr>
       </w:pPr>
       <w:r>
@@ -4314,7 +4334,29 @@
 VVMgMjAxOS8wMDk0NDMwIEExPC9pc2JuPjx3b3JrLXR5cGU+QTE8L3dvcmstdHlwZT48dXJscz48
 cmVsYXRlZC11cmxzPjx1cmw+aHR0cHM6Ly9sZW5zLm9yZy8xNjgtODI5LTQ1Ny0xNDQtMDQ1PC91
 cmw+PC9yZWxhdGVkLXVybHM+PC91cmxzPjxjdXN0b20xPjIwMTcvMDkvMjY8L2N1c3RvbTE+PGN1
-c3RvbTI+MjAxOS8wMy8yODwvY3VzdG9tMj48L3JlY29yZD48L0NpdGU+PC9FbmROb3RlPn==
+c3RvbTI+MjAxOS8wMy8yODwvY3VzdG9tMj48L3JlY29yZD48L0NpdGU+PENpdGU+PEF1dGhvcj5X
+YW48L0F1dGhvcj48WWVhcj4yMDIxPC9ZZWFyPjxSZWNOdW0+MzA8L1JlY051bT48cmVjb3JkPjxy
+ZWMtbnVtYmVyPjMwPC9yZWMtbnVtYmVyPjxmb3JlaWduLWtleXM+PGtleSBhcHA9IkVOIiBkYi1p
+ZD0idjkyMHBmdDA2cnA5ZGJleDJhcDUwMHg5OXg1cnJ0c3d4enNzIiB0aW1lc3RhbXA9IjE3Njgw
+MTc2NjYiIGd1aWQ9ImQ3ODU1OGJiLTMzM2QtNDcwMS1hMjc5LWQzOWI1Y2ZkZWE2MyI+MzA8L2tl
+eT48L2ZvcmVpZ24ta2V5cz48cmVmLXR5cGUgbmFtZT0iSm91cm5hbCBBcnRpY2xlIj4xNzwvcmVm
+LXR5cGU+PGNvbnRyaWJ1dG9ycz48YXV0aG9ycz48YXV0aG9yPldhbiwgQ2hlbmdoYW88L2F1dGhv
+cj48YXV0aG9yPlpoYW5nLCBaaGVuPC9hdXRob3I+PGF1dGhvcj5TYWxtYW4sIEphZDwvYXV0aG9y
+PjxhdXRob3I+S2luZywgSm9uYXRoYW48L2F1dGhvcj48YXV0aG9yPlhpYW8sIFl1emhlPC9hdXRo
+b3I+PGF1dGhvcj5ZdSwgWmhhb25pbmc8L2F1dGhvcj48YXV0aG9yPlNoYWhzYWZpLCBBbGlyZXph
+PC9hdXRob3I+PGF1dGhvcj5XYW1ib2xkLCBSYXltb25kPC9hdXRob3I+PGF1dGhvcj5SYW1hbmF0
+aGFuLCBTaHJpcmFtPC9hdXRob3I+PGF1dGhvcj5LYXRzLCBNaWtoYWlsIEEuPC9hdXRob3I+PC9h
+dXRob3JzPjwvY29udHJpYnV0b3JzPjx0aXRsZXM+PHRpdGxlPlVsdHJhdGhpbiBCcm9hZGJhbmQg
+UmVmbGVjdGl2ZSBPcHRpY2FsIExpbWl0ZXI8L3RpdGxlPjxzZWNvbmRhcnktdGl0bGU+TGFzZXIg
+JmFtcDsgUGhvdG9uaWNzIFJldmlld3M8L3NlY29uZGFyeS10aXRsZT48L3RpdGxlcz48cGVyaW9k
+aWNhbD48ZnVsbC10aXRsZT5MYXNlciAmYW1wOyBQaG90b25pY3MgUmV2aWV3czwvZnVsbC10aXRs
+ZT48L3BlcmlvZGljYWw+PHBhZ2VzPjIxMDAwMDE8L3BhZ2VzPjx2b2x1bWU+MTU8L3ZvbHVtZT48
+bnVtYmVyPjY8L251bWJlcj48ZGF0ZXM+PHllYXI+MjAyMTwveWVhcj48L2RhdGVzPjxpc2JuPjE4
+NjMtODg4MDwvaXNibj48dXJscz48cmVsYXRlZC11cmxzPjx1cmw+aHR0cHM6Ly9vbmxpbmVsaWJy
+YXJ5LndpbGV5LmNvbS9kb2kvYWJzLzEwLjEwMDIvbHBvci4yMDIxMDAwMDE8L3VybD48L3JlbGF0
+ZWQtdXJscz48L3VybHM+PGVsZWN0cm9uaWMtcmVzb3VyY2UtbnVtPmh0dHBzOi8vZG9pLm9yZy8x
+MC4xMDAyL2xwb3IuMjAyMTAwMDAxPC9lbGVjdHJvbmljLXJlc291cmNlLW51bT48L3JlY29yZD48
+L0NpdGU+PC9FbmROb3RlPn==
 </w:fldData>
         </w:fldChar>
       </w:r>
@@ -4431,7 +4473,29 @@
 VVMgMjAxOS8wMDk0NDMwIEExPC9pc2JuPjx3b3JrLXR5cGU+QTE8L3dvcmstdHlwZT48dXJscz48
 cmVsYXRlZC11cmxzPjx1cmw+aHR0cHM6Ly9sZW5zLm9yZy8xNjgtODI5LTQ1Ny0xNDQtMDQ1PC91
 cmw+PC9yZWxhdGVkLXVybHM+PC91cmxzPjxjdXN0b20xPjIwMTcvMDkvMjY8L2N1c3RvbTE+PGN1
-c3RvbTI+MjAxOS8wMy8yODwvY3VzdG9tMj48L3JlY29yZD48L0NpdGU+PC9FbmROb3RlPn==
+c3RvbTI+MjAxOS8wMy8yODwvY3VzdG9tMj48L3JlY29yZD48L0NpdGU+PENpdGU+PEF1dGhvcj5X
+YW48L0F1dGhvcj48WWVhcj4yMDIxPC9ZZWFyPjxSZWNOdW0+MzA8L1JlY051bT48cmVjb3JkPjxy
+ZWMtbnVtYmVyPjMwPC9yZWMtbnVtYmVyPjxmb3JlaWduLWtleXM+PGtleSBhcHA9IkVOIiBkYi1p
+ZD0idjkyMHBmdDA2cnA5ZGJleDJhcDUwMHg5OXg1cnJ0c3d4enNzIiB0aW1lc3RhbXA9IjE3Njgw
+MTc2NjYiIGd1aWQ9ImQ3ODU1OGJiLTMzM2QtNDcwMS1hMjc5LWQzOWI1Y2ZkZWE2MyI+MzA8L2tl
+eT48L2ZvcmVpZ24ta2V5cz48cmVmLXR5cGUgbmFtZT0iSm91cm5hbCBBcnRpY2xlIj4xNzwvcmVm
+LXR5cGU+PGNvbnRyaWJ1dG9ycz48YXV0aG9ycz48YXV0aG9yPldhbiwgQ2hlbmdoYW88L2F1dGhv
+cj48YXV0aG9yPlpoYW5nLCBaaGVuPC9hdXRob3I+PGF1dGhvcj5TYWxtYW4sIEphZDwvYXV0aG9y
+PjxhdXRob3I+S2luZywgSm9uYXRoYW48L2F1dGhvcj48YXV0aG9yPlhpYW8sIFl1emhlPC9hdXRo
+b3I+PGF1dGhvcj5ZdSwgWmhhb25pbmc8L2F1dGhvcj48YXV0aG9yPlNoYWhzYWZpLCBBbGlyZXph
+PC9hdXRob3I+PGF1dGhvcj5XYW1ib2xkLCBSYXltb25kPC9hdXRob3I+PGF1dGhvcj5SYW1hbmF0
+aGFuLCBTaHJpcmFtPC9hdXRob3I+PGF1dGhvcj5LYXRzLCBNaWtoYWlsIEEuPC9hdXRob3I+PC9h
+dXRob3JzPjwvY29udHJpYnV0b3JzPjx0aXRsZXM+PHRpdGxlPlVsdHJhdGhpbiBCcm9hZGJhbmQg
+UmVmbGVjdGl2ZSBPcHRpY2FsIExpbWl0ZXI8L3RpdGxlPjxzZWNvbmRhcnktdGl0bGU+TGFzZXIg
+JmFtcDsgUGhvdG9uaWNzIFJldmlld3M8L3NlY29uZGFyeS10aXRsZT48L3RpdGxlcz48cGVyaW9k
+aWNhbD48ZnVsbC10aXRsZT5MYXNlciAmYW1wOyBQaG90b25pY3MgUmV2aWV3czwvZnVsbC10aXRs
+ZT48L3BlcmlvZGljYWw+PHBhZ2VzPjIxMDAwMDE8L3BhZ2VzPjx2b2x1bWU+MTU8L3ZvbHVtZT48
+bnVtYmVyPjY8L251bWJlcj48ZGF0ZXM+PHllYXI+MjAyMTwveWVhcj48L2RhdGVzPjxpc2JuPjE4
+NjMtODg4MDwvaXNibj48dXJscz48cmVsYXRlZC11cmxzPjx1cmw+aHR0cHM6Ly9vbmxpbmVsaWJy
+YXJ5LndpbGV5LmNvbS9kb2kvYWJzLzEwLjEwMDIvbHBvci4yMDIxMDAwMDE8L3VybD48L3JlbGF0
+ZWQtdXJscz48L3VybHM+PGVsZWN0cm9uaWMtcmVzb3VyY2UtbnVtPmh0dHBzOi8vZG9pLm9yZy8x
+MC4xMDAyL2xwb3IuMjAyMTAwMDAxPC9lbGVjdHJvbmljLXJlc291cmNlLW51bT48L3JlY29yZD48
+L0NpdGU+PC9FbmROb3RlPn==
 </w:fldData>
         </w:fldChar>
       </w:r>
@@ -4460,51 +4524,66 @@
         <w:t xml:space="preserve"> </w:t>
       </w:r>
       <w:r>
-        <w:t xml:space="preserve">An ideal optical limiter should maximize its transmittivity in ON mode and minimize in OFF mode, while minimize the reflectivity and absorptivity in both modes. If it’s self-activating, it should have enough absorption to change its phase. </w:t>
-      </w:r>
-      <w:r>
-        <w:t xml:space="preserve">And since all types of optical limiters only utilize transmission (or absorption), minimizing reflectivity with antireflection </w:t>
+        <w:t xml:space="preserve">An ideal optical limiter should maximize its transmittivity in ON mode and minimize in OFF mode, while minimize the reflectivity and absorptivity </w:t>
+      </w:r>
+      <w:r>
+        <w:t>of</w:t>
+      </w:r>
+      <w:r>
+        <w:t xml:space="preserve"> both modes. If it’s self-activating, it should have</w:t>
+      </w:r>
+      <w:r>
+        <w:t xml:space="preserve"> just</w:t>
+      </w:r>
+      <w:r>
+        <w:t xml:space="preserve"> enough absorption to change its phase</w:t>
+      </w:r>
+      <w:r>
+        <w:t xml:space="preserve"> to minimize transmission loss in the “ON” mode</w:t>
+      </w:r>
+      <w:r>
+        <w:t xml:space="preserve">. </w:t>
+      </w:r>
+      <w:r>
+        <w:t xml:space="preserve">And since all types of optical limiters only utilize transmission </w:t>
+      </w:r>
+      <w:r>
+        <w:t>(and absorption for self-activating type)</w:t>
+      </w:r>
+      <w:r>
+        <w:t xml:space="preserve">, minimizing reflectivity with antireflection </w:t>
       </w:r>
       <w:r>
         <w:t xml:space="preserve">(AR) </w:t>
       </w:r>
       <w:r>
-        <w:t xml:space="preserve">property is ideal. </w:t>
-      </w:r>
-      <w:r>
-        <w:t xml:space="preserve">The designs could be a thin-film planar or a nanostructured metasurface, </w:t>
-      </w:r>
-      <w:r>
-        <w:t>with</w:t>
-      </w:r>
-      <w:r>
-        <w:t xml:space="preserve"> metasurface design</w:t>
-      </w:r>
-      <w:r>
-        <w:t xml:space="preserve">s are </w:t>
-      </w:r>
-      <w:r>
-        <w:t xml:space="preserve">slower, </w:t>
-      </w:r>
-      <w:r>
-        <w:t>more difficult</w:t>
-      </w:r>
-      <w:r>
-        <w:t>,</w:t>
+        <w:t>designs</w:t>
+      </w:r>
+      <w:r>
+        <w:t xml:space="preserve"> is ideal. </w:t>
+      </w:r>
+      <w:r>
+        <w:t>Optical limiter</w:t>
+      </w:r>
+      <w:r>
+        <w:t xml:space="preserve"> designs could be a thin-film planar or a nanostructured metasurface</w:t>
+      </w:r>
+      <w:r>
+        <w:t>; planar designs are easier to optimize for AR condition, where metasurface designs are more difficult and</w:t>
+      </w:r>
+      <w:r>
+        <w:t xml:space="preserve"> expensive </w:t>
+      </w:r>
+      <w:r>
+        <w:t>to fabricate</w:t>
+      </w:r>
+      <w:r>
+        <w:t xml:space="preserve"> but offer more ways to optimize</w:t>
       </w:r>
       <w:r>
         <w:t xml:space="preserve"> </w:t>
       </w:r>
       <w:r>
-        <w:t xml:space="preserve">and more expensive </w:t>
-      </w:r>
-      <w:r>
-        <w:t>to fabricate</w:t>
-      </w:r>
-      <w:r>
-        <w:t xml:space="preserve"> </w:t>
-      </w:r>
-      <w:r>
         <w:fldChar w:fldCharType="begin"/>
       </w:r>
       <w:r>
@@ -4523,31 +4602,22 @@
         <w:fldChar w:fldCharType="end"/>
       </w:r>
       <w:r>
-        <w:t>. A thin-film planar design</w:t>
-      </w:r>
-      <w:r>
-        <w:t xml:space="preserve"> is also easier to design and optimize</w:t>
-      </w:r>
-      <w:r>
         <w:t>.</w:t>
       </w:r>
       <w:r>
-        <w:t xml:space="preserve"> </w:t>
-      </w:r>
-      <w:r>
-        <w:t xml:space="preserve">A thin-film planar design could </w:t>
-      </w:r>
-      <w:r>
-        <w:t>utilize resonant cavity to helps restore resonant</w:t>
-      </w:r>
-      <w:r>
-        <w:t xml:space="preserve"> condition for a complete antireflection</w:t>
-      </w:r>
-      <w:r>
-        <w:t xml:space="preserve"> in materials with high extinction coefficients</w:t>
-      </w:r>
-      <w:r>
-        <w:t xml:space="preserve">, and helps reduce the required thickness of PCM placed inside the two reflectors </w:t>
+        <w:t xml:space="preserve"> In a cases where some layer of planar design has high absorption, resonant for a complete AR condition can be restored by the use of </w:t>
+      </w:r>
+      <w:r>
+        <w:t>resonant cavity</w:t>
+      </w:r>
+      <w:r>
+        <w:t xml:space="preserve">, </w:t>
+      </w:r>
+      <w:r>
+        <w:t>it also</w:t>
+      </w:r>
+      <w:r>
+        <w:t xml:space="preserve"> helps reduce the required thickness of PCM placed inside the two reflectors </w:t>
       </w:r>
       <w:r>
         <w:fldChar w:fldCharType="begin"/>
@@ -4571,7 +4641,10 @@
         <w:t xml:space="preserve">. </w:t>
       </w:r>
       <w:r>
-        <w:t xml:space="preserve">The latter is helpful for optical limiter </w:t>
+        <w:t xml:space="preserve">The reduction in PCM thickness </w:t>
+      </w:r>
+      <w:r>
+        <w:t xml:space="preserve">is helpful for optical limiter </w:t>
       </w:r>
       <w:r>
         <w:t>because a thinner PCM required less energy for phase transition, which is especially beneficial for non-volatile PCMs since their T</w:t>
@@ -5492,7 +5565,11 @@
         <w:t xml:space="preserve">spectrum </w:t>
       </w:r>
       <w:r>
-        <w:t xml:space="preserve">and rapidly falls to zero above ~900 nm. </w:t>
+        <w:t xml:space="preserve">and rapidly falls to zero </w:t>
+      </w:r>
+      <w:r>
+        <w:lastRenderedPageBreak/>
+        <w:t xml:space="preserve">above ~900 nm. </w:t>
       </w:r>
       <w:r>
         <w:t>So, t</w:t>
@@ -5540,11 +5617,7 @@
         <w:t xml:space="preserve"> IR spectra</w:t>
       </w:r>
       <w:r>
-        <w:t xml:space="preserve">, </w:t>
-      </w:r>
-      <w:r>
-        <w:lastRenderedPageBreak/>
-        <w:t xml:space="preserve">and extinction coefficients is very large in the near-UV but falls to zero </w:t>
+        <w:t xml:space="preserve">, and extinction coefficients is very large in the near-UV but falls to zero </w:t>
       </w:r>
       <w:r>
         <w:t>around</w:t>
@@ -5697,25 +5770,7 @@
         <w:fldChar w:fldCharType="end"/>
       </w:r>
       <w:r>
-        <w:t xml:space="preserve">. </w:t>
-      </w:r>
-      <w:r>
-        <w:rPr>
-          <w:highlight w:val="cyan"/>
-        </w:rPr>
-        <w:t>(without permission</w:t>
-      </w:r>
-      <w:r>
-        <w:rPr>
-          <w:highlight w:val="cyan"/>
-        </w:rPr>
-        <w:t>, need one?</w:t>
-      </w:r>
-      <w:r>
-        <w:rPr>
-          <w:highlight w:val="cyan"/>
-        </w:rPr>
-        <w:t>)</w:t>
+        <w:t>.</w:t>
       </w:r>
     </w:p>
     <w:p/>
@@ -6048,31 +6103,7 @@
           <w:rPr>
             <w:rFonts w:ascii="Cambria Math" w:hAnsi="Cambria Math"/>
           </w:rPr>
-          <m:t>OT</m:t>
-        </m:r>
-        <m:r>
-          <w:rPr>
-            <w:rFonts w:ascii="Cambria Math" w:hAnsi="Cambria Math"/>
-          </w:rPr>
-          <m:t>(λ)</m:t>
-        </m:r>
-        <m:r>
-          <w:rPr>
-            <w:rFonts w:ascii="Cambria Math" w:hAnsi="Cambria Math"/>
-          </w:rPr>
-          <m:t>=n</m:t>
-        </m:r>
-        <m:r>
-          <w:rPr>
-            <w:rFonts w:ascii="Cambria Math" w:hAnsi="Cambria Math"/>
-          </w:rPr>
-          <m:t>(λ)</m:t>
-        </m:r>
-        <m:r>
-          <w:rPr>
-            <w:rFonts w:ascii="Cambria Math" w:hAnsi="Cambria Math"/>
-          </w:rPr>
-          <m:t>t</m:t>
+          <m:t>OT(λ)=n(λ)t</m:t>
         </m:r>
       </m:oMath>
       <w:r>
@@ -8038,9 +8069,17 @@
       </w:r>
       <w:r>
         <w:rPr>
+          <w:i/>
+          <w:iCs/>
           <w:lang w:val="en-US"/>
         </w:rPr>
-        <w:t xml:space="preserve"> with </w:t>
+        <w:t xml:space="preserve"> </w:t>
+      </w:r>
+      <w:r>
+        <w:rPr>
+          <w:lang w:val="en-US"/>
+        </w:rPr>
+        <w:t xml:space="preserve">with </w:t>
       </w:r>
       <w:r>
         <w:rPr>
@@ -8498,17 +8537,7 @@
           <w:vertAlign w:val="superscript"/>
           <w:lang w:val="en-US"/>
         </w:rPr>
-        <w:t>π</w:t>
-      </w:r>
-      <w:r>
-        <w:rPr>
-          <w:i/>
-          <w:iCs/>
-          <w:highlight w:val="yellow"/>
-          <w:vertAlign w:val="superscript"/>
-          <w:lang w:val="en-US"/>
-        </w:rPr>
-        <w:t xml:space="preserve"> </w:t>
+        <w:t xml:space="preserve">π </w:t>
       </w:r>
       <w:r>
         <w:rPr>
@@ -9156,10 +9185,20 @@
         <w:rPr>
           <w:lang w:val="en-US"/>
         </w:rPr>
-        <w:t>Antireflection condition occurs when n</w:t>
-      </w:r>
-      <w:r>
-        <w:rPr>
+        <w:t xml:space="preserve">Antireflection condition occurs when </w:t>
+      </w:r>
+      <w:r>
+        <w:rPr>
+          <w:i/>
+          <w:iCs/>
+          <w:lang w:val="en-US"/>
+        </w:rPr>
+        <w:t>n</w:t>
+      </w:r>
+      <w:r>
+        <w:rPr>
+          <w:i/>
+          <w:iCs/>
           <w:vertAlign w:val="subscript"/>
           <w:lang w:val="en-US"/>
         </w:rPr>
@@ -9169,10 +9208,20 @@
         <w:rPr>
           <w:lang w:val="en-US"/>
         </w:rPr>
-        <w:t xml:space="preserve"> = n</w:t>
-      </w:r>
-      <w:r>
-        <w:rPr>
+        <w:t xml:space="preserve"> = </w:t>
+      </w:r>
+      <w:r>
+        <w:rPr>
+          <w:i/>
+          <w:iCs/>
+          <w:lang w:val="en-US"/>
+        </w:rPr>
+        <w:t>n</w:t>
+      </w:r>
+      <w:r>
+        <w:rPr>
+          <w:i/>
+          <w:iCs/>
           <w:vertAlign w:val="subscript"/>
           <w:lang w:val="en-US"/>
         </w:rPr>
@@ -11835,6 +11884,11 @@
         <w:rPr>
           <w:lang w:bidi="th-TH"/>
         </w:rPr>
+      </w:r>
+      <w:r>
+        <w:rPr>
+          <w:lang w:bidi="th-TH"/>
+        </w:rPr>
         <w:fldChar w:fldCharType="separate"/>
       </w:r>
       <w:r>
@@ -12201,12 +12255,6 @@
         <w:rPr>
           <w:lang w:bidi="th-TH"/>
         </w:rPr>
-        <w:tab/>
-      </w:r>
-      <w:r>
-        <w:rPr>
-          <w:lang w:bidi="th-TH"/>
-        </w:rPr>
         <w:t>A t</w:t>
       </w:r>
       <w:r>
@@ -12462,31 +12510,7 @@
         <w:rPr>
           <w:lang w:bidi="th-TH"/>
         </w:rPr>
-        <w:t>.</w:t>
-      </w:r>
-      <w:r>
-        <w:rPr>
-          <w:lang w:bidi="th-TH"/>
-        </w:rPr>
-        <w:t xml:space="preserve"> </w:t>
-      </w:r>
-      <w:r>
-        <w:rPr>
-          <w:lang w:bidi="th-TH"/>
-        </w:rPr>
-        <w:t xml:space="preserve">A detailed </w:t>
-      </w:r>
-      <w:r>
-        <w:rPr>
-          <w:lang w:bidi="th-TH"/>
-        </w:rPr>
-        <w:t>explanation</w:t>
-      </w:r>
-      <w:r>
-        <w:rPr>
-          <w:lang w:bidi="th-TH"/>
-        </w:rPr>
-        <w:t xml:space="preserve"> </w:t>
+        <w:t xml:space="preserve">. A detailed explanation </w:t>
       </w:r>
       <w:r>
         <w:rPr>
@@ -13961,6 +13985,9 @@
         <w:jc w:val="left"/>
       </w:pPr>
       <w:r>
+        <w:tab/>
+      </w:r>
+      <w:r>
         <w:t xml:space="preserve">A three-layer antireflection </w:t>
       </w:r>
       <w:r>
@@ -14185,6 +14212,9 @@
     </w:p>
     <w:p>
       <w:r>
+        <w:tab/>
+      </w:r>
+      <w:r>
         <w:t xml:space="preserve">This requirement is </w:t>
       </w:r>
       <w:r>
@@ -14264,10 +14294,7 @@
         <w:t xml:space="preserve">main benefit of a three-layer Q/H/Q design is the </w:t>
       </w:r>
       <w:r>
-        <w:t xml:space="preserve">middle layer </w:t>
-      </w:r>
-      <w:r>
-        <w:t>(</w:t>
+        <w:t>middle layer (</w:t>
       </w:r>
       <w:r>
         <w:rPr>
@@ -14285,10 +14312,7 @@
         <w:t>f2</w:t>
       </w:r>
       <w:r>
-        <w:t>)</w:t>
-      </w:r>
-      <w:r>
-        <w:t xml:space="preserve"> contributes to </w:t>
+        <w:t xml:space="preserve">) contributes to </w:t>
       </w:r>
       <w:r>
         <w:t>a broader</w:t>
@@ -14612,6 +14636,9 @@
     <w:p>
       <w:r>
         <w:tab/>
+      </w:r>
+      <w:r>
+        <w:t>XXX</w:t>
       </w:r>
     </w:p>
     <w:p>
@@ -15594,9 +15621,6 @@
     <w:p/>
     <w:p/>
     <w:p/>
-    <w:p/>
-    <w:p/>
-    <w:p/>
     <w:p>
       <w:pPr>
         <w:rPr>
@@ -15607,6 +15631,7 @@
         <w:rPr>
           <w:highlight w:val="cyan"/>
         </w:rPr>
+        <w:lastRenderedPageBreak/>
         <w:t>Note:</w:t>
       </w:r>
     </w:p>
@@ -15620,11 +15645,14 @@
         <w:rPr>
           <w:highlight w:val="cyan"/>
         </w:rPr>
-        <w:t xml:space="preserve">1064: </w:t>
+        <w:t>1550:</w:t>
       </w:r>
     </w:p>
     <w:p>
       <w:r>
+        <w:rPr>
+          <w:highlight w:val="cyan"/>
+        </w:rPr>
         <w:tab/>
       </w:r>
       <w:r>
@@ -15632,9 +15660,34 @@
       </w:r>
       <w:r>
         <w:tab/>
-      </w:r>
-      <w:r>
-        <w:t>1.3777</w:t>
+        <w:t>1.</w:t>
+      </w:r>
+      <w:r>
+        <w:t>3746</w:t>
+      </w:r>
+      <w:r>
+        <w:tab/>
+      </w:r>
+      <w:r>
+        <w:tab/>
+      </w:r>
+      <w:r>
+        <w:fldChar w:fldCharType="begin"/>
+      </w:r>
+      <w:r>
+        <w:instrText xml:space="preserve"> ADDIN EN.CITE &lt;EndNote&gt;&lt;Cite&gt;&lt;Author&gt;Franta&lt;/Author&gt;&lt;Year&gt;2017&lt;/Year&gt;&lt;RecNum&gt;87&lt;/RecNum&gt;&lt;DisplayText&gt;[41]&lt;/DisplayText&gt;&lt;record&gt;&lt;rec-number&gt;87&lt;/rec-number&gt;&lt;foreign-keys&gt;&lt;key app="EN" db-id="v920pft06rp9dbex2ap500x99x5rrtswxzss" timestamp="1774444072"&gt;87&lt;/key&gt;&lt;/foreign-keys&gt;&lt;ref-type name="Journal Article"&gt;17&lt;/ref-type&gt;&lt;contributors&gt;&lt;authors&gt;&lt;author&gt;Franta, Daniel&lt;/author&gt;&lt;author&gt;Nečas, David&lt;/author&gt;&lt;author&gt;Giglia, Angelo&lt;/author&gt;&lt;author&gt;Franta, Pavel&lt;/author&gt;&lt;author&gt;Ohlídal, Ivan&lt;/author&gt;&lt;/authors&gt;&lt;/contributors&gt;&lt;titles&gt;&lt;title&gt;Universal dispersion model for characterization of optical thin films over wide spectral range: Application to magnesium fluoride&lt;/title&gt;&lt;secondary-title&gt;Applied Surface Science&lt;/secondary-title&gt;&lt;/titles&gt;&lt;periodical&gt;&lt;full-title&gt;Applied Surface Science&lt;/full-title&gt;&lt;/periodical&gt;&lt;pages&gt;424-429&lt;/pages&gt;&lt;volume&gt;421&lt;/volume&gt;&lt;keywords&gt;&lt;keyword&gt;Optical constants&lt;/keyword&gt;&lt;keyword&gt;Ellipsometry&lt;/keyword&gt;&lt;keyword&gt;Spectrophotometry&lt;/keyword&gt;&lt;keyword&gt;Sum rule&lt;/keyword&gt;&lt;/keywords&gt;&lt;dates&gt;&lt;year&gt;2017&lt;/year&gt;&lt;pub-dates&gt;&lt;date&gt;2017/11/01/&lt;/date&gt;&lt;/pub-dates&gt;&lt;/dates&gt;&lt;isbn&gt;0169-4332&lt;/isbn&gt;&lt;urls&gt;&lt;related-urls&gt;&lt;url&gt;https://www.sciencedirect.com/science/article/pii/S016943321632030X&lt;/url&gt;&lt;/related-urls&gt;&lt;/urls&gt;&lt;electronic-resource-num&gt;https://doi.org/10.1016/j.apsusc.2016.09.149&lt;/electronic-resource-num&gt;&lt;/record&gt;&lt;/Cite&gt;&lt;/EndNote&gt;</w:instrText>
+      </w:r>
+      <w:r>
+        <w:fldChar w:fldCharType="separate"/>
+      </w:r>
+      <w:r>
+        <w:rPr>
+          <w:noProof/>
+        </w:rPr>
+        <w:t>[41]</w:t>
+      </w:r>
+      <w:r>
+        <w:fldChar w:fldCharType="end"/>
       </w:r>
     </w:p>
     <w:p>
@@ -15660,10 +15713,34 @@
         <w:tab/>
       </w:r>
       <w:r>
-        <w:t>1.467</w:t>
-      </w:r>
-      <w:r>
-        <w:t>1</w:t>
+        <w:t>1.</w:t>
+      </w:r>
+      <w:r>
+        <w:t>4443</w:t>
+      </w:r>
+      <w:r>
+        <w:tab/>
+      </w:r>
+      <w:r>
+        <w:tab/>
+      </w:r>
+      <w:r>
+        <w:fldChar w:fldCharType="begin"/>
+      </w:r>
+      <w:r>
+        <w:instrText xml:space="preserve"> ADDIN EN.CITE &lt;EndNote&gt;&lt;Cite&gt;&lt;Author&gt;Franta&lt;/Author&gt;&lt;Year&gt;2016&lt;/Year&gt;&lt;RecNum&gt;97&lt;/RecNum&gt;&lt;DisplayText&gt;[42]&lt;/DisplayText&gt;&lt;record&gt;&lt;rec-number&gt;97&lt;/rec-number&gt;&lt;foreign-keys&gt;&lt;key app="EN" db-id="v920pft06rp9dbex2ap500x99x5rrtswxzss" timestamp="1776660410"&gt;97&lt;/key&gt;&lt;/foreign-keys&gt;&lt;ref-type name="Book"&gt;6&lt;/ref-type&gt;&lt;contributors&gt;&lt;authors&gt;&lt;author&gt;Franta, Daniel&lt;/author&gt;&lt;author&gt;Nečas, David&lt;/author&gt;&lt;author&gt;Ohlídal, Ivan&lt;/author&gt;&lt;author&gt;Giglia, Angelo&lt;/author&gt;&lt;/authors&gt;&lt;/contributors&gt;&lt;titles&gt;&lt;title&gt;Optical characterization of SiO2 thin films using universal dispersion model over wide spectral range&lt;/title&gt;&lt;secondary-title&gt;SPIE Photonics Europe&lt;/secondary-title&gt;&lt;/titles&gt;&lt;volume&gt;9890&lt;/volume&gt;&lt;section&gt;EPE&lt;/section&gt;&lt;dates&gt;&lt;year&gt;2016&lt;/year&gt;&lt;/dates&gt;&lt;publisher&gt;SPIE&lt;/publisher&gt;&lt;urls&gt;&lt;related-urls&gt;&lt;url&gt;https://doi.org/10.1117/12.2227580&lt;/url&gt;&lt;/related-urls&gt;&lt;/urls&gt;&lt;/record&gt;&lt;/Cite&gt;&lt;/EndNote&gt;</w:instrText>
+      </w:r>
+      <w:r>
+        <w:fldChar w:fldCharType="separate"/>
+      </w:r>
+      <w:r>
+        <w:rPr>
+          <w:noProof/>
+        </w:rPr>
+        <w:t>[42]</w:t>
+      </w:r>
+      <w:r>
+        <w:fldChar w:fldCharType="end"/>
       </w:r>
     </w:p>
     <w:p>
@@ -15683,10 +15760,10 @@
         <w:tab/>
       </w:r>
       <w:r>
-        <w:t>1.6</w:t>
-      </w:r>
-      <w:r>
-        <w:t>165+0i</w:t>
+        <w:t>1.6141</w:t>
+      </w:r>
+      <w:r>
+        <w:tab/>
       </w:r>
       <w:r>
         <w:tab/>
@@ -15727,13 +15804,10 @@
         <w:tab/>
       </w:r>
       <w:r>
-        <w:t>1.996</w:t>
-      </w:r>
-      <w:r>
-        <w:t>6</w:t>
-      </w:r>
-      <w:r>
-        <w:t>+0i</w:t>
+        <w:t>1.9904</w:t>
+      </w:r>
+      <w:r>
+        <w:tab/>
       </w:r>
       <w:r>
         <w:tab/>
@@ -15771,10 +15845,7 @@
         <w:tab/>
       </w:r>
       <w:r>
-        <w:t>2.30</w:t>
-      </w:r>
-      <w:r>
-        <w:t>97</w:t>
+        <w:t>2.2899</w:t>
       </w:r>
       <w:r>
         <w:tab/>
@@ -15799,26 +15870,6 @@
       </w:r>
       <w:r>
         <w:fldChar w:fldCharType="end"/>
-      </w:r>
-    </w:p>
-    <w:p>
-      <w:r>
-        <w:tab/>
-      </w:r>
-      <w:r>
-        <w:t>*</w:t>
-      </w:r>
-      <w:r>
-        <w:t>ZrO2</w:t>
-      </w:r>
-      <w:r>
-        <w:t>:</w:t>
-      </w:r>
-      <w:r>
-        <w:tab/>
-      </w:r>
-      <w:r>
-        <w:t>2.4680</w:t>
       </w:r>
     </w:p>
     <w:p>
@@ -15828,12 +15879,15 @@
         </w:rPr>
       </w:pPr>
       <w:r>
-        <w:tab/>
-      </w:r>
-      <w:r>
         <w:rPr>
           <w:highlight w:val="yellow"/>
         </w:rPr>
+        <w:tab/>
+      </w:r>
+      <w:r>
+        <w:rPr>
+          <w:highlight w:val="yellow"/>
+        </w:rPr>
         <w:t>Sb2Se3:</w:t>
       </w:r>
       <w:r>
@@ -15841,29 +15895,97 @@
           <w:highlight w:val="yellow"/>
         </w:rPr>
         <w:tab/>
-        <w:t>3.</w:t>
       </w:r>
       <w:r>
         <w:rPr>
           <w:highlight w:val="yellow"/>
         </w:rPr>
-        <w:t>369674</w:t>
+        <w:t>3.2854 (4.0499)</w:t>
       </w:r>
       <w:r>
         <w:rPr>
           <w:highlight w:val="yellow"/>
         </w:rPr>
-        <w:t>+0i (4.3081+0.009744i)</w:t>
+        <w:tab/>
+      </w:r>
+      <w:r>
+        <w:rPr>
+          <w:highlight w:val="yellow"/>
+        </w:rPr>
+        <w:fldChar w:fldCharType="begin"/>
+      </w:r>
+      <w:r>
+        <w:rPr>
+          <w:highlight w:val="yellow"/>
+        </w:rPr>
+        <w:instrText xml:space="preserve"> ADDIN EN.CITE &lt;EndNote&gt;&lt;Cite&gt;&lt;Author&gt;Delaney&lt;/Author&gt;&lt;Year&gt;2020&lt;/Year&gt;&lt;RecNum&gt;64&lt;/RecNum&gt;&lt;DisplayText&gt;[18]&lt;/DisplayText&gt;&lt;record&gt;&lt;rec-number&gt;64&lt;/rec-number&gt;&lt;foreign-keys&gt;&lt;key app="EN" db-id="v920pft06rp9dbex2ap500x99x5rrtswxzss" timestamp="1768054090" guid="b15b5550-40d7-4ad2-8182-cf6f486a4f50"&gt;64&lt;/key&gt;&lt;/foreign-keys&gt;&lt;ref-type name="Journal Article"&gt;17&lt;/ref-type&gt;&lt;contributors&gt;&lt;authors&gt;&lt;author&gt;Delaney, Matthew&lt;/author&gt;&lt;author&gt;Zeimpekis, Ioannis&lt;/author&gt;&lt;author&gt;Lawson, Daniel&lt;/author&gt;&lt;author&gt;Hewak, Daniel W</w:instrText>
+      </w:r>
+      <w:r>
+        <w:rPr>
+          <w:rFonts w:hint="eastAsia"/>
+          <w:highlight w:val="yellow"/>
+        </w:rPr>
+        <w:instrText>.&lt;/author&gt;&lt;author&gt;Muskens, Otto L.&lt;/author&gt;&lt;/authors&gt;&lt;/contributors&gt;&lt;titles&gt;&lt;title&gt;A New Family of Ultralow Loss Reversible Phase</w:instrText>
+      </w:r>
+      <w:r>
+        <w:rPr>
+          <w:rFonts w:hint="eastAsia"/>
+          <w:highlight w:val="yellow"/>
+        </w:rPr>
+        <w:instrText>‐</w:instrText>
+      </w:r>
+      <w:r>
+        <w:rPr>
+          <w:rFonts w:hint="eastAsia"/>
+          <w:highlight w:val="yellow"/>
+        </w:rPr>
+        <w:instrText>Change Materials for Photonic Integrated Circuits: Sb2S3 and Sb2Se3&lt;/title&gt;&lt;secondary-title&gt;Advanced Functional Materials&lt;/se</w:instrText>
+      </w:r>
+      <w:r>
+        <w:rPr>
+          <w:highlight w:val="yellow"/>
+        </w:rPr>
+        <w:instrText>condary-title&gt;&lt;/titles&gt;&lt;periodical&gt;&lt;full-title&gt;Advanced Functional Materials&lt;/full-title&gt;&lt;/periodical&gt;&lt;volume&gt;30&lt;/volume&gt;&lt;number&gt;36&lt;/number&gt;&lt;dates&gt;&lt;year&gt;2020&lt;/year&gt;&lt;/dates&gt;&lt;isbn&gt;1616-301X&amp;#xD;1616-3028&lt;/isbn&gt;&lt;urls&gt;&lt;/urls&gt;&lt;electronic-resource-num&gt;10.1002/adfm.202002447&lt;/electronic-resource-num&gt;&lt;/record&gt;&lt;/Cite&gt;&lt;/EndNote&gt;</w:instrText>
+      </w:r>
+      <w:r>
+        <w:rPr>
+          <w:highlight w:val="yellow"/>
+        </w:rPr>
+        <w:fldChar w:fldCharType="separate"/>
+      </w:r>
+      <w:r>
+        <w:rPr>
+          <w:noProof/>
+          <w:highlight w:val="yellow"/>
+        </w:rPr>
+        <w:t>[18]</w:t>
+      </w:r>
+      <w:r>
+        <w:rPr>
+          <w:highlight w:val="yellow"/>
+        </w:rPr>
+        <w:fldChar w:fldCharType="end"/>
       </w:r>
     </w:p>
     <w:p>
       <w:r>
         <w:tab/>
-        <w:t>Si:</w:t>
-      </w:r>
-      <w:r>
-        <w:tab/>
-        <w:t>3.9017</w:t>
+        <w:t>Si</w:t>
+      </w:r>
+      <w:r>
+        <w:t>_</w:t>
+      </w:r>
+      <w:r>
+        <w:t>300</w:t>
+      </w:r>
+      <w:r>
+        <w:t>:</w:t>
+      </w:r>
+      <w:r>
+        <w:tab/>
+      </w:r>
+      <w:r>
+        <w:t>3.4795</w:t>
       </w:r>
       <w:r>
         <w:tab/>
@@ -15875,7 +15997,7 @@
         <w:fldChar w:fldCharType="begin"/>
       </w:r>
       <w:r>
-        <w:instrText xml:space="preserve"> ADDIN EN.CITE &lt;EndNote&gt;&lt;Cite&gt;&lt;Author&gt;Karaman&lt;/Author&gt;&lt;Year&gt;2025&lt;/Year&gt;&lt;RecNum&gt;94&lt;/RecNum&gt;&lt;DisplayText&gt;[41]&lt;/DisplayText&gt;&lt;record&gt;&lt;rec-number&gt;94&lt;/rec-number&gt;&lt;foreign-keys&gt;&lt;key app="EN" db-id="v920pft06rp9dbex2ap500x99x5rrtswxzss" timestamp="1776336380"&gt;94&lt;/key&gt;&lt;/foreign-keys&gt;&lt;ref-type name="Journal Article"&gt;17&lt;/ref-type&gt;&lt;contributors&gt;&lt;authors&gt;&lt;author&gt;Karaman, Omer Can&lt;/author&gt;&lt;author&gt;Naidu, Gopal Narmada&lt;/author&gt;&lt;author&gt;Bowman, Alan R.&lt;/author&gt;&lt;author&gt;Dayi, Elif Nur&lt;/author&gt;&lt;author&gt;Tagliabue, Giulia&lt;/author&gt;&lt;/authors&gt;&lt;/contributors&gt;&lt;titles&gt;&lt;title&gt;Decoupling Optical and Thermal Dynamics in Dielectric Metasurfaces for Self-Encoded Photonic Control&lt;/title&gt;&lt;secondary-title&gt;Laser &amp;amp; Photonics Reviews&lt;/secondary-title&gt;&lt;/titles&gt;&lt;periodical&gt;&lt;full-title&gt;Laser &amp;amp; Photonics Reviews&lt;/full-title&gt;&lt;/periodical&gt;&lt;pages&gt;e01014&lt;/pages&gt;&lt;volume&gt;19&lt;/volume&gt;&lt;number&gt;24&lt;/number&gt;&lt;dates&gt;&lt;year&gt;2025&lt;/year&gt;&lt;/dates&gt;&lt;isbn&gt;1863-8880&lt;/isbn&gt;&lt;urls&gt;&lt;related-urls&gt;&lt;url&gt;https://onlinelibrary.wiley.com/doi/abs/10.1002/lpor.202501014&lt;/url&gt;&lt;/related-urls&gt;&lt;/urls&gt;&lt;electronic-resource-num&gt;https://doi.org/10.1002/lpor.202501014&lt;/electronic-resource-num&gt;&lt;/record&gt;&lt;/Cite&gt;&lt;/EndNote&gt;</w:instrText>
+        <w:instrText xml:space="preserve"> ADDIN EN.CITE &lt;EndNote&gt;&lt;Cite&gt;&lt;Author&gt;Franta&lt;/Author&gt;&lt;Year&gt;2018&lt;/Year&gt;&lt;RecNum&gt;95&lt;/RecNum&gt;&lt;DisplayText&gt;[43]&lt;/DisplayText&gt;&lt;record&gt;&lt;rec-number&gt;95&lt;/rec-number&gt;&lt;foreign-keys&gt;&lt;key app="EN" db-id="v920pft06rp9dbex2ap500x99x5rrtswxzss" timestamp="1776659453"&gt;95&lt;/key&gt;&lt;/foreign-keys&gt;&lt;ref-type name="Journal Article"&gt;17&lt;/ref-type&gt;&lt;contributors&gt;&lt;authors&gt;&lt;author&gt;Franta, Daniel&lt;/author&gt;&lt;author&gt;Franta, Pavel&lt;/author&gt;&lt;author&gt;Vohánka, Jiří&lt;/author&gt;&lt;author&gt;Čermák, Martin&lt;/author&gt;&lt;author&gt;Ohlídal, Ivan&lt;/author&gt;&lt;/authors&gt;&lt;/contributors&gt;&lt;titles&gt;&lt;title&gt;Determination of thicknesses and temperatures of crystalline silicon wafers from optical measurements in the far infrared region&lt;/title&gt;&lt;secondary-title&gt;Journal of Applied Physics&lt;/secondary-title&gt;&lt;/titles&gt;&lt;periodical&gt;&lt;full-title&gt;Journal of Applied Physics&lt;/full-title&gt;&lt;/periodical&gt;&lt;volume&gt;123&lt;/volume&gt;&lt;number&gt;18&lt;/number&gt;&lt;dates&gt;&lt;year&gt;2018&lt;/year&gt;&lt;/dates&gt;&lt;isbn&gt;0021-8979&lt;/isbn&gt;&lt;urls&gt;&lt;related-urls&gt;&lt;url&gt;https://doi.org/10.1063/1.5026195&lt;/url&gt;&lt;/related-urls&gt;&lt;/urls&gt;&lt;custom1&gt;185707&lt;/custom1&gt;&lt;electronic-resource-num&gt;10.1063/1.5026195&lt;/electronic-resource-num&gt;&lt;access-date&gt;4/20/2026&lt;/access-date&gt;&lt;/record&gt;&lt;/Cite&gt;&lt;/EndNote&gt;</w:instrText>
       </w:r>
       <w:r>
         <w:fldChar w:fldCharType="separate"/>
@@ -15884,7 +16006,397 @@
         <w:rPr>
           <w:noProof/>
         </w:rPr>
+        <w:t>[43]</w:t>
+      </w:r>
+      <w:r>
+        <w:fldChar w:fldCharType="end"/>
+      </w:r>
+    </w:p>
+    <w:p>
+      <w:pPr>
+        <w:rPr>
+          <w:highlight w:val="cyan"/>
+        </w:rPr>
+      </w:pPr>
+    </w:p>
+    <w:p>
+      <w:pPr>
+        <w:rPr>
+          <w:highlight w:val="cyan"/>
+        </w:rPr>
+      </w:pPr>
+      <w:r>
+        <w:rPr>
+          <w:highlight w:val="cyan"/>
+        </w:rPr>
+        <w:t xml:space="preserve">1064: </w:t>
+      </w:r>
+    </w:p>
+    <w:p>
+      <w:r>
+        <w:tab/>
+      </w:r>
+      <w:r>
+        <w:t>MgF2:</w:t>
+      </w:r>
+      <w:r>
+        <w:tab/>
+      </w:r>
+      <w:r>
+        <w:t>1.3777</w:t>
+      </w:r>
+      <w:r>
+        <w:tab/>
+      </w:r>
+      <w:r>
+        <w:tab/>
+      </w:r>
+      <w:r>
+        <w:fldChar w:fldCharType="begin"/>
+      </w:r>
+      <w:r>
+        <w:instrText xml:space="preserve"> ADDIN EN.CITE &lt;EndNote&gt;&lt;Cite&gt;&lt;Author&gt;Franta&lt;/Author&gt;&lt;Year&gt;2017&lt;/Year&gt;&lt;RecNum&gt;87&lt;/RecNum&gt;&lt;DisplayText&gt;[41]&lt;/DisplayText&gt;&lt;record&gt;&lt;rec-number&gt;87&lt;/rec-number&gt;&lt;foreign-keys&gt;&lt;key app="EN" db-id="v920pft06rp9dbex2ap500x99x5rrtswxzss" timestamp="1774444072"&gt;87&lt;/key&gt;&lt;/foreign-keys&gt;&lt;ref-type name="Journal Article"&gt;17&lt;/ref-type&gt;&lt;contributors&gt;&lt;authors&gt;&lt;author&gt;Franta, Daniel&lt;/author&gt;&lt;author&gt;Nečas, David&lt;/author&gt;&lt;author&gt;Giglia, Angelo&lt;/author&gt;&lt;author&gt;Franta, Pavel&lt;/author&gt;&lt;author&gt;Ohlídal, Ivan&lt;/author&gt;&lt;/authors&gt;&lt;/contributors&gt;&lt;titles&gt;&lt;title&gt;Universal dispersion model for characterization of optical thin films over wide spectral range: Application to magnesium fluoride&lt;/title&gt;&lt;secondary-title&gt;Applied Surface Science&lt;/secondary-title&gt;&lt;/titles&gt;&lt;periodical&gt;&lt;full-title&gt;Applied Surface Science&lt;/full-title&gt;&lt;/periodical&gt;&lt;pages&gt;424-429&lt;/pages&gt;&lt;volume&gt;421&lt;/volume&gt;&lt;keywords&gt;&lt;keyword&gt;Optical constants&lt;/keyword&gt;&lt;keyword&gt;Ellipsometry&lt;/keyword&gt;&lt;keyword&gt;Spectrophotometry&lt;/keyword&gt;&lt;keyword&gt;Sum rule&lt;/keyword&gt;&lt;/keywords&gt;&lt;dates&gt;&lt;year&gt;2017&lt;/year&gt;&lt;pub-dates&gt;&lt;date&gt;2017/11/01/&lt;/date&gt;&lt;/pub-dates&gt;&lt;/dates&gt;&lt;isbn&gt;0169-4332&lt;/isbn&gt;&lt;urls&gt;&lt;related-urls&gt;&lt;url&gt;https://www.sciencedirect.com/science/article/pii/S016943321632030X&lt;/url&gt;&lt;/related-urls&gt;&lt;/urls&gt;&lt;electronic-resource-num&gt;https://doi.org/10.1016/j.apsusc.2016.09.149&lt;/electronic-resource-num&gt;&lt;/record&gt;&lt;/Cite&gt;&lt;/EndNote&gt;</w:instrText>
+      </w:r>
+      <w:r>
+        <w:fldChar w:fldCharType="separate"/>
+      </w:r>
+      <w:r>
+        <w:rPr>
+          <w:noProof/>
+        </w:rPr>
         <w:t>[41]</w:t>
+      </w:r>
+      <w:r>
+        <w:fldChar w:fldCharType="end"/>
+      </w:r>
+    </w:p>
+    <w:p>
+      <w:r>
+        <w:tab/>
+      </w:r>
+      <w:r>
+        <w:t>SiO</w:t>
+      </w:r>
+      <w:r>
+        <w:rPr>
+          <w:vertAlign w:val="subscript"/>
+        </w:rPr>
+        <w:t>2</w:t>
+      </w:r>
+      <w:r>
+        <w:t>:</w:t>
+      </w:r>
+      <w:r>
+        <w:t xml:space="preserve"> </w:t>
+      </w:r>
+      <w:r>
+        <w:tab/>
+      </w:r>
+      <w:r>
+        <w:t>1.467</w:t>
+      </w:r>
+      <w:r>
+        <w:t>1</w:t>
+      </w:r>
+      <w:r>
+        <w:tab/>
+      </w:r>
+      <w:r>
+        <w:tab/>
+      </w:r>
+      <w:r>
+        <w:fldChar w:fldCharType="begin"/>
+      </w:r>
+      <w:r>
+        <w:instrText xml:space="preserve"> ADDIN EN.CITE &lt;EndNote&gt;&lt;Cite&gt;&lt;Author&gt;Franta&lt;/Author&gt;&lt;Year&gt;2016&lt;/Year&gt;&lt;RecNum&gt;97&lt;/RecNum&gt;&lt;DisplayText&gt;[42]&lt;/DisplayText&gt;&lt;record&gt;&lt;rec-number&gt;97&lt;/rec-number&gt;&lt;foreign-keys&gt;&lt;key app="EN" db-id="v920pft06rp9dbex2ap500x99x5rrtswxzss" timestamp="1776660410"&gt;97&lt;/key&gt;&lt;/foreign-keys&gt;&lt;ref-type name="Book"&gt;6&lt;/ref-type&gt;&lt;contributors&gt;&lt;authors&gt;&lt;author&gt;Franta, Daniel&lt;/author&gt;&lt;author&gt;Nečas, David&lt;/author&gt;&lt;author&gt;Ohlídal, Ivan&lt;/author&gt;&lt;author&gt;Giglia, Angelo&lt;/author&gt;&lt;/authors&gt;&lt;/contributors&gt;&lt;titles&gt;&lt;title&gt;Optical characterization of SiO2 thin films using universal dispersion model over wide spectral range&lt;/title&gt;&lt;secondary-title&gt;SPIE Photonics Europe&lt;/secondary-title&gt;&lt;/titles&gt;&lt;volume&gt;9890&lt;/volume&gt;&lt;section&gt;EPE&lt;/section&gt;&lt;dates&gt;&lt;year&gt;2016&lt;/year&gt;&lt;/dates&gt;&lt;publisher&gt;SPIE&lt;/publisher&gt;&lt;urls&gt;&lt;related-urls&gt;&lt;url&gt;https://doi.org/10.1117/12.2227580&lt;/url&gt;&lt;/related-urls&gt;&lt;/urls&gt;&lt;/record&gt;&lt;/Cite&gt;&lt;/EndNote&gt;</w:instrText>
+      </w:r>
+      <w:r>
+        <w:fldChar w:fldCharType="separate"/>
+      </w:r>
+      <w:r>
+        <w:rPr>
+          <w:noProof/>
+        </w:rPr>
+        <w:t>[42]</w:t>
+      </w:r>
+      <w:r>
+        <w:fldChar w:fldCharType="end"/>
+      </w:r>
+    </w:p>
+    <w:p>
+      <w:r>
+        <w:tab/>
+      </w:r>
+      <w:r>
+        <w:t>Al2O3</w:t>
+      </w:r>
+      <w:r>
+        <w:t>:</w:t>
+      </w:r>
+      <w:r>
+        <w:t xml:space="preserve"> </w:t>
+      </w:r>
+      <w:r>
+        <w:tab/>
+      </w:r>
+      <w:r>
+        <w:t>1.6</w:t>
+      </w:r>
+      <w:r>
+        <w:t>165+0i</w:t>
+      </w:r>
+      <w:r>
+        <w:tab/>
+      </w:r>
+      <w:r>
+        <w:fldChar w:fldCharType="begin"/>
+      </w:r>
+      <w:r>
+        <w:instrText xml:space="preserve"> ADDIN EN.CITE &lt;EndNote&gt;&lt;Cite&gt;&lt;Author&gt;Zhukovsky&lt;/Author&gt;&lt;Year&gt;2015&lt;/Year&gt;&lt;RecNum&gt;90&lt;/RecNum&gt;&lt;DisplayText&gt;[37]&lt;/DisplayText&gt;&lt;record&gt;&lt;rec-number&gt;90&lt;/rec-number&gt;&lt;foreign-keys&gt;&lt;key app="EN" db-id="v920pft06rp9dbex2ap500x99x5rrtswxzss" timestamp="1775120793"&gt;90&lt;/key&gt;&lt;/foreign-keys&gt;&lt;ref-type name="Journal Article"&gt;17&lt;/ref-type&gt;&lt;contributors&gt;&lt;authors&gt;&lt;author&gt;Zhukovsky, Sergei V.&lt;/author&gt;&lt;author&gt;Andryieuski, Andrei&lt;/author&gt;&lt;author&gt;Takayama, Osamu&lt;/author&gt;&lt;author&gt;Shkondin, Evgeniy&lt;/author&gt;&lt;author&gt;Malureanu, Radu&lt;/author&gt;&lt;author&gt;Jensen, Flemming&lt;/author&gt;&lt;author&gt;Lavrinenko, Andrei V.&lt;/author&gt;&lt;/authors&gt;&lt;/contributors&gt;&lt;titles&gt;&lt;title&gt;Experimental Demonstration of Effective Medium Approximation Breakdown in Deeply Subwavelength All-Dielectric Multilayers&lt;/title&gt;&lt;secondary-title&gt;Physical Review Letters&lt;/secondary-title&gt;&lt;/titles&gt;&lt;periodical&gt;&lt;full-title&gt;Physical Review Letters&lt;/full-title&gt;&lt;/periodical&gt;&lt;pages&gt;177402&lt;/pages&gt;&lt;volume&gt;115&lt;/volume&gt;&lt;number&gt;17&lt;/number&gt;&lt;dates&gt;&lt;year&gt;2015&lt;/year&gt;&lt;pub-dates&gt;&lt;date&gt;10/23/&lt;/date&gt;&lt;/pub-dates&gt;&lt;/dates&gt;&lt;publisher&gt;American Physical Society&lt;/publisher&gt;&lt;urls&gt;&lt;related-urls&gt;&lt;url&gt;https://link.aps.org/doi/10.1103/PhysRevLett.115.177402&lt;/url&gt;&lt;/related-urls&gt;&lt;/urls&gt;&lt;electronic-resource-num&gt;10.1103/PhysRevLett.115.177402&lt;/electronic-resource-num&gt;&lt;/record&gt;&lt;/Cite&gt;&lt;/EndNote&gt;</w:instrText>
+      </w:r>
+      <w:r>
+        <w:fldChar w:fldCharType="separate"/>
+      </w:r>
+      <w:r>
+        <w:rPr>
+          <w:noProof/>
+        </w:rPr>
+        <w:t>[37]</w:t>
+      </w:r>
+      <w:r>
+        <w:fldChar w:fldCharType="end"/>
+      </w:r>
+    </w:p>
+    <w:p>
+      <w:r>
+        <w:tab/>
+      </w:r>
+      <w:r>
+        <w:t>Si3N4</w:t>
+      </w:r>
+      <w:r>
+        <w:t>:</w:t>
+      </w:r>
+      <w:r>
+        <w:t xml:space="preserve"> </w:t>
+      </w:r>
+      <w:r>
+        <w:tab/>
+      </w:r>
+      <w:r>
+        <w:t>1.996</w:t>
+      </w:r>
+      <w:r>
+        <w:t>6</w:t>
+      </w:r>
+      <w:r>
+        <w:t>+0i</w:t>
+      </w:r>
+      <w:r>
+        <w:tab/>
+      </w:r>
+      <w:r>
+        <w:fldChar w:fldCharType="begin"/>
+      </w:r>
+      <w:r>
+        <w:instrText xml:space="preserve"> ADDIN EN.CITE &lt;EndNote&gt;&lt;Cite&gt;&lt;Author&gt;Beliaev&lt;/Author&gt;&lt;Year&gt;2022&lt;/Year&gt;&lt;RecNum&gt;70&lt;/RecNum&gt;&lt;DisplayText&gt;[39]&lt;/DisplayText&gt;&lt;record&gt;&lt;rec-number&gt;70&lt;/rec-number&gt;&lt;foreign-keys&gt;&lt;key app="EN" db-id="v920pft06rp9dbex2ap500x99x5rrtswxzss" timestamp="1768215795" guid="3f7419e0-798c-4593-84cf-4bf61aaacb06"&gt;70&lt;/key&gt;&lt;/foreign-keys&gt;&lt;ref-type name="Journal Article"&gt;17&lt;/ref-type&gt;&lt;contributors&gt;&lt;authors&gt;&lt;author&gt;Beliaev, Leonid Yu&lt;/author&gt;&lt;author&gt;Shkondin, Evgeniy&lt;/author&gt;&lt;author&gt;Lavrinenko, Andrei V.&lt;/author&gt;&lt;author&gt;Takayama, Osamu&lt;/author&gt;&lt;/authors&gt;&lt;/contributors&gt;&lt;titles&gt;&lt;title&gt;Optical, structural and composition properties of silicon nitride films deposited by reactive radio-frequency sputtering, low pressure and plasma-enhanced chemical vapor deposition&lt;/title&gt;&lt;secondary-title&gt;Thin Solid Films&lt;/secondary-title&gt;&lt;/titles&gt;&lt;periodical&gt;&lt;full-title&gt;Thin Solid Films&lt;/full-title&gt;&lt;/periodical&gt;&lt;pages&gt;139568&lt;/pages&gt;&lt;volume&gt;763&lt;/volume&gt;&lt;keywords&gt;&lt;keyword&gt;Silicon nitride&lt;/keyword&gt;&lt;keyword&gt;Ellipsometry&lt;/keyword&gt;&lt;keyword&gt;Chemical vapor deposition&lt;/keyword&gt;&lt;keyword&gt;Sputtering&lt;/keyword&gt;&lt;keyword&gt;Optical characterization&lt;/keyword&gt;&lt;keyword&gt;Thin film&lt;/keyword&gt;&lt;/keywords&gt;&lt;dates&gt;&lt;year&gt;2022&lt;/year&gt;&lt;pub-dates&gt;&lt;date&gt;2022/12/01/&lt;/date&gt;&lt;/pub-dates&gt;&lt;/dates&gt;&lt;isbn&gt;0040-6090&lt;/isbn&gt;&lt;urls&gt;&lt;related-urls&gt;&lt;url&gt;https://www.sciencedirect.com/science/article/pii/S0040609022004710&lt;/url&gt;&lt;/related-urls&gt;&lt;/urls&gt;&lt;electronic-resource-num&gt;https://doi.org/10.1016/j.tsf.2022.139568&lt;/electronic-resource-num&gt;&lt;/record&gt;&lt;/Cite&gt;&lt;/EndNote&gt;</w:instrText>
+      </w:r>
+      <w:r>
+        <w:fldChar w:fldCharType="separate"/>
+      </w:r>
+      <w:r>
+        <w:rPr>
+          <w:noProof/>
+        </w:rPr>
+        <w:t>[39]</w:t>
+      </w:r>
+      <w:r>
+        <w:fldChar w:fldCharType="end"/>
+      </w:r>
+    </w:p>
+    <w:p>
+      <w:r>
+        <w:tab/>
+      </w:r>
+      <w:r>
+        <w:t>TiO2</w:t>
+      </w:r>
+      <w:r>
+        <w:t>:</w:t>
+      </w:r>
+      <w:r>
+        <w:tab/>
+      </w:r>
+      <w:r>
+        <w:t>2.30</w:t>
+      </w:r>
+      <w:r>
+        <w:t>97</w:t>
+      </w:r>
+      <w:r>
+        <w:tab/>
+      </w:r>
+      <w:r>
+        <w:tab/>
+      </w:r>
+      <w:r>
+        <w:fldChar w:fldCharType="begin"/>
+      </w:r>
+      <w:r>
+        <w:instrText xml:space="preserve"> ADDIN EN.CITE &lt;EndNote&gt;&lt;Cite&gt;&lt;Author&gt;Zhukovsky&lt;/Author&gt;&lt;Year&gt;2015&lt;/Year&gt;&lt;RecNum&gt;90&lt;/RecNum&gt;&lt;DisplayText&gt;[37]&lt;/DisplayText&gt;&lt;record&gt;&lt;rec-number&gt;90&lt;/rec-number&gt;&lt;foreign-keys&gt;&lt;key app="EN" db-id="v920pft06rp9dbex2ap500x99x5rrtswxzss" timestamp="1775120793"&gt;90&lt;/key&gt;&lt;/foreign-keys&gt;&lt;ref-type name="Journal Article"&gt;17&lt;/ref-type&gt;&lt;contributors&gt;&lt;authors&gt;&lt;author&gt;Zhukovsky, Sergei V.&lt;/author&gt;&lt;author&gt;Andryieuski, Andrei&lt;/author&gt;&lt;author&gt;Takayama, Osamu&lt;/author&gt;&lt;author&gt;Shkondin, Evgeniy&lt;/author&gt;&lt;author&gt;Malureanu, Radu&lt;/author&gt;&lt;author&gt;Jensen, Flemming&lt;/author&gt;&lt;author&gt;Lavrinenko, Andrei V.&lt;/author&gt;&lt;/authors&gt;&lt;/contributors&gt;&lt;titles&gt;&lt;title&gt;Experimental Demonstration of Effective Medium Approximation Breakdown in Deeply Subwavelength All-Dielectric Multilayers&lt;/title&gt;&lt;secondary-title&gt;Physical Review Letters&lt;/secondary-title&gt;&lt;/titles&gt;&lt;periodical&gt;&lt;full-title&gt;Physical Review Letters&lt;/full-title&gt;&lt;/periodical&gt;&lt;pages&gt;177402&lt;/pages&gt;&lt;volume&gt;115&lt;/volume&gt;&lt;number&gt;17&lt;/number&gt;&lt;dates&gt;&lt;year&gt;2015&lt;/year&gt;&lt;pub-dates&gt;&lt;date&gt;10/23/&lt;/date&gt;&lt;/pub-dates&gt;&lt;/dates&gt;&lt;publisher&gt;American Physical Society&lt;/publisher&gt;&lt;urls&gt;&lt;related-urls&gt;&lt;url&gt;https://link.aps.org/doi/10.1103/PhysRevLett.115.177402&lt;/url&gt;&lt;/related-urls&gt;&lt;/urls&gt;&lt;electronic-resource-num&gt;10.1103/PhysRevLett.115.177402&lt;/electronic-resource-num&gt;&lt;/record&gt;&lt;/Cite&gt;&lt;/EndNote&gt;</w:instrText>
+      </w:r>
+      <w:r>
+        <w:fldChar w:fldCharType="separate"/>
+      </w:r>
+      <w:r>
+        <w:rPr>
+          <w:noProof/>
+        </w:rPr>
+        <w:t>[37]</w:t>
+      </w:r>
+      <w:r>
+        <w:fldChar w:fldCharType="end"/>
+      </w:r>
+    </w:p>
+    <w:p>
+      <w:pPr>
+        <w:rPr>
+          <w:highlight w:val="yellow"/>
+        </w:rPr>
+      </w:pPr>
+      <w:r>
+        <w:tab/>
+      </w:r>
+      <w:r>
+        <w:rPr>
+          <w:highlight w:val="yellow"/>
+        </w:rPr>
+        <w:t>Sb2Se3:</w:t>
+      </w:r>
+      <w:r>
+        <w:rPr>
+          <w:highlight w:val="yellow"/>
+        </w:rPr>
+        <w:tab/>
+        <w:t>3.</w:t>
+      </w:r>
+      <w:r>
+        <w:rPr>
+          <w:highlight w:val="yellow"/>
+        </w:rPr>
+        <w:t>369674</w:t>
+      </w:r>
+      <w:r>
+        <w:rPr>
+          <w:highlight w:val="yellow"/>
+        </w:rPr>
+        <w:t>+0i (4.3081+0.009744i)</w:t>
+      </w:r>
+      <w:r>
+        <w:rPr>
+          <w:highlight w:val="yellow"/>
+        </w:rPr>
+        <w:tab/>
+      </w:r>
+      <w:r>
+        <w:rPr>
+          <w:highlight w:val="yellow"/>
+        </w:rPr>
+        <w:fldChar w:fldCharType="begin"/>
+      </w:r>
+      <w:r>
+        <w:rPr>
+          <w:highlight w:val="yellow"/>
+        </w:rPr>
+        <w:instrText xml:space="preserve"> ADDIN EN.CITE &lt;EndNote&gt;&lt;Cite&gt;&lt;Author&gt;Delaney&lt;/Author&gt;&lt;Year&gt;2020&lt;/Year&gt;&lt;RecNum&gt;64&lt;/RecNum&gt;&lt;DisplayText&gt;[18]&lt;/DisplayText&gt;&lt;record&gt;&lt;rec-number&gt;64&lt;/rec-number&gt;&lt;foreign-keys&gt;&lt;key app="EN" db-id="v920pft06rp9dbex2ap500x99x5rrtswxzss" timestamp="1768054090" guid="b15b5550-40d7-4ad2-8182-cf6f486a4f50"&gt;64&lt;/key&gt;&lt;/foreign-keys&gt;&lt;ref-type name="Journal Article"&gt;17&lt;/ref-type&gt;&lt;contributors&gt;&lt;authors&gt;&lt;author&gt;Delaney, Matthew&lt;/author&gt;&lt;author&gt;Zeimpekis, Ioannis&lt;/author&gt;&lt;author&gt;Lawson, Daniel&lt;/author&gt;&lt;author&gt;Hewak, Daniel W</w:instrText>
+      </w:r>
+      <w:r>
+        <w:rPr>
+          <w:rFonts w:hint="eastAsia"/>
+          <w:highlight w:val="yellow"/>
+        </w:rPr>
+        <w:instrText>.&lt;/author&gt;&lt;author&gt;Muskens, Otto L.&lt;/author&gt;&lt;/authors&gt;&lt;/contributors&gt;&lt;titles&gt;&lt;title&gt;A New Family of Ultralow Loss Reversible Phase</w:instrText>
+      </w:r>
+      <w:r>
+        <w:rPr>
+          <w:rFonts w:hint="eastAsia"/>
+          <w:highlight w:val="yellow"/>
+        </w:rPr>
+        <w:instrText>‐</w:instrText>
+      </w:r>
+      <w:r>
+        <w:rPr>
+          <w:rFonts w:hint="eastAsia"/>
+          <w:highlight w:val="yellow"/>
+        </w:rPr>
+        <w:instrText>Change Materials for Photonic Integrated Circuits: Sb2S3 and Sb2Se3&lt;/title&gt;&lt;secondary-title&gt;Advanced Functional Materials&lt;/se</w:instrText>
+      </w:r>
+      <w:r>
+        <w:rPr>
+          <w:highlight w:val="yellow"/>
+        </w:rPr>
+        <w:instrText>condary-title&gt;&lt;/titles&gt;&lt;periodical&gt;&lt;full-title&gt;Advanced Functional Materials&lt;/full-title&gt;&lt;/periodical&gt;&lt;volume&gt;30&lt;/volume&gt;&lt;number&gt;36&lt;/number&gt;&lt;dates&gt;&lt;year&gt;2020&lt;/year&gt;&lt;/dates&gt;&lt;isbn&gt;1616-301X&amp;#xD;1616-3028&lt;/isbn&gt;&lt;urls&gt;&lt;/urls&gt;&lt;electronic-resource-num&gt;10.1002/adfm.202002447&lt;/electronic-resource-num&gt;&lt;/record&gt;&lt;/Cite&gt;&lt;/EndNote&gt;</w:instrText>
+      </w:r>
+      <w:r>
+        <w:rPr>
+          <w:highlight w:val="yellow"/>
+        </w:rPr>
+        <w:fldChar w:fldCharType="separate"/>
+      </w:r>
+      <w:r>
+        <w:rPr>
+          <w:noProof/>
+          <w:highlight w:val="yellow"/>
+        </w:rPr>
+        <w:t>[18]</w:t>
+      </w:r>
+      <w:r>
+        <w:rPr>
+          <w:highlight w:val="yellow"/>
+        </w:rPr>
+        <w:fldChar w:fldCharType="end"/>
+      </w:r>
+    </w:p>
+    <w:p>
+      <w:r>
+        <w:tab/>
+      </w:r>
+      <w:r>
+        <w:t>Si</w:t>
+      </w:r>
+      <w:r>
+        <w:t>_300</w:t>
+      </w:r>
+      <w:r>
+        <w:t>:</w:t>
+      </w:r>
+      <w:r>
+        <w:tab/>
+        <w:t>3.</w:t>
+      </w:r>
+      <w:r>
+        <w:t>5552</w:t>
+      </w:r>
+      <w:r>
+        <w:tab/>
+      </w:r>
+      <w:r>
+        <w:tab/>
+      </w:r>
+      <w:r>
+        <w:fldChar w:fldCharType="begin"/>
+      </w:r>
+      <w:r>
+        <w:instrText xml:space="preserve"> ADDIN EN.CITE &lt;EndNote&gt;&lt;Cite&gt;&lt;Author&gt;Franta&lt;/Author&gt;&lt;Year&gt;2018&lt;/Year&gt;&lt;RecNum&gt;95&lt;/RecNum&gt;&lt;DisplayText&gt;[43]&lt;/DisplayText&gt;&lt;record&gt;&lt;rec-number&gt;95&lt;/rec-number&gt;&lt;foreign-keys&gt;&lt;key app="EN" db-id="v920pft06rp9dbex2ap500x99x5rrtswxzss" timestamp="1776659453"&gt;95&lt;/key&gt;&lt;/foreign-keys&gt;&lt;ref-type name="Journal Article"&gt;17&lt;/ref-type&gt;&lt;contributors&gt;&lt;authors&gt;&lt;author&gt;Franta, Daniel&lt;/author&gt;&lt;author&gt;Franta, Pavel&lt;/author&gt;&lt;author&gt;Vohánka, Jiří&lt;/author&gt;&lt;author&gt;Čermák, Martin&lt;/author&gt;&lt;author&gt;Ohlídal, Ivan&lt;/author&gt;&lt;/authors&gt;&lt;/contributors&gt;&lt;titles&gt;&lt;title&gt;Determination of thicknesses and temperatures of crystalline silicon wafers from optical measurements in the far infrared region&lt;/title&gt;&lt;secondary-title&gt;Journal of Applied Physics&lt;/secondary-title&gt;&lt;/titles&gt;&lt;periodical&gt;&lt;full-title&gt;Journal of Applied Physics&lt;/full-title&gt;&lt;/periodical&gt;&lt;volume&gt;123&lt;/volume&gt;&lt;number&gt;18&lt;/number&gt;&lt;dates&gt;&lt;year&gt;2018&lt;/year&gt;&lt;/dates&gt;&lt;isbn&gt;0021-8979&lt;/isbn&gt;&lt;urls&gt;&lt;related-urls&gt;&lt;url&gt;https://doi.org/10.1063/1.5026195&lt;/url&gt;&lt;/related-urls&gt;&lt;/urls&gt;&lt;custom1&gt;185707&lt;/custom1&gt;&lt;electronic-resource-num&gt;10.1063/1.5026195&lt;/electronic-resource-num&gt;&lt;access-date&gt;4/20/2026&lt;/access-date&gt;&lt;/record&gt;&lt;/Cite&gt;&lt;/EndNote&gt;</w:instrText>
+      </w:r>
+      <w:r>
+        <w:fldChar w:fldCharType="separate"/>
+      </w:r>
+      <w:r>
+        <w:rPr>
+          <w:noProof/>
+        </w:rPr>
+        <w:t>[43]</w:t>
       </w:r>
       <w:r>
         <w:fldChar w:fldCharType="end"/>
@@ -15909,6 +16421,30 @@
       <w:r>
         <w:t>1.3842</w:t>
       </w:r>
+      <w:r>
+        <w:tab/>
+      </w:r>
+      <w:r>
+        <w:tab/>
+      </w:r>
+      <w:r>
+        <w:fldChar w:fldCharType="begin"/>
+      </w:r>
+      <w:r>
+        <w:instrText xml:space="preserve"> ADDIN EN.CITE &lt;EndNote&gt;&lt;Cite&gt;&lt;Author&gt;Franta&lt;/Author&gt;&lt;Year&gt;2017&lt;/Year&gt;&lt;RecNum&gt;87&lt;/RecNum&gt;&lt;DisplayText&gt;[41]&lt;/DisplayText&gt;&lt;record&gt;&lt;rec-number&gt;87&lt;/rec-number&gt;&lt;foreign-keys&gt;&lt;key app="EN" db-id="v920pft06rp9dbex2ap500x99x5rrtswxzss" timestamp="1774444072"&gt;87&lt;/key&gt;&lt;/foreign-keys&gt;&lt;ref-type name="Journal Article"&gt;17&lt;/ref-type&gt;&lt;contributors&gt;&lt;authors&gt;&lt;author&gt;Franta, Daniel&lt;/author&gt;&lt;author&gt;Nečas, David&lt;/author&gt;&lt;author&gt;Giglia, Angelo&lt;/author&gt;&lt;author&gt;Franta, Pavel&lt;/author&gt;&lt;author&gt;Ohlídal, Ivan&lt;/author&gt;&lt;/authors&gt;&lt;/contributors&gt;&lt;titles&gt;&lt;title&gt;Universal dispersion model for characterization of optical thin films over wide spectral range: Application to magnesium fluoride&lt;/title&gt;&lt;secondary-title&gt;Applied Surface Science&lt;/secondary-title&gt;&lt;/titles&gt;&lt;periodical&gt;&lt;full-title&gt;Applied Surface Science&lt;/full-title&gt;&lt;/periodical&gt;&lt;pages&gt;424-429&lt;/pages&gt;&lt;volume&gt;421&lt;/volume&gt;&lt;keywords&gt;&lt;keyword&gt;Optical constants&lt;/keyword&gt;&lt;keyword&gt;Ellipsometry&lt;/keyword&gt;&lt;keyword&gt;Spectrophotometry&lt;/keyword&gt;&lt;keyword&gt;Sum rule&lt;/keyword&gt;&lt;/keywords&gt;&lt;dates&gt;&lt;year&gt;2017&lt;/year&gt;&lt;pub-dates&gt;&lt;date&gt;2017/11/01/&lt;/date&gt;&lt;/pub-dates&gt;&lt;/dates&gt;&lt;isbn&gt;0169-4332&lt;/isbn&gt;&lt;urls&gt;&lt;related-urls&gt;&lt;url&gt;https://www.sciencedirect.com/science/article/pii/S016943321632030X&lt;/url&gt;&lt;/related-urls&gt;&lt;/urls&gt;&lt;electronic-resource-num&gt;https://doi.org/10.1016/j.apsusc.2016.09.149&lt;/electronic-resource-num&gt;&lt;/record&gt;&lt;/Cite&gt;&lt;/EndNote&gt;</w:instrText>
+      </w:r>
+      <w:r>
+        <w:fldChar w:fldCharType="separate"/>
+      </w:r>
+      <w:r>
+        <w:rPr>
+          <w:noProof/>
+        </w:rPr>
+        <w:t>[41]</w:t>
+      </w:r>
+      <w:r>
+        <w:fldChar w:fldCharType="end"/>
+      </w:r>
     </w:p>
     <w:p>
       <w:r>
@@ -15944,6 +16480,27 @@
       <w:r>
         <w:tab/>
       </w:r>
+      <w:r>
+        <w:fldChar w:fldCharType="begin"/>
+      </w:r>
+      <w:r>
+        <w:instrText xml:space="preserve"> ADDIN EN.CITE &lt;EndNote&gt;&lt;Cite&gt;&lt;Author&gt;Franta&lt;/Author&gt;&lt;Year&gt;2016&lt;/Year&gt;&lt;RecNum&gt;97&lt;/RecNum&gt;&lt;DisplayText&gt;[42]&lt;/DisplayText&gt;&lt;record&gt;&lt;rec-number&gt;97&lt;/rec-number&gt;&lt;foreign-keys&gt;&lt;key app="EN" db-id="v920pft06rp9dbex2ap500x99x5rrtswxzss" timestamp="1776660410"&gt;97&lt;/key&gt;&lt;/foreign-keys&gt;&lt;ref-type name="Book"&gt;6&lt;/ref-type&gt;&lt;contributors&gt;&lt;authors&gt;&lt;author&gt;Franta, Daniel&lt;/author&gt;&lt;author&gt;Nečas, David&lt;/author&gt;&lt;author&gt;Ohlídal, Ivan&lt;/author&gt;&lt;author&gt;Giglia, Angelo&lt;/author&gt;&lt;/authors&gt;&lt;/contributors&gt;&lt;titles&gt;&lt;title&gt;Optical characterization of SiO2 thin films using universal dispersion model over wide spectral range&lt;/title&gt;&lt;secondary-title&gt;SPIE Photonics Europe&lt;/secondary-title&gt;&lt;/titles&gt;&lt;volume&gt;9890&lt;/volume&gt;&lt;section&gt;EPE&lt;/section&gt;&lt;dates&gt;&lt;year&gt;2016&lt;/year&gt;&lt;/dates&gt;&lt;publisher&gt;SPIE&lt;/publisher&gt;&lt;urls&gt;&lt;related-urls&gt;&lt;url&gt;https://doi.org/10.1117/12.2227580&lt;/url&gt;&lt;/related-urls&gt;&lt;/urls&gt;&lt;/record&gt;&lt;/Cite&gt;&lt;/EndNote&gt;</w:instrText>
+      </w:r>
+      <w:r>
+        <w:fldChar w:fldCharType="separate"/>
+      </w:r>
+      <w:r>
+        <w:rPr>
+          <w:noProof/>
+        </w:rPr>
+        <w:t>[42]</w:t>
+      </w:r>
+      <w:r>
+        <w:fldChar w:fldCharType="end"/>
+      </w:r>
+      <w:r>
+        <w:tab/>
+      </w:r>
     </w:p>
     <w:p>
       <w:r>
@@ -16082,102 +16639,128 @@
         <w:tab/>
       </w:r>
       <w:r>
-        <w:t>*</w:t>
-      </w:r>
-      <w:r>
-        <w:t>ZrO2</w:t>
-      </w:r>
-      <w:r>
-        <w:t>:</w:t>
-      </w:r>
-      <w:r>
-        <w:tab/>
-      </w:r>
-      <w:r>
-        <w:t>2.4680</w:t>
+        <w:rPr>
+          <w:highlight w:val="yellow"/>
+        </w:rPr>
+        <w:t>Sb2Se3:</w:t>
+      </w:r>
+      <w:r>
+        <w:rPr>
+          <w:highlight w:val="yellow"/>
+        </w:rPr>
+        <w:tab/>
+        <w:t>3.</w:t>
+      </w:r>
+      <w:r>
+        <w:rPr>
+          <w:highlight w:val="yellow"/>
+        </w:rPr>
+        <w:t>9615</w:t>
+      </w:r>
+      <w:r>
+        <w:rPr>
+          <w:highlight w:val="yellow"/>
+        </w:rPr>
+        <w:t>+</w:t>
+      </w:r>
+      <w:r>
+        <w:rPr>
+          <w:highlight w:val="yellow"/>
+        </w:rPr>
+        <w:t>1.093042</w:t>
+      </w:r>
+      <w:r>
+        <w:rPr>
+          <w:highlight w:val="yellow"/>
+        </w:rPr>
+        <w:t>i (4.</w:t>
+      </w:r>
+      <w:r>
+        <w:rPr>
+          <w:highlight w:val="yellow"/>
+        </w:rPr>
+        <w:t>7876</w:t>
+      </w:r>
+      <w:r>
+        <w:rPr>
+          <w:highlight w:val="yellow"/>
+        </w:rPr>
+        <w:t>+</w:t>
+      </w:r>
+      <w:r>
+        <w:rPr>
+          <w:highlight w:val="yellow"/>
+        </w:rPr>
+        <w:t>2.240748</w:t>
+      </w:r>
+      <w:r>
+        <w:rPr>
+          <w:highlight w:val="yellow"/>
+        </w:rPr>
+        <w:t>i)</w:t>
+      </w:r>
+      <w:r>
+        <w:tab/>
+      </w:r>
+      <w:r>
+        <w:fldChar w:fldCharType="begin"/>
+      </w:r>
+      <w:r>
+        <w:instrText xml:space="preserve"> ADDIN EN.CITE &lt;EndNote&gt;&lt;Cite&gt;&lt;Author&gt;Delaney&lt;/Author&gt;&lt;Year&gt;2020&lt;/Year&gt;&lt;RecNum&gt;64&lt;/RecNum&gt;&lt;DisplayText&gt;[18]&lt;/DisplayText&gt;&lt;record&gt;&lt;rec-number&gt;64&lt;/rec-number&gt;&lt;foreign-keys&gt;&lt;key app="EN" db-id="v920pft06rp9dbex2ap500x99x5rrtswxzss" timestamp="1768054090" guid="b15b5550-40d7-4ad2-8182-cf6f486a4f50"&gt;64&lt;/key&gt;&lt;/foreign-keys&gt;&lt;ref-type name="Journal Article"&gt;17&lt;/ref-type&gt;&lt;contributors&gt;&lt;authors&gt;&lt;author&gt;Delaney, Matthew&lt;/author&gt;&lt;author&gt;Zeimpekis, Ioannis&lt;/author&gt;&lt;author&gt;Lawson, Daniel&lt;/author&gt;&lt;author&gt;Hewak, Daniel W</w:instrText>
+      </w:r>
+      <w:r>
+        <w:rPr>
+          <w:rFonts w:hint="eastAsia"/>
+        </w:rPr>
+        <w:instrText>.&lt;/author&gt;&lt;author&gt;Muskens, Otto L.&lt;/author&gt;&lt;/authors&gt;&lt;/contributors&gt;&lt;titles&gt;&lt;title&gt;A New Family of Ultralow Loss Reversible Phase</w:instrText>
+      </w:r>
+      <w:r>
+        <w:rPr>
+          <w:rFonts w:hint="eastAsia"/>
+        </w:rPr>
+        <w:instrText>‐</w:instrText>
+      </w:r>
+      <w:r>
+        <w:rPr>
+          <w:rFonts w:hint="eastAsia"/>
+        </w:rPr>
+        <w:instrText>Change Materials for Photonic Integrated Circuits: Sb2S3 and Sb2Se3&lt;/title&gt;&lt;secondary-title&gt;Advanced Functional Materials&lt;/se</w:instrText>
+      </w:r>
+      <w:r>
+        <w:instrText>condary-title&gt;&lt;/titles&gt;&lt;periodical&gt;&lt;full-title&gt;Advanced Functional Materials&lt;/full-title&gt;&lt;/periodical&gt;&lt;volume&gt;30&lt;/volume&gt;&lt;number&gt;36&lt;/number&gt;&lt;dates&gt;&lt;year&gt;2020&lt;/year&gt;&lt;/dates&gt;&lt;isbn&gt;1616-301X&amp;#xD;1616-3028&lt;/isbn&gt;&lt;urls&gt;&lt;/urls&gt;&lt;electronic-resource-num&gt;10.1002/adfm.202002447&lt;/electronic-resource-num&gt;&lt;/record&gt;&lt;/Cite&gt;&lt;/EndNote&gt;</w:instrText>
+      </w:r>
+      <w:r>
+        <w:fldChar w:fldCharType="separate"/>
+      </w:r>
+      <w:r>
+        <w:rPr>
+          <w:noProof/>
+        </w:rPr>
+        <w:t>[18]</w:t>
+      </w:r>
+      <w:r>
+        <w:fldChar w:fldCharType="end"/>
       </w:r>
     </w:p>
     <w:p>
       <w:r>
         <w:tab/>
-      </w:r>
-      <w:r>
-        <w:rPr>
-          <w:highlight w:val="yellow"/>
-        </w:rPr>
-        <w:t>Sb2Se3:</w:t>
-      </w:r>
-      <w:r>
-        <w:rPr>
-          <w:highlight w:val="yellow"/>
-        </w:rPr>
-        <w:tab/>
-        <w:t>3.</w:t>
-      </w:r>
-      <w:r>
-        <w:rPr>
-          <w:highlight w:val="yellow"/>
-        </w:rPr>
-        <w:t>9615</w:t>
-      </w:r>
-      <w:r>
-        <w:rPr>
-          <w:highlight w:val="yellow"/>
-        </w:rPr>
-        <w:t>+</w:t>
-      </w:r>
-      <w:r>
-        <w:rPr>
-          <w:highlight w:val="yellow"/>
-        </w:rPr>
-        <w:t>1.093042</w:t>
-      </w:r>
-      <w:r>
-        <w:rPr>
-          <w:highlight w:val="yellow"/>
-        </w:rPr>
-        <w:t>i (4.</w:t>
-      </w:r>
-      <w:r>
-        <w:rPr>
-          <w:highlight w:val="yellow"/>
-        </w:rPr>
-        <w:t>7876</w:t>
-      </w:r>
-      <w:r>
-        <w:rPr>
-          <w:highlight w:val="yellow"/>
-        </w:rPr>
-        <w:t>+</w:t>
-      </w:r>
-      <w:r>
-        <w:rPr>
-          <w:highlight w:val="yellow"/>
-        </w:rPr>
-        <w:t>2.240748</w:t>
-      </w:r>
-      <w:r>
-        <w:rPr>
-          <w:highlight w:val="yellow"/>
-        </w:rPr>
-        <w:t>i)</w:t>
-      </w:r>
-    </w:p>
-    <w:p>
-      <w:r>
-        <w:tab/>
-      </w:r>
-      <w:r>
-        <w:t>Si:</w:t>
-      </w:r>
-      <w:r>
-        <w:tab/>
-      </w:r>
-      <w:r>
-        <w:t>4.9143+0.66141i (4.9355+0.72084i</w:t>
-      </w:r>
-      <w:r>
-        <w:t>)</w:t>
+        <w:t>Si</w:t>
+      </w:r>
+      <w:r>
+        <w:t>_</w:t>
+      </w:r>
+      <w:r>
+        <w:t>300</w:t>
+      </w:r>
+      <w:r>
+        <w:t>:</w:t>
+      </w:r>
+      <w:r>
+        <w:tab/>
+      </w:r>
+      <w:r>
+        <w:t>4.1473+0.039769i</w:t>
       </w:r>
       <w:r>
         <w:tab/>
@@ -16186,7 +16769,7 @@
         <w:fldChar w:fldCharType="begin"/>
       </w:r>
       <w:r>
-        <w:instrText xml:space="preserve"> ADDIN EN.CITE &lt;EndNote&gt;&lt;Cite&gt;&lt;Author&gt;Karaman&lt;/Author&gt;&lt;Year&gt;2025&lt;/Year&gt;&lt;RecNum&gt;94&lt;/RecNum&gt;&lt;DisplayText&gt;[41]&lt;/DisplayText&gt;&lt;record&gt;&lt;rec-number&gt;94&lt;/rec-number&gt;&lt;foreign-keys&gt;&lt;key app="EN" db-id="v920pft06rp9dbex2ap500x99x5rrtswxzss" timestamp="1776336380"&gt;94&lt;/key&gt;&lt;/foreign-keys&gt;&lt;ref-type name="Journal Article"&gt;17&lt;/ref-type&gt;&lt;contributors&gt;&lt;authors&gt;&lt;author&gt;Karaman, Omer Can&lt;/author&gt;&lt;author&gt;Naidu, Gopal Narmada&lt;/author&gt;&lt;author&gt;Bowman, Alan R.&lt;/author&gt;&lt;author&gt;Dayi, Elif Nur&lt;/author&gt;&lt;author&gt;Tagliabue, Giulia&lt;/author&gt;&lt;/authors&gt;&lt;/contributors&gt;&lt;titles&gt;&lt;title&gt;Decoupling Optical and Thermal Dynamics in Dielectric Metasurfaces for Self-Encoded Photonic Control&lt;/title&gt;&lt;secondary-title&gt;Laser &amp;amp; Photonics Reviews&lt;/secondary-title&gt;&lt;/titles&gt;&lt;periodical&gt;&lt;full-title&gt;Laser &amp;amp; Photonics Reviews&lt;/full-title&gt;&lt;/periodical&gt;&lt;pages&gt;e01014&lt;/pages&gt;&lt;volume&gt;19&lt;/volume&gt;&lt;number&gt;24&lt;/number&gt;&lt;dates&gt;&lt;year&gt;2025&lt;/year&gt;&lt;/dates&gt;&lt;isbn&gt;1863-8880&lt;/isbn&gt;&lt;urls&gt;&lt;related-urls&gt;&lt;url&gt;https://onlinelibrary.wiley.com/doi/abs/10.1002/lpor.202501014&lt;/url&gt;&lt;/related-urls&gt;&lt;/urls&gt;&lt;electronic-resource-num&gt;https://doi.org/10.1002/lpor.202501014&lt;/electronic-resource-num&gt;&lt;/record&gt;&lt;/Cite&gt;&lt;/EndNote&gt;</w:instrText>
+        <w:instrText xml:space="preserve"> ADDIN EN.CITE &lt;EndNote&gt;&lt;Cite&gt;&lt;Author&gt;Franta&lt;/Author&gt;&lt;Year&gt;2018&lt;/Year&gt;&lt;RecNum&gt;95&lt;/RecNum&gt;&lt;DisplayText&gt;[43]&lt;/DisplayText&gt;&lt;record&gt;&lt;rec-number&gt;95&lt;/rec-number&gt;&lt;foreign-keys&gt;&lt;key app="EN" db-id="v920pft06rp9dbex2ap500x99x5rrtswxzss" timestamp="1776659453"&gt;95&lt;/key&gt;&lt;/foreign-keys&gt;&lt;ref-type name="Journal Article"&gt;17&lt;/ref-type&gt;&lt;contributors&gt;&lt;authors&gt;&lt;author&gt;Franta, Daniel&lt;/author&gt;&lt;author&gt;Franta, Pavel&lt;/author&gt;&lt;author&gt;Vohánka, Jiří&lt;/author&gt;&lt;author&gt;Čermák, Martin&lt;/author&gt;&lt;author&gt;Ohlídal, Ivan&lt;/author&gt;&lt;/authors&gt;&lt;/contributors&gt;&lt;titles&gt;&lt;title&gt;Determination of thicknesses and temperatures of crystalline silicon wafers from optical measurements in the far infrared region&lt;/title&gt;&lt;secondary-title&gt;Journal of Applied Physics&lt;/secondary-title&gt;&lt;/titles&gt;&lt;periodical&gt;&lt;full-title&gt;Journal of Applied Physics&lt;/full-title&gt;&lt;/periodical&gt;&lt;volume&gt;123&lt;/volume&gt;&lt;number&gt;18&lt;/number&gt;&lt;dates&gt;&lt;year&gt;2018&lt;/year&gt;&lt;/dates&gt;&lt;isbn&gt;0021-8979&lt;/isbn&gt;&lt;urls&gt;&lt;related-urls&gt;&lt;url&gt;https://doi.org/10.1063/1.5026195&lt;/url&gt;&lt;/related-urls&gt;&lt;/urls&gt;&lt;custom1&gt;185707&lt;/custom1&gt;&lt;electronic-resource-num&gt;10.1063/1.5026195&lt;/electronic-resource-num&gt;&lt;access-date&gt;4/20/2026&lt;/access-date&gt;&lt;/record&gt;&lt;/Cite&gt;&lt;/EndNote&gt;</w:instrText>
       </w:r>
       <w:r>
         <w:fldChar w:fldCharType="separate"/>
@@ -16195,7 +16778,7 @@
         <w:rPr>
           <w:noProof/>
         </w:rPr>
-        <w:t>[41]</w:t>
+        <w:t>[43]</w:t>
       </w:r>
       <w:r>
         <w:fldChar w:fldCharType="end"/>
@@ -16231,7 +16814,7 @@
         <w:rPr>
           <w:highlight w:val="cyan"/>
         </w:rPr>
-        <w:instrText xml:space="preserve"> ADDIN EN.CITE &lt;EndNote&gt;&lt;Cite&gt;&lt;Author&gt;Raut&lt;/Author&gt;&lt;Year&gt;2011&lt;/Year&gt;&lt;RecNum&gt;85&lt;/RecNum&gt;&lt;DisplayText&gt;[42]&lt;/DisplayText&gt;&lt;record&gt;&lt;rec-number&gt;85&lt;/rec-number&gt;&lt;foreign-keys&gt;&lt;key app="EN" db-id="v920pft06rp9dbex2ap500x99x5rrtswxzss" timestamp="1773917246"&gt;85&lt;/key&gt;&lt;/foreign-keys&gt;&lt;ref-type name="Journal Article"&gt;17&lt;/ref-type&gt;&lt;contributors&gt;&lt;authors&gt;&lt;author&gt;Raut, Hemant Kumar&lt;/author&gt;&lt;author&gt;Ganesh, V. Anand&lt;/author&gt;&lt;author&gt;Nair, A. Sreekumaran&lt;/author&gt;&lt;author&gt;Ramakrishna, Seeram&lt;/author&gt;&lt;/authors&gt;&lt;/contributors&gt;&lt;titles&gt;&lt;title&gt;Anti-reflective coatings: A critical, in-depth review&lt;/title&gt;&lt;secondary-title&gt;Energy &amp;amp; Environmental Science&lt;/secondary-title&gt;&lt;/titles&gt;&lt;periodical&gt;&lt;full-title&gt;Energy &amp;amp; Environmental Science&lt;/full-title&gt;&lt;/periodical&gt;&lt;pages&gt;3779-3804&lt;/pages&gt;&lt;volume&gt;4&lt;/volume&gt;&lt;number&gt;10&lt;/number&gt;&lt;dates&gt;&lt;year&gt;2011&lt;/year&gt;&lt;/dates&gt;&lt;publisher&gt;The Royal Society of Chemistry&lt;/publisher&gt;&lt;isbn&gt;1754-5692&lt;/isbn&gt;&lt;work-type&gt;10.1039/C1EE01297E&lt;/work-type&gt;&lt;urls&gt;&lt;related-urls&gt;&lt;url&gt;http://dx.doi.org/10.1039/C1EE01297E&lt;/url&gt;&lt;/related-urls&gt;&lt;/urls&gt;&lt;electronic-resource-num&gt;10.1039/C1EE01297E&lt;/electronic-resource-num&gt;&lt;/record&gt;&lt;/Cite&gt;&lt;/EndNote&gt;</w:instrText>
+        <w:instrText xml:space="preserve"> ADDIN EN.CITE &lt;EndNote&gt;&lt;Cite&gt;&lt;Author&gt;Raut&lt;/Author&gt;&lt;Year&gt;2011&lt;/Year&gt;&lt;RecNum&gt;85&lt;/RecNum&gt;&lt;DisplayText&gt;[44]&lt;/DisplayText&gt;&lt;record&gt;&lt;rec-number&gt;85&lt;/rec-number&gt;&lt;foreign-keys&gt;&lt;key app="EN" db-id="v920pft06rp9dbex2ap500x99x5rrtswxzss" timestamp="1773917246"&gt;85&lt;/key&gt;&lt;/foreign-keys&gt;&lt;ref-type name="Journal Article"&gt;17&lt;/ref-type&gt;&lt;contributors&gt;&lt;authors&gt;&lt;author&gt;Raut, Hemant Kumar&lt;/author&gt;&lt;author&gt;Ganesh, V. Anand&lt;/author&gt;&lt;author&gt;Nair, A. Sreekumaran&lt;/author&gt;&lt;author&gt;Ramakrishna, Seeram&lt;/author&gt;&lt;/authors&gt;&lt;/contributors&gt;&lt;titles&gt;&lt;title&gt;Anti-reflective coatings: A critical, in-depth review&lt;/title&gt;&lt;secondary-title&gt;Energy &amp;amp; Environmental Science&lt;/secondary-title&gt;&lt;/titles&gt;&lt;periodical&gt;&lt;full-title&gt;Energy &amp;amp; Environmental Science&lt;/full-title&gt;&lt;/periodical&gt;&lt;pages&gt;3779-3804&lt;/pages&gt;&lt;volume&gt;4&lt;/volume&gt;&lt;number&gt;10&lt;/number&gt;&lt;dates&gt;&lt;year&gt;2011&lt;/year&gt;&lt;/dates&gt;&lt;publisher&gt;The Royal Society of Chemistry&lt;/publisher&gt;&lt;isbn&gt;1754-5692&lt;/isbn&gt;&lt;work-type&gt;10.1039/C1EE01297E&lt;/work-type&gt;&lt;urls&gt;&lt;related-urls&gt;&lt;url&gt;http://dx.doi.org/10.1039/C1EE01297E&lt;/url&gt;&lt;/related-urls&gt;&lt;/urls&gt;&lt;electronic-resource-num&gt;10.1039/C1EE01297E&lt;/electronic-resource-num&gt;&lt;/record&gt;&lt;/Cite&gt;&lt;/EndNote&gt;</w:instrText>
       </w:r>
       <w:r>
         <w:rPr>
@@ -16244,7 +16827,7 @@
           <w:noProof/>
           <w:highlight w:val="cyan"/>
         </w:rPr>
-        <w:t>[42]</w:t>
+        <w:t>[44]</w:t>
       </w:r>
       <w:r>
         <w:rPr>
@@ -16308,12 +16891,21 @@
         <w:pStyle w:val="Heading2"/>
       </w:pPr>
       <w:r>
+        <w:rPr>
+          <w:highlight w:val="yellow"/>
+        </w:rPr>
         <w:t>3.1</w:t>
       </w:r>
       <w:r>
+        <w:rPr>
+          <w:highlight w:val="yellow"/>
+        </w:rPr>
         <w:t xml:space="preserve"> </w:t>
       </w:r>
       <w:r>
+        <w:rPr>
+          <w:highlight w:val="yellow"/>
+        </w:rPr>
         <w:t>Optical limiter design</w:t>
       </w:r>
     </w:p>
@@ -16439,7 +17031,7 @@
         <w:fldChar w:fldCharType="begin"/>
       </w:r>
       <w:r>
-        <w:instrText xml:space="preserve"> ADDIN EN.CITE &lt;EndNote&gt;&lt;Cite&gt;&lt;Author&gt;Franta&lt;/Author&gt;&lt;Year&gt;2017&lt;/Year&gt;&lt;RecNum&gt;87&lt;/RecNum&gt;&lt;DisplayText&gt;[43]&lt;/DisplayText&gt;&lt;record&gt;&lt;rec-number&gt;87&lt;/rec-number&gt;&lt;foreign-keys&gt;&lt;key app="EN" db-id="v920pft06rp9dbex2ap500x99x5rrtswxzss" timestamp="1774444072"&gt;87&lt;/key&gt;&lt;/foreign-keys&gt;&lt;ref-type name="Journal Article"&gt;17&lt;/ref-type&gt;&lt;contributors&gt;&lt;authors&gt;&lt;author&gt;Franta, Daniel&lt;/author&gt;&lt;author&gt;Nečas, David&lt;/author&gt;&lt;author&gt;Giglia, Angelo&lt;/author&gt;&lt;author&gt;Franta, Pavel&lt;/author&gt;&lt;author&gt;Ohlídal, Ivan&lt;/author&gt;&lt;/authors&gt;&lt;/contributors&gt;&lt;titles&gt;&lt;title&gt;Universal dispersion model for characterization of optical thin films over wide spectral range: Application to magnesium fluoride&lt;/title&gt;&lt;secondary-title&gt;Applied Surface Science&lt;/secondary-title&gt;&lt;/titles&gt;&lt;periodical&gt;&lt;full-title&gt;Applied Surface Science&lt;/full-title&gt;&lt;/periodical&gt;&lt;pages&gt;424-429&lt;/pages&gt;&lt;volume&gt;421&lt;/volume&gt;&lt;keywords&gt;&lt;keyword&gt;Optical constants&lt;/keyword&gt;&lt;keyword&gt;Ellipsometry&lt;/keyword&gt;&lt;keyword&gt;Spectrophotometry&lt;/keyword&gt;&lt;keyword&gt;Sum rule&lt;/keyword&gt;&lt;/keywords&gt;&lt;dates&gt;&lt;year&gt;2017&lt;/year&gt;&lt;pub-dates&gt;&lt;date&gt;2017/11/01/&lt;/date&gt;&lt;/pub-dates&gt;&lt;/dates&gt;&lt;isbn&gt;0169-4332&lt;/isbn&gt;&lt;urls&gt;&lt;related-urls&gt;&lt;url&gt;https://www.sciencedirect.com/science/article/pii/S016943321632030X&lt;/url&gt;&lt;/related-urls&gt;&lt;/urls&gt;&lt;electronic-resource-num&gt;https://doi.org/10.1016/j.apsusc.2016.09.149&lt;/electronic-resource-num&gt;&lt;/record&gt;&lt;/Cite&gt;&lt;/EndNote&gt;</w:instrText>
+        <w:instrText xml:space="preserve"> ADDIN EN.CITE &lt;EndNote&gt;&lt;Cite&gt;&lt;Author&gt;Franta&lt;/Author&gt;&lt;Year&gt;2017&lt;/Year&gt;&lt;RecNum&gt;87&lt;/RecNum&gt;&lt;DisplayText&gt;[41]&lt;/DisplayText&gt;&lt;record&gt;&lt;rec-number&gt;87&lt;/rec-number&gt;&lt;foreign-keys&gt;&lt;key app="EN" db-id="v920pft06rp9dbex2ap500x99x5rrtswxzss" timestamp="1774444072"&gt;87&lt;/key&gt;&lt;/foreign-keys&gt;&lt;ref-type name="Journal Article"&gt;17&lt;/ref-type&gt;&lt;contributors&gt;&lt;authors&gt;&lt;author&gt;Franta, Daniel&lt;/author&gt;&lt;author&gt;Nečas, David&lt;/author&gt;&lt;author&gt;Giglia, Angelo&lt;/author&gt;&lt;author&gt;Franta, Pavel&lt;/author&gt;&lt;author&gt;Ohlídal, Ivan&lt;/author&gt;&lt;/authors&gt;&lt;/contributors&gt;&lt;titles&gt;&lt;title&gt;Universal dispersion model for characterization of optical thin films over wide spectral range: Application to magnesium fluoride&lt;/title&gt;&lt;secondary-title&gt;Applied Surface Science&lt;/secondary-title&gt;&lt;/titles&gt;&lt;periodical&gt;&lt;full-title&gt;Applied Surface Science&lt;/full-title&gt;&lt;/periodical&gt;&lt;pages&gt;424-429&lt;/pages&gt;&lt;volume&gt;421&lt;/volume&gt;&lt;keywords&gt;&lt;keyword&gt;Optical constants&lt;/keyword&gt;&lt;keyword&gt;Ellipsometry&lt;/keyword&gt;&lt;keyword&gt;Spectrophotometry&lt;/keyword&gt;&lt;keyword&gt;Sum rule&lt;/keyword&gt;&lt;/keywords&gt;&lt;dates&gt;&lt;year&gt;2017&lt;/year&gt;&lt;pub-dates&gt;&lt;date&gt;2017/11/01/&lt;/date&gt;&lt;/pub-dates&gt;&lt;/dates&gt;&lt;isbn&gt;0169-4332&lt;/isbn&gt;&lt;urls&gt;&lt;related-urls&gt;&lt;url&gt;https://www.sciencedirect.com/science/article/pii/S016943321632030X&lt;/url&gt;&lt;/related-urls&gt;&lt;/urls&gt;&lt;electronic-resource-num&gt;https://doi.org/10.1016/j.apsusc.2016.09.149&lt;/electronic-resource-num&gt;&lt;/record&gt;&lt;/Cite&gt;&lt;/EndNote&gt;</w:instrText>
       </w:r>
       <w:r>
         <w:fldChar w:fldCharType="separate"/>
@@ -16448,7 +17040,7 @@
         <w:rPr>
           <w:noProof/>
         </w:rPr>
-        <w:t>[43]</w:t>
+        <w:t>[41]</w:t>
       </w:r>
       <w:r>
         <w:fldChar w:fldCharType="end"/>
@@ -16478,10 +17070,19 @@
         <w:t>In some simulation work</w:t>
       </w:r>
       <w:r>
+        <w:t>s</w:t>
+      </w:r>
+      <w:r>
         <w:t>,</w:t>
       </w:r>
       <w:r>
-        <w:t xml:space="preserve"> the substrate index is </w:t>
+        <w:t xml:space="preserve"> the substrate index </w:t>
+      </w:r>
+      <w:r>
+        <w:t>can</w:t>
+      </w:r>
+      <w:r>
+        <w:t xml:space="preserve"> </w:t>
       </w:r>
       <w:r>
         <w:t>considered</w:t>
@@ -16575,7 +17176,13 @@
         <w:t xml:space="preserve">. But in this work, we </w:t>
       </w:r>
       <w:r>
-        <w:t>utilize silica (SiO</w:t>
+        <w:t xml:space="preserve">utilize </w:t>
+      </w:r>
+      <w:r>
+        <w:t xml:space="preserve">3 mm-thick </w:t>
+      </w:r>
+      <w:r>
+        <w:t>silica (SiO</w:t>
       </w:r>
       <w:r>
         <w:rPr>
@@ -16584,13 +17191,22 @@
         <w:t>2</w:t>
       </w:r>
       <w:r>
-        <w:t xml:space="preserve">) as the substrate using refractive index data from </w:t>
+        <w:t xml:space="preserve">) as substrate </w:t>
+      </w:r>
+      <w:r>
+        <w:t>with</w:t>
+      </w:r>
+      <w:r>
+        <w:t xml:space="preserve"> refractive index data from</w:t>
+      </w:r>
+      <w:r>
+        <w:t xml:space="preserve"> </w:t>
       </w:r>
       <w:r>
         <w:fldChar w:fldCharType="begin"/>
       </w:r>
       <w:r>
-        <w:instrText xml:space="preserve"> ADDIN EN.CITE &lt;EndNote&gt;&lt;Cite&gt;&lt;Author&gt;Gao&lt;/Author&gt;&lt;Year&gt;2012&lt;/Year&gt;&lt;RecNum&gt;68&lt;/RecNum&gt;&lt;DisplayText&gt;[35]&lt;/DisplayText&gt;&lt;record&gt;&lt;rec-number&gt;68&lt;/rec-number&gt;&lt;foreign-keys&gt;&lt;key app="EN" db-id="v920pft06rp9dbex2ap500x99x5rrtswxzss" timestamp="1768215518" guid="117c940f-5843-43b7-8068-bde961980163"&gt;68&lt;/key&gt;&lt;/foreign-keys&gt;&lt;ref-type name="Journal Article"&gt;17&lt;/ref-type&gt;&lt;contributors&gt;&lt;authors&gt;&lt;author&gt;Gao, Lihong&lt;/author&gt;&lt;author&gt;Lemarchand, Fabien&lt;/author&gt;&lt;author&gt;Lequime, Michel&lt;/author&gt;&lt;/authors&gt;&lt;/contributors&gt;&lt;titles&gt;&lt;title&gt;Exploitation of multiple incidences spectrometric measurements for thin film reverse engineering&lt;/title&gt;&lt;secondary-title&gt;Optics Express&lt;/secondary-title&gt;&lt;alt-title&gt;Opt. Express&lt;/alt-title&gt;&lt;/titles&gt;&lt;periodical&gt;&lt;full-title&gt;Optics Express&lt;/full-title&gt;&lt;abbr-1&gt;Opt. Express&lt;/abbr-1&gt;&lt;/periodical&gt;&lt;alt-periodical&gt;&lt;full-title&gt;Optics Express&lt;/full-title&gt;&lt;abbr-1&gt;Opt. Express&lt;/abbr-1&gt;&lt;/alt-periodical&gt;&lt;pages&gt;15734-15751&lt;/pages&gt;&lt;volume&gt;20&lt;/volume&gt;&lt;number&gt;14&lt;/number&gt;&lt;keywords&gt;&lt;keyword&gt;Thin films&lt;/keyword&gt;&lt;keyword&gt;Thin films, optical properties&lt;/keyword&gt;&lt;keyword&gt;Interference filters&lt;/keyword&gt;&lt;keyword&gt;Near infrared&lt;/keyword&gt;&lt;keyword&gt;Notch filters&lt;/keyword&gt;&lt;keyword&gt;Optical constants&lt;/keyword&gt;&lt;keyword&gt;Refractive index&lt;/keyword&gt;&lt;/keywords&gt;&lt;dates&gt;&lt;year&gt;2012&lt;/year&gt;&lt;pub-dates&gt;&lt;date&gt;2012/07/02&lt;/date&gt;&lt;/pub-dates&gt;&lt;/dates&gt;&lt;publisher&gt;Optica Publishing Group&lt;/publisher&gt;&lt;urls&gt;&lt;related-urls&gt;&lt;url&gt;https://opg.optica.org/oe/abstract.cfm?URI=oe-20-14-15734&lt;/url&gt;&lt;/related-urls&gt;&lt;/urls&gt;&lt;electronic-resource-num&gt;10.1364/OE.20.015734&lt;/electronic-resource-num&gt;&lt;/record&gt;&lt;/Cite&gt;&lt;/EndNote&gt;</w:instrText>
+        <w:instrText xml:space="preserve"> ADDIN EN.CITE &lt;EndNote&gt;&lt;Cite&gt;&lt;Author&gt;Franta&lt;/Author&gt;&lt;Year&gt;2016&lt;/Year&gt;&lt;RecNum&gt;97&lt;/RecNum&gt;&lt;DisplayText&gt;[42]&lt;/DisplayText&gt;&lt;record&gt;&lt;rec-number&gt;97&lt;/rec-number&gt;&lt;foreign-keys&gt;&lt;key app="EN" db-id="v920pft06rp9dbex2ap500x99x5rrtswxzss" timestamp="1776660410"&gt;97&lt;/key&gt;&lt;/foreign-keys&gt;&lt;ref-type name="Book"&gt;6&lt;/ref-type&gt;&lt;contributors&gt;&lt;authors&gt;&lt;author&gt;Franta, Daniel&lt;/author&gt;&lt;author&gt;Nečas, David&lt;/author&gt;&lt;author&gt;Ohlídal, Ivan&lt;/author&gt;&lt;author&gt;Giglia, Angelo&lt;/author&gt;&lt;/authors&gt;&lt;/contributors&gt;&lt;titles&gt;&lt;title&gt;Optical characterization of SiO2 thin films using universal dispersion model over wide spectral range&lt;/title&gt;&lt;secondary-title&gt;SPIE Photonics Europe&lt;/secondary-title&gt;&lt;/titles&gt;&lt;volume&gt;9890&lt;/volume&gt;&lt;section&gt;EPE&lt;/section&gt;&lt;dates&gt;&lt;year&gt;2016&lt;/year&gt;&lt;/dates&gt;&lt;publisher&gt;SPIE&lt;/publisher&gt;&lt;urls&gt;&lt;related-urls&gt;&lt;url&gt;https://doi.org/10.1117/12.2227580&lt;/url&gt;&lt;/related-urls&gt;&lt;/urls&gt;&lt;/record&gt;&lt;/Cite&gt;&lt;/EndNote&gt;</w:instrText>
       </w:r>
       <w:r>
         <w:fldChar w:fldCharType="separate"/>
@@ -16599,7 +17215,7 @@
         <w:rPr>
           <w:noProof/>
         </w:rPr>
-        <w:t>[35]</w:t>
+        <w:t>[42]</w:t>
       </w:r>
       <w:r>
         <w:fldChar w:fldCharType="end"/>
@@ -16623,7 +17239,7 @@
         <w:fldChar w:fldCharType="begin"/>
       </w:r>
       <w:r>
-        <w:instrText xml:space="preserve"> ADDIN EN.CITE &lt;EndNote&gt;&lt;Cite&gt;&lt;Author&gt;Polyanskiy&lt;/Author&gt;&lt;Year&gt;2024&lt;/Year&gt;&lt;RecNum&gt;69&lt;/RecNum&gt;&lt;DisplayText&gt;[44]&lt;/DisplayText&gt;&lt;record&gt;&lt;rec-number&gt;69&lt;/rec-number&gt;&lt;foreign-keys&gt;&lt;key app="EN" db-id="v920pft06rp9dbex2ap500x99x5rrtswxzss" timestamp="1768215530" guid="51ad5c1f-6b8e-4d49-9eac-5ca2d206a442"&gt;69&lt;/key&gt;&lt;/foreign-keys&gt;&lt;ref-type name="Journal Article"&gt;17&lt;/ref-type&gt;&lt;contributors&gt;&lt;authors&gt;&lt;author&gt;Polyanskiy, Mikhail N.&lt;/author&gt;&lt;/authors&gt;&lt;/contributors&gt;&lt;titles&gt;&lt;title&gt;Refractiveindex.info database of optical constants&lt;/title&gt;&lt;secondary-title&gt;Scientific Data&lt;/secondary-title&gt;&lt;/titles&gt;&lt;periodical&gt;&lt;full-title&gt;Scientific Data&lt;/full-title&gt;&lt;/periodical&gt;&lt;pages&gt;94&lt;/pages&gt;&lt;volume&gt;11&lt;/volume&gt;&lt;number&gt;1&lt;/number&gt;&lt;dates&gt;&lt;year&gt;2024&lt;/year&gt;&lt;pub-dates&gt;&lt;date&gt;2024/01/18&lt;/date&gt;&lt;/pub-dates&gt;&lt;/dates&gt;&lt;isbn&gt;2052-4463&lt;/isbn&gt;&lt;urls&gt;&lt;related-urls&gt;&lt;url&gt;https://doi.org/10.1038/s41597-023-02898-2&lt;/url&gt;&lt;/related-urls&gt;&lt;/urls&gt;&lt;electronic-resource-num&gt;10.1038/s41597-023-02898-2&lt;/electronic-resource-num&gt;&lt;/record&gt;&lt;/Cite&gt;&lt;/EndNote&gt;</w:instrText>
+        <w:instrText xml:space="preserve"> ADDIN EN.CITE &lt;EndNote&gt;&lt;Cite&gt;&lt;Author&gt;Polyanskiy&lt;/Author&gt;&lt;Year&gt;2024&lt;/Year&gt;&lt;RecNum&gt;69&lt;/RecNum&gt;&lt;DisplayText&gt;[45]&lt;/DisplayText&gt;&lt;record&gt;&lt;rec-number&gt;69&lt;/rec-number&gt;&lt;foreign-keys&gt;&lt;key app="EN" db-id="v920pft06rp9dbex2ap500x99x5rrtswxzss" timestamp="1768215530" guid="51ad5c1f-6b8e-4d49-9eac-5ca2d206a442"&gt;69&lt;/key&gt;&lt;/foreign-keys&gt;&lt;ref-type name="Journal Article"&gt;17&lt;/ref-type&gt;&lt;contributors&gt;&lt;authors&gt;&lt;author&gt;Polyanskiy, Mikhail N.&lt;/author&gt;&lt;/authors&gt;&lt;/contributors&gt;&lt;titles&gt;&lt;title&gt;Refractiveindex.info database of optical constants&lt;/title&gt;&lt;secondary-title&gt;Scientific Data&lt;/secondary-title&gt;&lt;/titles&gt;&lt;periodical&gt;&lt;full-title&gt;Scientific Data&lt;/full-title&gt;&lt;/periodical&gt;&lt;pages&gt;94&lt;/pages&gt;&lt;volume&gt;11&lt;/volume&gt;&lt;number&gt;1&lt;/number&gt;&lt;dates&gt;&lt;year&gt;2024&lt;/year&gt;&lt;pub-dates&gt;&lt;date&gt;2024/01/18&lt;/date&gt;&lt;/pub-dates&gt;&lt;/dates&gt;&lt;isbn&gt;2052-4463&lt;/isbn&gt;&lt;urls&gt;&lt;related-urls&gt;&lt;url&gt;https://doi.org/10.1038/s41597-023-02898-2&lt;/url&gt;&lt;/related-urls&gt;&lt;/urls&gt;&lt;electronic-resource-num&gt;10.1038/s41597-023-02898-2&lt;/electronic-resource-num&gt;&lt;/record&gt;&lt;/Cite&gt;&lt;/EndNote&gt;</w:instrText>
       </w:r>
       <w:r>
         <w:fldChar w:fldCharType="separate"/>
@@ -16632,7 +17248,7 @@
         <w:rPr>
           <w:noProof/>
         </w:rPr>
-        <w:t>[44]</w:t>
+        <w:t>[45]</w:t>
       </w:r>
       <w:r>
         <w:fldChar w:fldCharType="end"/>
@@ -16688,10 +17304,13 @@
         <w:rPr>
           <w:highlight w:val="yellow"/>
         </w:rPr>
-        <w:t xml:space="preserve"> a new material in optics, there exist no dataset there.</w:t>
-      </w:r>
-      <w:r>
-        <w:t xml:space="preserve"> We use dataset from </w:t>
+        <w:t xml:space="preserve"> a new material in optics, there exist no dataset there</w:t>
+      </w:r>
+      <w:r>
+        <w:t>. As shown in Fig.1., w</w:t>
+      </w:r>
+      <w:r>
+        <w:t xml:space="preserve">e use dataset from </w:t>
       </w:r>
       <w:r>
         <w:fldChar w:fldCharType="begin"/>
@@ -16733,13 +17352,25 @@
         <w:fldChar w:fldCharType="end"/>
       </w:r>
       <w:r>
-        <w:t>, as shown in Fig.1</w:t>
-      </w:r>
-      <w:r>
-        <w:t>. We assume air to have a constant n</w:t>
-      </w:r>
-      <w:r>
-        <w:rPr>
+        <w:t>.</w:t>
+      </w:r>
+      <w:r>
+        <w:t xml:space="preserve"> </w:t>
+      </w:r>
+      <w:r>
+        <w:t xml:space="preserve">We assume air to have a constant </w:t>
+      </w:r>
+      <w:r>
+        <w:rPr>
+          <w:i/>
+          <w:iCs/>
+        </w:rPr>
+        <w:t>n</w:t>
+      </w:r>
+      <w:r>
+        <w:rPr>
+          <w:i/>
+          <w:iCs/>
           <w:vertAlign w:val="subscript"/>
         </w:rPr>
         <w:t>a</w:t>
@@ -16925,6 +17556,7 @@
         <w:pStyle w:val="Heading2"/>
       </w:pPr>
       <w:r>
+        <w:lastRenderedPageBreak/>
         <w:t>3.2</w:t>
       </w:r>
       <w:r>
@@ -17047,16 +17679,12 @@
         <w:t xml:space="preserve"> still exhibits slight </w:t>
       </w:r>
       <w:r>
-        <w:t xml:space="preserve">complex refractive index drift due to structural relaxation and cumulative thermal damage. Accounting for these variations is essential for ensuring long-term reliability and precision in </w:t>
-      </w:r>
-      <w:r>
-        <w:lastRenderedPageBreak/>
-        <w:t xml:space="preserve">high-endurance photonic applications </w:t>
+        <w:t xml:space="preserve">complex refractive index drift due to structural relaxation and cumulative thermal damage. Accounting for these variations is essential for ensuring long-term reliability and precision in high-endurance photonic applications </w:t>
       </w:r>
       <w:r>
         <w:fldChar w:fldCharType="begin">
           <w:fldData xml:space="preserve">PEVuZE5vdGU+PENpdGU+PEF1dGhvcj5MYXdzb248L0F1dGhvcj48WWVhcj4yMDIzPC9ZZWFyPjxS
-ZWNOdW0+NjA8L1JlY051bT48RGlzcGxheVRleHQ+WzE3LCA0NV08L0Rpc3BsYXlUZXh0PjxyZWNv
+ZWNOdW0+NjA8L1JlY051bT48RGlzcGxheVRleHQ+WzE3LCA0Nl08L0Rpc3BsYXlUZXh0PjxyZWNv
 cmQ+PHJlYy1udW1iZXI+NjA8L3JlYy1udW1iZXI+PGZvcmVpZ24ta2V5cz48a2V5IGFwcD0iRU4i
 IGRiLWlkPSJ2OTIwcGZ0MDZycDlkYmV4MmFwNTAweDk5eDVycnRzd3h6c3MiIHRpbWVzdGFtcD0i
 MTc2ODA1MjkxMSIgZ3VpZD0iYzg5NTA2MDYtNGZkZC00MTFjLTk4ODItNDkyMzQxYWEwNWYzIj42
@@ -17105,7 +17733,7 @@
       <w:r>
         <w:fldChar w:fldCharType="begin">
           <w:fldData xml:space="preserve">PEVuZE5vdGU+PENpdGU+PEF1dGhvcj5MYXdzb248L0F1dGhvcj48WWVhcj4yMDIzPC9ZZWFyPjxS
-ZWNOdW0+NjA8L1JlY051bT48RGlzcGxheVRleHQ+WzE3LCA0NV08L0Rpc3BsYXlUZXh0PjxyZWNv
+ZWNOdW0+NjA8L1JlY051bT48RGlzcGxheVRleHQ+WzE3LCA0Nl08L0Rpc3BsYXlUZXh0PjxyZWNv
 cmQ+PHJlYy1udW1iZXI+NjA8L3JlYy1udW1iZXI+PGZvcmVpZ24ta2V5cz48a2V5IGFwcD0iRU4i
 IGRiLWlkPSJ2OTIwcGZ0MDZycDlkYmV4MmFwNTAweDk5eDVycnRzd3h6c3MiIHRpbWVzdGFtcD0i
 MTc2ODA1MjkxMSIgZ3VpZD0iYzg5NTA2MDYtNGZkZC00MTFjLTk4ODItNDkyMzQxYWEwNWYzIj42
@@ -17161,7 +17789,7 @@
         <w:rPr>
           <w:noProof/>
         </w:rPr>
-        <w:t>[17, 45]</w:t>
+        <w:t>[17, 46]</w:t>
       </w:r>
       <w:r>
         <w:fldChar w:fldCharType="end"/>
@@ -17823,7 +18451,7 @@
         </w:rPr>
         <w:fldChar w:fldCharType="begin">
           <w:fldData xml:space="preserve">PEVuZE5vdGU+PENpdGU+PEF1dGhvcj5EZWxhbmV5PC9BdXRob3I+PFllYXI+MjAyMDwvWWVhcj48
-UmVjTnVtPjY0PC9SZWNOdW0+PERpc3BsYXlUZXh0PlsxOCwgNDZdPC9EaXNwbGF5VGV4dD48cmVj
+UmVjTnVtPjY0PC9SZWNOdW0+PERpc3BsYXlUZXh0PlsxOCwgNDddPC9EaXNwbGF5VGV4dD48cmVj
 b3JkPjxyZWMtbnVtYmVyPjY0PC9yZWMtbnVtYmVyPjxmb3JlaWduLWtleXM+PGtleSBhcHA9IkVO
 IiBkYi1pZD0idjkyMHBmdDA2cnA5ZGJleDJhcDUwMHg5OXg1cnJ0c3d4enNzIiB0aW1lc3RhbXA9
 IjE3NjgwNTQwOTAiIGd1aWQ9ImIxNWI1NTUwLTQwZDctNGFkMi04MTgyLWNmNmY0ODZhNGY1MCI+
@@ -17885,7 +18513,7 @@
         </w:rPr>
         <w:fldChar w:fldCharType="begin">
           <w:fldData xml:space="preserve">PEVuZE5vdGU+PENpdGU+PEF1dGhvcj5EZWxhbmV5PC9BdXRob3I+PFllYXI+MjAyMDwvWWVhcj48
-UmVjTnVtPjY0PC9SZWNOdW0+PERpc3BsYXlUZXh0PlsxOCwgNDZdPC9EaXNwbGF5VGV4dD48cmVj
+UmVjTnVtPjY0PC9SZWNOdW0+PERpc3BsYXlUZXh0PlsxOCwgNDddPC9EaXNwbGF5VGV4dD48cmVj
 b3JkPjxyZWMtbnVtYmVyPjY0PC9yZWMtbnVtYmVyPjxmb3JlaWduLWtleXM+PGtleSBhcHA9IkVO
 IiBkYi1pZD0idjkyMHBmdDA2cnA5ZGJleDJhcDUwMHg5OXg1cnJ0c3d4enNzIiB0aW1lc3RhbXA9
 IjE3NjgwNTQwOTAiIGd1aWQ9ImIxNWI1NTUwLTQwZDctNGFkMi04MTgyLWNmNmY0ODZhNGY1MCI+
@@ -17963,7 +18591,7 @@
           <w:noProof/>
           <w:lang w:val="en-US"/>
         </w:rPr>
-        <w:t>[18, 46]</w:t>
+        <w:t>[18, 47]</w:t>
       </w:r>
       <w:r>
         <w:rPr>
@@ -17989,6 +18617,11 @@
           <w:lang w:val="en-US"/>
         </w:rPr>
         <w:tab/>
+      </w:r>
+      <w:r>
+        <w:rPr>
+          <w:lang w:val="en-US"/>
+        </w:rPr>
         <w:t xml:space="preserve">Meanwhile, the imaginary part </w:t>
       </w:r>
       <w:r>
@@ -18258,7 +18891,7 @@
       <w:r>
         <w:fldChar w:fldCharType="begin">
           <w:fldData xml:space="preserve">PEVuZE5vdGU+PENpdGU+PEF1dGhvcj5MYXdzb248L0F1dGhvcj48WWVhcj4yMDIzPC9ZZWFyPjxS
-ZWNOdW0+NjA8L1JlY051bT48RGlzcGxheVRleHQ+WzE3LCA0N108L0Rpc3BsYXlUZXh0PjxyZWNv
+ZWNOdW0+NjA8L1JlY051bT48RGlzcGxheVRleHQ+WzE3LCA0OF08L0Rpc3BsYXlUZXh0PjxyZWNv
 cmQ+PHJlYy1udW1iZXI+NjA8L3JlYy1udW1iZXI+PGZvcmVpZ24ta2V5cz48a2V5IGFwcD0iRU4i
 IGRiLWlkPSJ2OTIwcGZ0MDZycDlkYmV4MmFwNTAweDk5eDVycnRzd3h6c3MiIHRpbWVzdGFtcD0i
 MTc2ODA1MjkxMSIgZ3VpZD0iYzg5NTA2MDYtNGZkZC00MTFjLTk4ODItNDkyMzQxYWEwNWYzIj42
@@ -18304,7 +18937,7 @@
       <w:r>
         <w:fldChar w:fldCharType="begin">
           <w:fldData xml:space="preserve">PEVuZE5vdGU+PENpdGU+PEF1dGhvcj5MYXdzb248L0F1dGhvcj48WWVhcj4yMDIzPC9ZZWFyPjxS
-ZWNOdW0+NjA8L1JlY051bT48RGlzcGxheVRleHQ+WzE3LCA0N108L0Rpc3BsYXlUZXh0PjxyZWNv
+ZWNOdW0+NjA8L1JlY051bT48RGlzcGxheVRleHQ+WzE3LCA0OF08L0Rpc3BsYXlUZXh0PjxyZWNv
 cmQ+PHJlYy1udW1iZXI+NjA8L3JlYy1udW1iZXI+PGZvcmVpZ24ta2V5cz48a2V5IGFwcD0iRU4i
 IGRiLWlkPSJ2OTIwcGZ0MDZycDlkYmV4MmFwNTAweDk5eDVycnRzd3h6c3MiIHRpbWVzdGFtcD0i
 MTc2ODA1MjkxMSIgZ3VpZD0iYzg5NTA2MDYtNGZkZC00MTFjLTk4ODItNDkyMzQxYWEwNWYzIj42
@@ -18357,7 +18990,7 @@
         <w:rPr>
           <w:noProof/>
         </w:rPr>
-        <w:t>[17, 47]</w:t>
+        <w:t>[17, 48]</w:t>
       </w:r>
       <w:r>
         <w:fldChar w:fldCharType="end"/>
@@ -18380,7 +19013,7 @@
       <w:r>
         <w:fldChar w:fldCharType="begin">
           <w:fldData xml:space="preserve">PEVuZE5vdGU+PENpdGU+PEF1dGhvcj5MYXdzb248L0F1dGhvcj48WWVhcj4yMDIzPC9ZZWFyPjxS
-ZWNOdW0+NjA8L1JlY051bT48RGlzcGxheVRleHQ+WzE3LCAxOCwgNDYtNDhdPC9EaXNwbGF5VGV4
+ZWNOdW0+NjA8L1JlY051bT48RGlzcGxheVRleHQ+WzE3LCAxOCwgNDctNDldPC9EaXNwbGF5VGV4
 dD48cmVjb3JkPjxyZWMtbnVtYmVyPjYwPC9yZWMtbnVtYmVyPjxmb3JlaWduLWtleXM+PGtleSBh
 cHA9IkVOIiBkYi1pZD0idjkyMHBmdDA2cnA5ZGJleDJhcDUwMHg5OXg1cnJ0c3d4enNzIiB0aW1l
 c3RhbXA9IjE3NjgwNTI5MTEiIGd1aWQ9ImM4OTUwNjA2LTRmZGQtNDExYy05ODgyLTQ5MjM0MWFh
@@ -18492,7 +19125,7 @@
       <w:r>
         <w:fldChar w:fldCharType="begin">
           <w:fldData xml:space="preserve">PEVuZE5vdGU+PENpdGU+PEF1dGhvcj5MYXdzb248L0F1dGhvcj48WWVhcj4yMDIzPC9ZZWFyPjxS
-ZWNOdW0+NjA8L1JlY051bT48RGlzcGxheVRleHQ+WzE3LCAxOCwgNDYtNDhdPC9EaXNwbGF5VGV4
+ZWNOdW0+NjA8L1JlY051bT48RGlzcGxheVRleHQ+WzE3LCAxOCwgNDctNDldPC9EaXNwbGF5VGV4
 dD48cmVjb3JkPjxyZWMtbnVtYmVyPjYwPC9yZWMtbnVtYmVyPjxmb3JlaWduLWtleXM+PGtleSBh
 cHA9IkVOIiBkYi1pZD0idjkyMHBmdDA2cnA5ZGJleDJhcDUwMHg5OXg1cnJ0c3d4enNzIiB0aW1l
 c3RhbXA9IjE3NjgwNTI5MTEiIGd1aWQ9ImM4OTUwNjA2LTRmZGQtNDExYy05ODgyLTQ5MjM0MWFh
@@ -18611,7 +19244,7 @@
         <w:rPr>
           <w:noProof/>
         </w:rPr>
-        <w:t>[17, 18, 46-48]</w:t>
+        <w:t>[17, 18, 47-49]</w:t>
       </w:r>
       <w:r>
         <w:fldChar w:fldCharType="end"/>
@@ -19202,7 +19835,7 @@
         <w:fldChar w:fldCharType="begin"/>
       </w:r>
       <w:r>
-        <w:instrText xml:space="preserve"> ADDIN EN.CITE &lt;EndNote&gt;&lt;Cite&gt;&lt;Author&gt;Paschotta&lt;/Author&gt;&lt;Year&gt;2008&lt;/Year&gt;&lt;RecNum&gt;88&lt;/RecNum&gt;&lt;DisplayText&gt;[49]&lt;/DisplayText&gt;&lt;record&gt;&lt;rec-number&gt;88&lt;/rec-number&gt;&lt;foreign-keys&gt;&lt;key app="EN" db-id="v920pft06rp9dbex2ap500x99x5rrtswxzss" timestamp="1774446585"&gt;88&lt;/key&gt;&lt;/foreign-keys&gt;&lt;ref-type name="Book"&gt;6&lt;/ref-type&gt;&lt;contributors&gt;&lt;authors&gt;&lt;author&gt;Paschotta, R.&lt;/author&gt;&lt;/authors&gt;&lt;/contributors&gt;&lt;titles&gt;&lt;title&gt;Encyclopedia of Laser Physics and Technology&lt;/title&gt;&lt;/titles&gt;&lt;dates&gt;&lt;year&gt;2008&lt;/year&gt;&lt;/dates&gt;&lt;publisher&gt;Wiley&lt;/publisher&gt;&lt;isbn&gt;9783527408283&lt;/isbn&gt;&lt;urls&gt;&lt;related-urls&gt;&lt;url&gt;https://books.google.co.th/books?id=hdkJ5ASTFjcC&lt;/url&gt;&lt;/related-urls&gt;&lt;/urls&gt;&lt;/record&gt;&lt;/Cite&gt;&lt;/EndNote&gt;</w:instrText>
+        <w:instrText xml:space="preserve"> ADDIN EN.CITE &lt;EndNote&gt;&lt;Cite&gt;&lt;Author&gt;Paschotta&lt;/Author&gt;&lt;Year&gt;2008&lt;/Year&gt;&lt;RecNum&gt;88&lt;/RecNum&gt;&lt;DisplayText&gt;[50]&lt;/DisplayText&gt;&lt;record&gt;&lt;rec-number&gt;88&lt;/rec-number&gt;&lt;foreign-keys&gt;&lt;key app="EN" db-id="v920pft06rp9dbex2ap500x99x5rrtswxzss" timestamp="1774446585"&gt;88&lt;/key&gt;&lt;/foreign-keys&gt;&lt;ref-type name="Book"&gt;6&lt;/ref-type&gt;&lt;contributors&gt;&lt;authors&gt;&lt;author&gt;Paschotta, R.&lt;/author&gt;&lt;/authors&gt;&lt;/contributors&gt;&lt;titles&gt;&lt;title&gt;Encyclopedia of Laser Physics and Technology&lt;/title&gt;&lt;/titles&gt;&lt;dates&gt;&lt;year&gt;2008&lt;/year&gt;&lt;/dates&gt;&lt;publisher&gt;Wiley&lt;/publisher&gt;&lt;isbn&gt;9783527408283&lt;/isbn&gt;&lt;urls&gt;&lt;related-urls&gt;&lt;url&gt;https://books.google.co.th/books?id=hdkJ5ASTFjcC&lt;/url&gt;&lt;/related-urls&gt;&lt;/urls&gt;&lt;/record&gt;&lt;/Cite&gt;&lt;/EndNote&gt;</w:instrText>
       </w:r>
       <w:r>
         <w:fldChar w:fldCharType="separate"/>
@@ -19211,7 +19844,7 @@
         <w:rPr>
           <w:noProof/>
         </w:rPr>
-        <w:t>[49]</w:t>
+        <w:t>[50]</w:t>
       </w:r>
       <w:r>
         <w:fldChar w:fldCharType="end"/>
@@ -19704,7 +20337,10 @@
         <w:t xml:space="preserve">he question </w:t>
       </w:r>
       <w:r>
-        <w:t>then become</w:t>
+        <w:t xml:space="preserve">then </w:t>
+      </w:r>
+      <w:r>
+        <w:t>becomes</w:t>
       </w:r>
       <w:r>
         <w:t xml:space="preserve"> </w:t>
@@ -19775,11 +20411,39 @@
     </w:p>
     <w:p>
       <w:r>
+        <w:lastRenderedPageBreak/>
         <w:tab/>
         <w:t xml:space="preserve">Another metric that we didn’t show here are </w:t>
       </w:r>
       <w:r>
         <w:t>the tolerance of optical performances at varying incident angles. A high-tolerance devices would allow for broader applications.</w:t>
+      </w:r>
+    </w:p>
+    <w:p>
+      <w:r>
+        <w:tab/>
+        <w:t>Finite Element Method (FEM)</w:t>
+      </w:r>
+      <w:r>
+        <w:t xml:space="preserve"> </w:t>
+      </w:r>
+      <w:r>
+        <w:fldChar w:fldCharType="begin"/>
+      </w:r>
+      <w:r>
+        <w:instrText xml:space="preserve"> ADDIN EN.CITE &lt;EndNote&gt;&lt;Cite&gt;&lt;Author&gt;Ling&lt;/Author&gt;&lt;Year&gt;2025&lt;/Year&gt;&lt;RecNum&gt;99&lt;/RecNum&gt;&lt;DisplayText&gt;[51]&lt;/DisplayText&gt;&lt;record&gt;&lt;rec-number&gt;99&lt;/rec-number&gt;&lt;foreign-keys&gt;&lt;key app="EN" db-id="v920pft06rp9dbex2ap500x99x5rrtswxzss" timestamp="1776763538"&gt;99&lt;/key&gt;&lt;/foreign-keys&gt;&lt;ref-type name="Journal Article"&gt;17&lt;/ref-type&gt;&lt;contributors&gt;&lt;authors&gt;&lt;author&gt;Ling, Xiulan&lt;/author&gt;&lt;author&gt;Pang, Xinyue&lt;/author&gt;&lt;author&gt;Chen, Xubin&lt;/author&gt;&lt;author&gt;Shao, Zhichong&lt;/author&gt;&lt;/authors&gt;&lt;/contributors&gt;&lt;titles&gt;&lt;title&gt;Broadband mid-infrared optical limiter based on&amp;amp;#x00A0;vanadium dioxide phase transition&lt;/title&gt;&lt;secondary-title&gt;Journal of the Optical Society of America B&lt;/secondary-title&gt;&lt;alt-title&gt;J. Opt. Soc. Am. B&lt;/alt-title&gt;&lt;/titles&gt;&lt;periodical&gt;&lt;full-title&gt;Journal of the Optical Society of America B&lt;/full-title&gt;&lt;abbr-1&gt;J. Opt. Soc. Am. B&lt;/abbr-1&gt;&lt;/periodical&gt;&lt;alt-periodical&gt;&lt;full-title&gt;Journal of the Optical Society of America B&lt;/full-title&gt;&lt;abbr-1&gt;J. Opt. Soc. Am. B&lt;/abbr-1&gt;&lt;/alt-periodical&gt;&lt;pages&gt;2062-2067&lt;/pages&gt;&lt;volume&gt;42&lt;/volume&gt;&lt;number&gt;9&lt;/number&gt;&lt;keywords&gt;&lt;keyword&gt;Finite element method&lt;/keyword&gt;&lt;keyword&gt;High power lasers&lt;/keyword&gt;&lt;keyword&gt;Nonlinear absorption&lt;/keyword&gt;&lt;keyword&gt;Optical limiting&lt;/keyword&gt;&lt;keyword&gt;Optical properties&lt;/keyword&gt;&lt;keyword&gt;Thin films&lt;/keyword&gt;&lt;/keywords&gt;&lt;dates&gt;&lt;year&gt;2025&lt;/year&gt;&lt;pub-dates&gt;&lt;date&gt;2025/09/01&lt;/date&gt;&lt;/pub-dates&gt;&lt;/dates&gt;&lt;publisher&gt;Optica Publishing Group&lt;/publisher&gt;&lt;urls&gt;&lt;related-urls&gt;&lt;url&gt;https://opg.optica.org/josab/abstract.cfm?URI=josab-42-9-2062&lt;/url&gt;&lt;/related-urls&gt;&lt;/urls&gt;&lt;electronic-resource-num&gt;10.1364/JOSAB.569492&lt;/electronic-resource-num&gt;&lt;/record&gt;&lt;/Cite&gt;&lt;/EndNote&gt;</w:instrText>
+      </w:r>
+      <w:r>
+        <w:fldChar w:fldCharType="separate"/>
+      </w:r>
+      <w:r>
+        <w:rPr>
+          <w:noProof/>
+        </w:rPr>
+        <w:t>[51]</w:t>
+      </w:r>
+      <w:r>
+        <w:fldChar w:fldCharType="end"/>
       </w:r>
     </w:p>
     <w:p>
@@ -19801,7 +20465,6 @@
           <w:iCs w:val="0"/>
           <w:sz w:val="20"/>
         </w:rPr>
-        <w:lastRenderedPageBreak/>
         <w:t>6</w:t>
       </w:r>
       <w:r>
@@ -20565,6 +21228,7 @@
         <w:ind w:left="720" w:hanging="720"/>
       </w:pPr>
       <w:r>
+        <w:lastRenderedPageBreak/>
         <w:t>[23]</w:t>
       </w:r>
       <w:r>
@@ -20651,7 +21315,6 @@
         <w:ind w:left="720" w:hanging="720"/>
       </w:pPr>
       <w:r>
-        <w:lastRenderedPageBreak/>
         <w:t>[26]</w:t>
       </w:r>
       <w:r>
@@ -21070,73 +21733,18 @@
       </w:r>
       <w:r>
         <w:tab/>
-        <w:t xml:space="preserve">O. C. Karaman, G. N. Naidu, A. R. Bowman, E. N. Dayi, and G. Tagliabue, "Decoupling Optical and Thermal Dynamics in Dielectric Metasurfaces for Self-Encoded Photonic Control," </w:t>
-      </w:r>
-      <w:r>
-        <w:rPr>
-          <w:i/>
-        </w:rPr>
-        <w:t xml:space="preserve">Laser &amp; Photonics Reviews, </w:t>
-      </w:r>
-      <w:r>
-        <w:t xml:space="preserve">vol. 19, no. 24, p. e01014, 2025, doi: </w:t>
+        <w:t xml:space="preserve">D. Franta, D. Nečas, A. Giglia, P. Franta, and I. Ohlídal, "Universal dispersion model for characterization of optical thin films over wide spectral range: Application to magnesium fluoride," </w:t>
+      </w:r>
+      <w:r>
+        <w:rPr>
+          <w:i/>
+        </w:rPr>
+        <w:t xml:space="preserve">Applied Surface Science, </w:t>
+      </w:r>
+      <w:r>
+        <w:t xml:space="preserve">vol. 421, pp. 424–429, 2017/11/01/ 2017, doi: </w:t>
       </w:r>
       <w:hyperlink r:id="rId21" w:history="1">
-        <w:r>
-          <w:rPr>
-            <w:rStyle w:val="Hyperlink"/>
-          </w:rPr>
-          <w:t>https://doi.org/10.1002/lpor.202501014</w:t>
-        </w:r>
-      </w:hyperlink>
-      <w:r>
-        <w:t>.</w:t>
-      </w:r>
-    </w:p>
-    <w:p>
-      <w:pPr>
-        <w:pStyle w:val="EndNoteBibliography"/>
-        <w:ind w:left="720" w:hanging="720"/>
-      </w:pPr>
-      <w:r>
-        <w:t>[42]</w:t>
-      </w:r>
-      <w:r>
-        <w:tab/>
-        <w:t xml:space="preserve">H. K. Raut, V. A. Ganesh, A. S. Nair, and S. Ramakrishna, "Anti-reflective coatings: A critical, in-depth review," </w:t>
-      </w:r>
-      <w:r>
-        <w:rPr>
-          <w:i/>
-        </w:rPr>
-        <w:t xml:space="preserve">Energy &amp; Environmental Science, </w:t>
-      </w:r>
-      <w:r>
-        <w:t>10.1039/C1EE01297E vol. 4, no. 10, pp. 3779–3804, 2011, doi: 10.1039/C1EE01297E.</w:t>
-      </w:r>
-    </w:p>
-    <w:p>
-      <w:pPr>
-        <w:pStyle w:val="EndNoteBibliography"/>
-        <w:ind w:left="720" w:hanging="720"/>
-      </w:pPr>
-      <w:r>
-        <w:t>[43]</w:t>
-      </w:r>
-      <w:r>
-        <w:tab/>
-        <w:t xml:space="preserve">D. Franta, D. Nečas, A. Giglia, P. Franta, and I. Ohlídal, "Universal dispersion model for characterization of optical thin films over wide spectral range: Application to magnesium fluoride," </w:t>
-      </w:r>
-      <w:r>
-        <w:rPr>
-          <w:i/>
-        </w:rPr>
-        <w:t xml:space="preserve">Applied Surface Science, </w:t>
-      </w:r>
-      <w:r>
-        <w:t xml:space="preserve">vol. 421, pp. 424–429, 2017/11/01/ 2017, doi: </w:t>
-      </w:r>
-      <w:hyperlink r:id="rId22" w:history="1">
         <w:r>
           <w:rPr>
             <w:rStyle w:val="Hyperlink"/>
@@ -21154,20 +21762,20 @@
         <w:ind w:left="720" w:hanging="720"/>
       </w:pPr>
       <w:r>
-        <w:t>[44]</w:t>
-      </w:r>
-      <w:r>
-        <w:tab/>
-        <w:t xml:space="preserve">M. N. Polyanskiy, "Refractiveindex.info database of optical constants," </w:t>
-      </w:r>
-      <w:r>
-        <w:rPr>
-          <w:i/>
-        </w:rPr>
-        <w:t xml:space="preserve">Scientific Data, </w:t>
-      </w:r>
-      <w:r>
-        <w:t>vol. 11, no. 1, p. 94, 2024/01/18 2024, doi: 10.1038/s41597-023-02898-2.</w:t>
+        <w:t>[42]</w:t>
+      </w:r>
+      <w:r>
+        <w:tab/>
+        <w:t xml:space="preserve">D. Franta, D. Nečas, I. Ohlídal, and A. Giglia, </w:t>
+      </w:r>
+      <w:r>
+        <w:rPr>
+          <w:i/>
+        </w:rPr>
+        <w:t>Optical characterization of SiO2 thin films using universal dispersion model over wide spectral range</w:t>
+      </w:r>
+      <w:r>
+        <w:t xml:space="preserve"> (SPIE Photonics Europe). SPIE, 2016.</w:t>
       </w:r>
     </w:p>
     <w:p>
@@ -21176,10 +21784,76 @@
         <w:ind w:left="720" w:hanging="720"/>
       </w:pPr>
       <w:r>
+        <w:t>[43]</w:t>
+      </w:r>
+      <w:r>
+        <w:tab/>
+        <w:t xml:space="preserve">D. Franta, P. Franta, J. Vohánka, M. Čermák, and I. Ohlídal, "Determination of thicknesses and temperatures of crystalline silicon wafers from optical measurements in the far infrared region," </w:t>
+      </w:r>
+      <w:r>
+        <w:rPr>
+          <w:i/>
+        </w:rPr>
+        <w:t xml:space="preserve">Journal of Applied Physics, </w:t>
+      </w:r>
+      <w:r>
+        <w:t>vol. 123, no. 18, 2018, doi: 10.1063/1.5026195.</w:t>
+      </w:r>
+    </w:p>
+    <w:p>
+      <w:pPr>
+        <w:pStyle w:val="EndNoteBibliography"/>
+        <w:ind w:left="720" w:hanging="720"/>
+      </w:pPr>
+      <w:r>
+        <w:t>[44]</w:t>
+      </w:r>
+      <w:r>
+        <w:tab/>
+        <w:t xml:space="preserve">H. K. Raut, V. A. Ganesh, A. S. Nair, and S. Ramakrishna, "Anti-reflective coatings: A critical, in-depth review," </w:t>
+      </w:r>
+      <w:r>
+        <w:rPr>
+          <w:i/>
+        </w:rPr>
+        <w:t xml:space="preserve">Energy &amp; Environmental Science, </w:t>
+      </w:r>
+      <w:r>
+        <w:t>10.1039/C1EE01297E vol. 4, no. 10, pp. 3779–3804, 2011, doi: 10.1039/C1EE01297E.</w:t>
+      </w:r>
+    </w:p>
+    <w:p>
+      <w:pPr>
+        <w:pStyle w:val="EndNoteBibliography"/>
+        <w:ind w:left="720" w:hanging="720"/>
+      </w:pPr>
+      <w:r>
         <w:t>[45]</w:t>
       </w:r>
       <w:r>
         <w:tab/>
+        <w:t xml:space="preserve">M. N. Polyanskiy, "Refractiveindex.info database of optical constants," </w:t>
+      </w:r>
+      <w:r>
+        <w:rPr>
+          <w:i/>
+        </w:rPr>
+        <w:t xml:space="preserve">Scientific Data, </w:t>
+      </w:r>
+      <w:r>
+        <w:t>vol. 11, no. 1, p. 94, 2024/01/18 2024, doi: 10.1038/s41597-023-02898-2.</w:t>
+      </w:r>
+    </w:p>
+    <w:p>
+      <w:pPr>
+        <w:pStyle w:val="EndNoteBibliography"/>
+        <w:ind w:left="720" w:hanging="720"/>
+      </w:pPr>
+      <w:r>
+        <w:t>[46]</w:t>
+      </w:r>
+      <w:r>
+        <w:tab/>
         <w:t>M. S. Alam</w:t>
       </w:r>
       <w:r>
@@ -21200,7 +21874,7 @@
       <w:r>
         <w:t xml:space="preserve">vol. 34, no. 14, p. 2310306, 2024, doi: </w:t>
       </w:r>
-      <w:hyperlink r:id="rId23" w:history="1">
+      <w:hyperlink r:id="rId22" w:history="1">
         <w:r>
           <w:rPr>
             <w:rStyle w:val="Hyperlink"/>
@@ -21218,7 +21892,7 @@
         <w:ind w:left="720" w:hanging="720"/>
       </w:pPr>
       <w:r>
-        <w:t>[46]</w:t>
+        <w:t>[47]</w:t>
       </w:r>
       <w:r>
         <w:tab/>
@@ -21249,7 +21923,7 @@
         <w:ind w:left="720" w:hanging="720"/>
       </w:pPr>
       <w:r>
-        <w:t>[47]</w:t>
+        <w:t>[48]</w:t>
       </w:r>
       <w:r>
         <w:tab/>
@@ -21280,7 +21954,7 @@
         <w:ind w:left="720" w:hanging="720"/>
       </w:pPr>
       <w:r>
-        <w:t>[48]</w:t>
+        <w:t>[49]</w:t>
       </w:r>
       <w:r>
         <w:tab/>
@@ -21302,7 +21976,7 @@
         <w:ind w:left="720" w:hanging="720"/>
       </w:pPr>
       <w:r>
-        <w:t>[49]</w:t>
+        <w:t>[50]</w:t>
       </w:r>
       <w:r>
         <w:tab/>
@@ -21320,8 +21994,27 @@
     </w:p>
     <w:p>
       <w:pPr>
-        <w:pStyle w:val="Heading1"/>
+        <w:pStyle w:val="EndNoteBibliography"/>
+        <w:ind w:left="720" w:hanging="720"/>
       </w:pPr>
+      <w:r>
+        <w:t>[51]</w:t>
+      </w:r>
+      <w:r>
+        <w:tab/>
+        <w:t xml:space="preserve">X. Ling, X. Pang, X. Chen, and Z. Shao, "Broadband mid-infrared optical limiter based on&amp;#x00A0;vanadium dioxide phase transition," </w:t>
+      </w:r>
+      <w:r>
+        <w:rPr>
+          <w:i/>
+        </w:rPr>
+        <w:t xml:space="preserve">J. Opt. Soc. Am. B, </w:t>
+      </w:r>
+      <w:r>
+        <w:t>vol. 42, no. 9, pp. 2062–2067, 2025/09/01 2025, doi: 10.1364/JOSAB.569492.</w:t>
+      </w:r>
+    </w:p>
+    <w:p>
       <w:r>
         <w:fldChar w:fldCharType="end"/>
       </w:r>
@@ -21734,7 +22427,7 @@
   <w:style w:type="paragraph" w:default="1" w:styleId="Normal">
     <w:name w:val="Normal"/>
     <w:qFormat/>
-    <w:rsid w:val="00076A05"/>
+    <w:rsid w:val="00A531A5"/>
     <w:pPr>
       <w:spacing w:after="0" w:line="240" w:lineRule="auto"/>
       <w:jc w:val="both"/>

</xml_diff>